<commit_message>
Practica experimental unidad 3
</commit_message>
<xml_diff>
--- a/PracticaExperimental3/PE3_U3_CEDENO_MORALES_SANCHEZ.docx
+++ b/PracticaExperimental3/PE3_U3_CEDENO_MORALES_SANCHEZ.docx
@@ -1943,23 +1943,7 @@
             <w:rFonts w:ascii="Times New Roman" w:hAnsi="Times New Roman" w:cs="Times New Roman"/>
             <w:noProof/>
           </w:rPr>
-          <w:t>Diagrama Entid</w:t>
-        </w:r>
-        <w:r>
-          <w:rPr>
-            <w:rStyle w:val="Hipervnculo"/>
-            <w:rFonts w:ascii="Times New Roman" w:hAnsi="Times New Roman" w:cs="Times New Roman"/>
-            <w:noProof/>
-          </w:rPr>
-          <w:t>a</w:t>
-        </w:r>
-        <w:r>
-          <w:rPr>
-            <w:rStyle w:val="Hipervnculo"/>
-            <w:rFonts w:ascii="Times New Roman" w:hAnsi="Times New Roman" w:cs="Times New Roman"/>
-            <w:noProof/>
-          </w:rPr>
-          <w:t>d-Relación (Crow’s Foot)</w:t>
+          <w:t>Diagrama Entidad-Relación (Crow’s Foot)</w:t>
         </w:r>
         <w:r>
           <w:rPr>
@@ -2006,7 +1990,7 @@
             <w:noProof/>
             <w:webHidden/>
           </w:rPr>
-          <w:t>26</w:t>
+          <w:t>27</w:t>
         </w:r>
         <w:r>
           <w:rPr>
@@ -2101,7 +2085,7 @@
             <w:noProof/>
             <w:webHidden/>
           </w:rPr>
-          <w:t>27</w:t>
+          <w:t>28</w:t>
         </w:r>
         <w:r>
           <w:rPr>
@@ -2196,7 +2180,7 @@
             <w:noProof/>
             <w:webHidden/>
           </w:rPr>
-          <w:t>28</w:t>
+          <w:t>29</w:t>
         </w:r>
         <w:r>
           <w:rPr>
@@ -2291,7 +2275,7 @@
             <w:noProof/>
             <w:webHidden/>
           </w:rPr>
-          <w:t>28</w:t>
+          <w:t>29</w:t>
         </w:r>
         <w:r>
           <w:rPr>
@@ -2386,7 +2370,7 @@
             <w:noProof/>
             <w:webHidden/>
           </w:rPr>
-          <w:t>29</w:t>
+          <w:t>30</w:t>
         </w:r>
         <w:r>
           <w:rPr>
@@ -2481,7 +2465,7 @@
             <w:noProof/>
             <w:webHidden/>
           </w:rPr>
-          <w:t>31</w:t>
+          <w:t>32</w:t>
         </w:r>
         <w:r>
           <w:rPr>
@@ -2576,7 +2560,7 @@
             <w:noProof/>
             <w:webHidden/>
           </w:rPr>
-          <w:t>32</w:t>
+          <w:t>33</w:t>
         </w:r>
         <w:r>
           <w:rPr>
@@ -2671,7 +2655,7 @@
             <w:noProof/>
             <w:webHidden/>
           </w:rPr>
-          <w:t>34</w:t>
+          <w:t>35</w:t>
         </w:r>
         <w:r>
           <w:rPr>
@@ -2766,7 +2750,7 @@
             <w:noProof/>
             <w:webHidden/>
           </w:rPr>
-          <w:t>35</w:t>
+          <w:t>36</w:t>
         </w:r>
         <w:r>
           <w:rPr>
@@ -2861,7 +2845,7 @@
             <w:noProof/>
             <w:webHidden/>
           </w:rPr>
-          <w:t>36</w:t>
+          <w:t>37</w:t>
         </w:r>
         <w:r>
           <w:rPr>
@@ -2956,7 +2940,7 @@
             <w:noProof/>
             <w:webHidden/>
           </w:rPr>
-          <w:t>36</w:t>
+          <w:t>37</w:t>
         </w:r>
         <w:r>
           <w:rPr>
@@ -3051,7 +3035,7 @@
             <w:noProof/>
             <w:webHidden/>
           </w:rPr>
-          <w:t>40</w:t>
+          <w:t>41</w:t>
         </w:r>
         <w:r>
           <w:rPr>
@@ -3146,7 +3130,7 @@
             <w:noProof/>
             <w:webHidden/>
           </w:rPr>
-          <w:t>41</w:t>
+          <w:t>42</w:t>
         </w:r>
         <w:r>
           <w:rPr>
@@ -3224,7 +3208,7 @@
             <w:noProof/>
             <w:webHidden/>
           </w:rPr>
-          <w:t>42</w:t>
+          <w:t>43</w:t>
         </w:r>
         <w:r>
           <w:rPr>
@@ -3302,7 +3286,7 @@
             <w:noProof/>
             <w:webHidden/>
           </w:rPr>
-          <w:t>48</w:t>
+          <w:t>49</w:t>
         </w:r>
         <w:r>
           <w:rPr>
@@ -3380,7 +3364,7 @@
             <w:noProof/>
             <w:webHidden/>
           </w:rPr>
-          <w:t>52</w:t>
+          <w:t>53</w:t>
         </w:r>
         <w:r>
           <w:rPr>
@@ -3459,7 +3443,7 @@
             <w:noProof/>
             <w:webHidden/>
           </w:rPr>
-          <w:t>52</w:t>
+          <w:t>53</w:t>
         </w:r>
         <w:r>
           <w:rPr>
@@ -3538,7 +3522,7 @@
             <w:noProof/>
             <w:webHidden/>
           </w:rPr>
-          <w:t>53</w:t>
+          <w:t>54</w:t>
         </w:r>
         <w:r>
           <w:rPr>
@@ -3617,7 +3601,7 @@
             <w:noProof/>
             <w:webHidden/>
           </w:rPr>
-          <w:t>54</w:t>
+          <w:t>55</w:t>
         </w:r>
         <w:r>
           <w:rPr>
@@ -3696,7 +3680,7 @@
             <w:noProof/>
             <w:webHidden/>
           </w:rPr>
-          <w:t>55</w:t>
+          <w:t>56</w:t>
         </w:r>
         <w:r>
           <w:rPr>
@@ -3775,7 +3759,7 @@
             <w:noProof/>
             <w:webHidden/>
           </w:rPr>
-          <w:t>55</w:t>
+          <w:t>56</w:t>
         </w:r>
         <w:r>
           <w:rPr>
@@ -3854,7 +3838,7 @@
             <w:noProof/>
             <w:webHidden/>
           </w:rPr>
-          <w:t>56</w:t>
+          <w:t>57</w:t>
         </w:r>
         <w:r>
           <w:rPr>
@@ -3933,7 +3917,7 @@
             <w:noProof/>
             <w:webHidden/>
           </w:rPr>
-          <w:t>57</w:t>
+          <w:t>58</w:t>
         </w:r>
         <w:r>
           <w:rPr>
@@ -4012,7 +3996,7 @@
             <w:noProof/>
             <w:webHidden/>
           </w:rPr>
-          <w:t>58</w:t>
+          <w:t>59</w:t>
         </w:r>
         <w:r>
           <w:rPr>
@@ -4090,7 +4074,7 @@
             <w:noProof/>
             <w:webHidden/>
           </w:rPr>
-          <w:t>58</w:t>
+          <w:t>59</w:t>
         </w:r>
         <w:r>
           <w:rPr>
@@ -4342,23 +4326,7 @@
             <w:rFonts w:ascii="Times New Roman" w:hAnsi="Times New Roman" w:cs="Times New Roman"/>
             <w:noProof/>
           </w:rPr>
-          <w:t>Tabla 3: Corrección de requisitos no f</w:t>
-        </w:r>
-        <w:r>
-          <w:rPr>
-            <w:rStyle w:val="Hipervnculo"/>
-            <w:rFonts w:ascii="Times New Roman" w:hAnsi="Times New Roman" w:cs="Times New Roman"/>
-            <w:noProof/>
-          </w:rPr>
-          <w:t>u</w:t>
-        </w:r>
-        <w:r>
-          <w:rPr>
-            <w:rStyle w:val="Hipervnculo"/>
-            <w:rFonts w:ascii="Times New Roman" w:hAnsi="Times New Roman" w:cs="Times New Roman"/>
-            <w:noProof/>
-          </w:rPr>
-          <w:t>ncionales con sintaxis EARS</w:t>
+          <w:t>Tabla 3: Corrección de requisitos no funcionales con sintaxis EARS</w:t>
         </w:r>
         <w:r>
           <w:rPr>
@@ -4873,7 +4841,7 @@
             <w:noProof/>
             <w:webHidden/>
           </w:rPr>
-          <w:t>21</w:t>
+          <w:t>22</w:t>
         </w:r>
         <w:r>
           <w:rPr>
@@ -5216,23 +5184,7 @@
             <w:rFonts w:ascii="Times New Roman" w:hAnsi="Times New Roman" w:cs="Times New Roman"/>
             <w:noProof/>
           </w:rPr>
-          <w:t xml:space="preserve">Tabla 14: Entidad </w:t>
-        </w:r>
-        <w:r>
-          <w:rPr>
-            <w:rStyle w:val="Hipervnculo"/>
-            <w:rFonts w:ascii="Times New Roman" w:hAnsi="Times New Roman" w:cs="Times New Roman"/>
-            <w:noProof/>
-          </w:rPr>
-          <w:t>V</w:t>
-        </w:r>
-        <w:r>
-          <w:rPr>
-            <w:rStyle w:val="Hipervnculo"/>
-            <w:rFonts w:ascii="Times New Roman" w:hAnsi="Times New Roman" w:cs="Times New Roman"/>
-            <w:noProof/>
-          </w:rPr>
-          <w:t>acuna</w:t>
+          <w:t>Tabla 14: Entidad Vacuna</w:t>
         </w:r>
         <w:r>
           <w:rPr>
@@ -5903,7 +5855,7 @@
             <w:noProof/>
             <w:webHidden/>
           </w:rPr>
-          <w:t>33</w:t>
+          <w:t>34</w:t>
         </w:r>
         <w:r>
           <w:rPr>
@@ -5981,7 +5933,7 @@
             <w:noProof/>
             <w:webHidden/>
           </w:rPr>
-          <w:t>35</w:t>
+          <w:t>36</w:t>
         </w:r>
         <w:r>
           <w:rPr>
@@ -6012,23 +5964,7 @@
             <w:rFonts w:ascii="Times New Roman" w:hAnsi="Times New Roman" w:cs="Times New Roman"/>
             <w:noProof/>
           </w:rPr>
-          <w:t>Tabla 24: Matriz de</w:t>
-        </w:r>
-        <w:r>
-          <w:rPr>
-            <w:rStyle w:val="Hipervnculo"/>
-            <w:rFonts w:ascii="Times New Roman" w:hAnsi="Times New Roman" w:cs="Times New Roman"/>
-            <w:noProof/>
-          </w:rPr>
-          <w:t xml:space="preserve"> </w:t>
-        </w:r>
-        <w:r>
-          <w:rPr>
-            <w:rStyle w:val="Hipervnculo"/>
-            <w:rFonts w:ascii="Times New Roman" w:hAnsi="Times New Roman" w:cs="Times New Roman"/>
-            <w:noProof/>
-          </w:rPr>
-          <w:t>trazabilidad</w:t>
+          <w:t>Tabla 24: Matriz de trazabilidad</w:t>
         </w:r>
         <w:r>
           <w:rPr>
@@ -6075,7 +6011,7 @@
             <w:noProof/>
             <w:webHidden/>
           </w:rPr>
-          <w:t>36</w:t>
+          <w:t>37</w:t>
         </w:r>
         <w:r>
           <w:rPr>
@@ -6153,7 +6089,7 @@
             <w:noProof/>
             <w:webHidden/>
           </w:rPr>
-          <w:t>40</w:t>
+          <w:t>41</w:t>
         </w:r>
         <w:r>
           <w:rPr>
@@ -6231,7 +6167,7 @@
             <w:noProof/>
             <w:webHidden/>
           </w:rPr>
-          <w:t>42</w:t>
+          <w:t>43</w:t>
         </w:r>
         <w:r>
           <w:rPr>
@@ -6309,7 +6245,7 @@
             <w:noProof/>
             <w:webHidden/>
           </w:rPr>
-          <w:t>48</w:t>
+          <w:t>49</w:t>
         </w:r>
         <w:r>
           <w:rPr>
@@ -6387,7 +6323,7 @@
             <w:noProof/>
             <w:webHidden/>
           </w:rPr>
-          <w:t>59</w:t>
+          <w:t>60</w:t>
         </w:r>
         <w:r>
           <w:rPr>
@@ -6525,7 +6461,7 @@
             <w:noProof/>
             <w:webHidden/>
           </w:rPr>
-          <w:t>26</w:t>
+          <w:t>27</w:t>
         </w:r>
         <w:r>
           <w:rPr>
@@ -6603,7 +6539,7 @@
             <w:noProof/>
             <w:webHidden/>
           </w:rPr>
-          <w:t>27</w:t>
+          <w:t>28</w:t>
         </w:r>
         <w:r>
           <w:rPr>
@@ -6681,7 +6617,7 @@
             <w:noProof/>
             <w:webHidden/>
           </w:rPr>
-          <w:t>28</w:t>
+          <w:t>29</w:t>
         </w:r>
         <w:r>
           <w:rPr>
@@ -6759,7 +6695,7 @@
             <w:noProof/>
             <w:webHidden/>
           </w:rPr>
-          <w:t>29</w:t>
+          <w:t>30</w:t>
         </w:r>
         <w:r>
           <w:rPr>
@@ -6837,7 +6773,7 @@
             <w:noProof/>
             <w:webHidden/>
           </w:rPr>
-          <w:t>30</w:t>
+          <w:t>31</w:t>
         </w:r>
         <w:r>
           <w:rPr>
@@ -6868,23 +6804,7 @@
             <w:rFonts w:ascii="Times New Roman" w:hAnsi="Times New Roman" w:cs="Times New Roman"/>
             <w:noProof/>
           </w:rPr>
-          <w:t>Figura 6: Diagrama de ac</w:t>
-        </w:r>
-        <w:r>
-          <w:rPr>
-            <w:rStyle w:val="Hipervnculo"/>
-            <w:rFonts w:ascii="Times New Roman" w:hAnsi="Times New Roman" w:cs="Times New Roman"/>
-            <w:noProof/>
-          </w:rPr>
-          <w:t>t</w:t>
-        </w:r>
-        <w:r>
-          <w:rPr>
-            <w:rStyle w:val="Hipervnculo"/>
-            <w:rFonts w:ascii="Times New Roman" w:hAnsi="Times New Roman" w:cs="Times New Roman"/>
-            <w:noProof/>
-          </w:rPr>
-          <w:t>ividades UML</w:t>
+          <w:t>Figura 6: Diagrama de actividades UML</w:t>
         </w:r>
         <w:r>
           <w:rPr>
@@ -6931,7 +6851,7 @@
             <w:noProof/>
             <w:webHidden/>
           </w:rPr>
-          <w:t>31</w:t>
+          <w:t>32</w:t>
         </w:r>
         <w:r>
           <w:rPr>
@@ -7009,7 +6929,7 @@
             <w:noProof/>
             <w:webHidden/>
           </w:rPr>
-          <w:t>34</w:t>
+          <w:t>35</w:t>
         </w:r>
         <w:r>
           <w:rPr>
@@ -7087,7 +7007,7 @@
             <w:noProof/>
             <w:webHidden/>
           </w:rPr>
-          <w:t>36</w:t>
+          <w:t>37</w:t>
         </w:r>
         <w:r>
           <w:rPr>
@@ -15655,6 +15575,25 @@
     </w:p>
     <w:p>
       <w:pPr>
+        <w:rPr>
+          <w:rFonts w:ascii="Times New Roman" w:hAnsi="Times New Roman" w:cs="Times New Roman"/>
+        </w:rPr>
+      </w:pPr>
+      <w:r>
+        <w:rPr>
+          <w:rFonts w:ascii="Times New Roman" w:hAnsi="Times New Roman" w:cs="Times New Roman"/>
+        </w:rPr>
+        <w:t>Relaciones M:N fueron resueltas mediante entidades asociativas</w:t>
+      </w:r>
+      <w:r>
+        <w:rPr>
+          <w:rFonts w:ascii="Times New Roman" w:hAnsi="Times New Roman" w:cs="Times New Roman"/>
+        </w:rPr>
+        <w:t>.</w:t>
+      </w:r>
+    </w:p>
+    <w:p>
+      <w:pPr>
         <w:pStyle w:val="Fuerte1"/>
         <w:rPr>
           <w:rFonts w:eastAsia="Calibri"/>
@@ -17384,6 +17323,7 @@
         <w:rPr>
           <w:rFonts w:cs="Times New Roman"/>
         </w:rPr>
+        <w:lastRenderedPageBreak/>
         <w:t xml:space="preserve">Tabla </w:t>
       </w:r>
       <w:r>
@@ -17607,7 +17547,6 @@
                 <w:sz w:val="24"/>
                 <w:szCs w:val="24"/>
               </w:rPr>
-              <w:lastRenderedPageBreak/>
               <w:t>idPropietario</w:t>
             </w:r>
           </w:p>
@@ -20029,6 +19968,7 @@
                 <w:sz w:val="24"/>
                 <w:szCs w:val="24"/>
               </w:rPr>
+              <w:lastRenderedPageBreak/>
               <w:t>idUsuarioReceptor</w:t>
             </w:r>
           </w:p>
@@ -20274,7 +20214,6 @@
           <w:sz w:val="24"/>
           <w:szCs w:val="24"/>
         </w:rPr>
-        <w:lastRenderedPageBreak/>
         <w:t>HISTORIAL_MEDICO</w:t>
       </w:r>
     </w:p>
@@ -22520,6 +22459,7 @@
                 <w:sz w:val="24"/>
                 <w:szCs w:val="24"/>
               </w:rPr>
+              <w:lastRenderedPageBreak/>
               <w:t>diagnostico</w:t>
             </w:r>
           </w:p>
@@ -22840,7 +22780,6 @@
                 <w:sz w:val="24"/>
                 <w:szCs w:val="24"/>
               </w:rPr>
-              <w:lastRenderedPageBreak/>
               <w:t>fechaEvaluacion</w:t>
             </w:r>
           </w:p>
@@ -25027,6 +24966,7 @@
                 <w:sz w:val="24"/>
                 <w:szCs w:val="24"/>
               </w:rPr>
+              <w:lastRenderedPageBreak/>
               <w:t>linaje</w:t>
             </w:r>
           </w:p>
@@ -25270,7 +25210,6 @@
           <w:sz w:val="24"/>
           <w:szCs w:val="24"/>
         </w:rPr>
-        <w:lastRenderedPageBreak/>
         <w:t>Identificación de relaciones</w:t>
       </w:r>
     </w:p>
@@ -28804,22 +28743,187 @@
         </w:tc>
       </w:tr>
     </w:tbl>
+    <w:p/>
     <w:p>
       <w:pPr>
+        <w:jc w:val="both"/>
         <w:rPr>
           <w:rFonts w:ascii="Times New Roman" w:hAnsi="Times New Roman" w:cs="Times New Roman"/>
         </w:rPr>
       </w:pPr>
+      <w:r>
+        <w:rPr>
+          <w:rFonts w:ascii="Times New Roman" w:hAnsi="Times New Roman" w:cs="Times New Roman"/>
+        </w:rPr>
+        <w:t xml:space="preserve">Durante la identificación de relaciones se detectaron dos asociaciones de cardinalidad muchos a muchos (M:N): (1) entre Mascota y Mascota, dado que cualquier mascota puede evaluarse en compatibilidad con múltiples mascotas y viceversa; y (2) entre Mascota y Veterinario, dado que un veterinario puede evaluar múltiples mascotas y una mascota puede ser evaluada por distintos veterinarios a lo largo del tiempo. Siguiendo a Maciaszek </w:t>
+      </w:r>
+      <w:sdt>
+        <w:sdtPr>
+          <w:rPr>
+            <w:rFonts w:ascii="Times New Roman" w:hAnsi="Times New Roman" w:cs="Times New Roman"/>
+            <w:color w:val="000000"/>
+          </w:rPr>
+          <w:tag w:val="MENDELEY_CITATION_v3_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"/>
+          <w:id w:val="1837874667"/>
+          <w:placeholder>
+            <w:docPart w:val="DefaultPlaceholder_-1854013440"/>
+          </w:placeholder>
+        </w:sdtPr>
+        <w:sdtContent>
+          <w:r>
+            <w:rPr>
+              <w:rFonts w:ascii="Times New Roman" w:hAnsi="Times New Roman" w:cs="Times New Roman"/>
+              <w:color w:val="000000"/>
+            </w:rPr>
+            <w:t>[12]</w:t>
+          </w:r>
+        </w:sdtContent>
+      </w:sdt>
+      <w:r>
+        <w:rPr>
+          <w:rFonts w:ascii="Times New Roman" w:hAnsi="Times New Roman" w:cs="Times New Roman"/>
+        </w:rPr>
+        <w:t xml:space="preserve">, </w:t>
+      </w:r>
+      <w:r>
+        <w:rPr>
+          <w:rFonts w:ascii="Times New Roman" w:hAnsi="Times New Roman" w:cs="Times New Roman"/>
+        </w:rPr>
+        <w:lastRenderedPageBreak/>
+        <w:t>ambas relaciones M:N se resolvieron mediante entidades asociativa</w:t>
+      </w:r>
+      <w:r>
+        <w:rPr>
+          <w:rFonts w:ascii="Times New Roman" w:hAnsi="Times New Roman" w:cs="Times New Roman"/>
+        </w:rPr>
+        <w:t>s (</w:t>
+      </w:r>
+      <w:r>
+        <w:rPr>
+          <w:rFonts w:ascii="Times New Roman" w:hAnsi="Times New Roman" w:cs="Times New Roman"/>
+        </w:rPr>
+        <w:t>Evaluacion_Compatibilidad y Evaluacion_Veterinaria respectivamente</w:t>
+      </w:r>
+      <w:r>
+        <w:rPr>
+          <w:rFonts w:ascii="Times New Roman" w:hAnsi="Times New Roman" w:cs="Times New Roman"/>
+        </w:rPr>
+        <w:t>)</w:t>
+      </w:r>
+      <w:r>
+        <w:rPr>
+          <w:rFonts w:ascii="Times New Roman" w:hAnsi="Times New Roman" w:cs="Times New Roman"/>
+        </w:rPr>
+        <w:t xml:space="preserve"> que en el diagrama de clases UML (sección 4.3) se representan como clases asociativas con sus propios atributos (porcentajeCompatibilidad, aptitudCruza, aptitudAdopcion).</w:t>
+      </w:r>
     </w:p>
     <w:p>
       <w:pPr>
-        <w:pStyle w:val="Ttulo2"/>
-        <w:numPr>
-          <w:ilvl w:val="1"/>
-          <w:numId w:val="2"/>
-        </w:numPr>
-        <w:rPr>
-          <w:rFonts w:cs="Times New Roman"/>
+        <w:jc w:val="both"/>
+        <w:rPr>
+          <w:rFonts w:ascii="Times New Roman" w:hAnsi="Times New Roman" w:cs="Times New Roman"/>
+          <w:b/>
+          <w:bCs/>
+        </w:rPr>
+      </w:pPr>
+      <w:r>
+        <w:rPr>
+          <w:rFonts w:ascii="Times New Roman" w:hAnsi="Times New Roman" w:cs="Times New Roman"/>
+          <w:b/>
+          <w:bCs/>
+        </w:rPr>
+        <w:t>Verificación de la Tercera Forma Normal (3FN)</w:t>
+      </w:r>
+    </w:p>
+    <w:p>
+      <w:pPr>
+        <w:jc w:val="both"/>
+        <w:rPr>
+          <w:rFonts w:ascii="Times New Roman" w:hAnsi="Times New Roman" w:cs="Times New Roman"/>
+        </w:rPr>
+      </w:pPr>
+      <w:r>
+        <w:rPr>
+          <w:rFonts w:ascii="Times New Roman" w:hAnsi="Times New Roman" w:cs="Times New Roman"/>
+        </w:rPr>
+        <w:t xml:space="preserve">El modelo Entidad-Relación fue verificado bajo los criterios de normalización de Maciaszek </w:t>
+      </w:r>
+      <w:sdt>
+        <w:sdtPr>
+          <w:rPr>
+            <w:rFonts w:ascii="Times New Roman" w:hAnsi="Times New Roman" w:cs="Times New Roman"/>
+            <w:color w:val="000000"/>
+          </w:rPr>
+          <w:tag w:val="MENDELEY_CITATION_v3_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"/>
+          <w:id w:val="1335961496"/>
+          <w:placeholder>
+            <w:docPart w:val="DefaultPlaceholder_-1854013440"/>
+          </w:placeholder>
+        </w:sdtPr>
+        <w:sdtContent>
+          <w:r>
+            <w:rPr>
+              <w:rFonts w:ascii="Times New Roman" w:hAnsi="Times New Roman" w:cs="Times New Roman"/>
+              <w:color w:val="000000"/>
+            </w:rPr>
+            <w:t>[12]</w:t>
+          </w:r>
+        </w:sdtContent>
+      </w:sdt>
+      <w:r>
+        <w:rPr>
+          <w:rFonts w:ascii="Times New Roman" w:hAnsi="Times New Roman" w:cs="Times New Roman"/>
+        </w:rPr>
+        <w:t>, confirmando el cumplimiento de las tres formas normales:</w:t>
+      </w:r>
+    </w:p>
+    <w:p>
+      <w:pPr>
+        <w:jc w:val="both"/>
+        <w:rPr>
+          <w:rFonts w:ascii="Times New Roman" w:hAnsi="Times New Roman" w:cs="Times New Roman"/>
+        </w:rPr>
+      </w:pPr>
+      <w:r>
+        <w:rPr>
+          <w:rFonts w:ascii="Times New Roman" w:hAnsi="Times New Roman" w:cs="Times New Roman"/>
+        </w:rPr>
+        <w:t>1FN: todos los atributos de las 19 entidades identificadas son atómicos; no existen campos multivaluados (ej. las fotografías de una mascota no se almacenan como lista dentro de Mascota, sino en la entidad independiente Fotografia, con relación 1:N).</w:t>
+      </w:r>
+    </w:p>
+    <w:p>
+      <w:pPr>
+        <w:jc w:val="both"/>
+        <w:rPr>
+          <w:rFonts w:ascii="Times New Roman" w:hAnsi="Times New Roman" w:cs="Times New Roman"/>
+        </w:rPr>
+      </w:pPr>
+      <w:r>
+        <w:rPr>
+          <w:rFonts w:ascii="Times New Roman" w:hAnsi="Times New Roman" w:cs="Times New Roman"/>
+        </w:rPr>
+        <w:t>2FN: todas las entidades cuentan con clave primaria simple (BIGINT autoincremental) y ningún atributo no clave depende parcialmente de una clave compuesta, dado que no se definieron claves compuestas en el modelo.</w:t>
+      </w:r>
+    </w:p>
+    <w:p>
+      <w:pPr>
+        <w:jc w:val="both"/>
+        <w:rPr>
+          <w:rFonts w:ascii="Times New Roman" w:hAnsi="Times New Roman" w:cs="Times New Roman"/>
+        </w:rPr>
+      </w:pPr>
+      <w:r>
+        <w:rPr>
+          <w:rFonts w:ascii="Times New Roman" w:hAnsi="Times New Roman" w:cs="Times New Roman"/>
+        </w:rPr>
+        <w:t>3FN: se verificó la ausencia de dependencias transitivas. Por ejemplo, en la entidad Vacuna, el atributo nombreVacuna depende únicamente de idVacuna y no de idHistorial; los datos del historial médico (alergias, enfermedades, etc.) no se duplican en las entidades derivadas (Vacuna, Documento_Veterinario), sino que se referencian mediante clave foránea a Historial_Medico, evitando anomalías de actualización.</w:t>
+      </w:r>
+    </w:p>
+    <w:p>
+      <w:pPr>
+        <w:jc w:val="both"/>
+        <w:rPr>
+          <w:rFonts w:ascii="Times New Roman" w:hAnsi="Times New Roman" w:cs="Times New Roman"/>
         </w:rPr>
         <w:sectPr>
           <w:pgSz w:w="12240" w:h="15840"/>
@@ -28828,6 +28932,12 @@
           <w:docGrid w:linePitch="360"/>
         </w:sectPr>
       </w:pPr>
+      <w:r>
+        <w:rPr>
+          <w:rFonts w:ascii="Times New Roman" w:hAnsi="Times New Roman" w:cs="Times New Roman"/>
+        </w:rPr>
+        <w:t>Esta verificación es consistente con el criterio de calidad establecido en la sección 2.4 de este documento.</w:t>
+      </w:r>
     </w:p>
     <w:p>
       <w:pPr>
@@ -29018,6 +29128,7 @@
       <w:r>
         <w:rPr>
           <w:rFonts w:ascii="Times New Roman" w:hAnsi="Times New Roman" w:cs="Times New Roman"/>
+          <w:noProof/>
         </w:rPr>
         <w:drawing>
           <wp:inline distT="0" distB="0" distL="0" distR="0" wp14:anchorId="59280FAC" wp14:editId="207B658D">
@@ -42558,6 +42669,7 @@
       <w:r>
         <w:rPr>
           <w:rFonts w:ascii="Times New Roman" w:hAnsi="Times New Roman" w:cs="Times New Roman"/>
+          <w:noProof/>
         </w:rPr>
         <w:drawing>
           <wp:inline distT="0" distB="0" distL="0" distR="0" wp14:anchorId="11AB69BD" wp14:editId="70879663">
@@ -43203,7 +43315,7 @@
             <w:autoSpaceDN w:val="0"/>
             <w:ind w:hanging="640"/>
             <w:jc w:val="both"/>
-            <w:divId w:val="2145809994"/>
+            <w:divId w:val="863905578"/>
             <w:rPr>
               <w:rFonts w:ascii="Times New Roman" w:eastAsia="Times New Roman" w:hAnsi="Times New Roman" w:cs="Times New Roman"/>
               <w:color w:val="000000"/>
@@ -43249,7 +43361,7 @@
             <w:autoSpaceDN w:val="0"/>
             <w:ind w:hanging="640"/>
             <w:jc w:val="both"/>
-            <w:divId w:val="1658217946"/>
+            <w:divId w:val="1563710506"/>
             <w:rPr>
               <w:rFonts w:ascii="Times New Roman" w:eastAsia="Times New Roman" w:hAnsi="Times New Roman" w:cs="Times New Roman"/>
               <w:color w:val="000000"/>
@@ -43277,7 +43389,7 @@
               <w:iCs/>
               <w:color w:val="000000"/>
             </w:rPr>
-            <w:t>Requirements engineering : fundamentals, principles, and techniques</w:t>
+            <w:t>Requirements engineering: fundamentals, principles, and techniques</w:t>
           </w:r>
           <w:r>
             <w:rPr>
@@ -43293,7 +43405,7 @@
             <w:autoSpaceDN w:val="0"/>
             <w:ind w:hanging="640"/>
             <w:jc w:val="both"/>
-            <w:divId w:val="1918393171"/>
+            <w:divId w:val="1700157921"/>
             <w:rPr>
               <w:rFonts w:ascii="Times New Roman" w:eastAsia="Times New Roman" w:hAnsi="Times New Roman" w:cs="Times New Roman"/>
               <w:color w:val="000000"/>
@@ -43337,7 +43449,7 @@
             <w:autoSpaceDN w:val="0"/>
             <w:ind w:hanging="640"/>
             <w:jc w:val="both"/>
-            <w:divId w:val="690447650"/>
+            <w:divId w:val="535775014"/>
             <w:rPr>
               <w:rFonts w:ascii="Times New Roman" w:eastAsia="Times New Roman" w:hAnsi="Times New Roman" w:cs="Times New Roman"/>
               <w:color w:val="000000"/>
@@ -43366,7 +43478,7 @@
             <w:autoSpaceDN w:val="0"/>
             <w:ind w:hanging="640"/>
             <w:jc w:val="both"/>
-            <w:divId w:val="490416523"/>
+            <w:divId w:val="1348172644"/>
             <w:rPr>
               <w:rFonts w:ascii="Times New Roman" w:eastAsia="Times New Roman" w:hAnsi="Times New Roman" w:cs="Times New Roman"/>
               <w:color w:val="000000"/>
@@ -43394,7 +43506,7 @@
             <w:autoSpaceDN w:val="0"/>
             <w:ind w:hanging="640"/>
             <w:jc w:val="both"/>
-            <w:divId w:val="1333950595"/>
+            <w:divId w:val="1829708081"/>
             <w:rPr>
               <w:rFonts w:ascii="Times New Roman" w:eastAsia="Times New Roman" w:hAnsi="Times New Roman" w:cs="Times New Roman"/>
               <w:color w:val="000000"/>
@@ -43422,7 +43534,7 @@
             <w:autoSpaceDN w:val="0"/>
             <w:ind w:hanging="640"/>
             <w:jc w:val="both"/>
-            <w:divId w:val="399256298"/>
+            <w:divId w:val="18699601"/>
             <w:rPr>
               <w:rFonts w:ascii="Times New Roman" w:eastAsia="Times New Roman" w:hAnsi="Times New Roman" w:cs="Times New Roman"/>
               <w:color w:val="000000"/>
@@ -43466,7 +43578,7 @@
             <w:autoSpaceDN w:val="0"/>
             <w:ind w:hanging="640"/>
             <w:jc w:val="both"/>
-            <w:divId w:val="169296320"/>
+            <w:divId w:val="2128573009"/>
             <w:rPr>
               <w:rFonts w:ascii="Times New Roman" w:eastAsia="Times New Roman" w:hAnsi="Times New Roman" w:cs="Times New Roman"/>
               <w:color w:val="000000"/>
@@ -43510,7 +43622,7 @@
             <w:autoSpaceDN w:val="0"/>
             <w:ind w:hanging="640"/>
             <w:jc w:val="both"/>
-            <w:divId w:val="1534464722"/>
+            <w:divId w:val="769931604"/>
             <w:rPr>
               <w:rFonts w:ascii="Times New Roman" w:eastAsia="Times New Roman" w:hAnsi="Times New Roman" w:cs="Times New Roman"/>
               <w:color w:val="000000"/>
@@ -43538,7 +43650,7 @@
             <w:autoSpaceDN w:val="0"/>
             <w:ind w:hanging="640"/>
             <w:jc w:val="both"/>
-            <w:divId w:val="1160462123"/>
+            <w:divId w:val="845443362"/>
             <w:rPr>
               <w:rFonts w:ascii="Times New Roman" w:eastAsia="Times New Roman" w:hAnsi="Times New Roman" w:cs="Times New Roman"/>
               <w:color w:val="000000"/>
@@ -43582,7 +43694,7 @@
             <w:autoSpaceDN w:val="0"/>
             <w:ind w:hanging="640"/>
             <w:jc w:val="both"/>
-            <w:divId w:val="2111117791"/>
+            <w:divId w:val="742333947"/>
             <w:rPr>
               <w:rFonts w:ascii="Times New Roman" w:eastAsia="Times New Roman" w:hAnsi="Times New Roman" w:cs="Times New Roman"/>
               <w:color w:val="000000"/>
@@ -43626,7 +43738,7 @@
             <w:autoSpaceDN w:val="0"/>
             <w:ind w:hanging="640"/>
             <w:jc w:val="both"/>
-            <w:divId w:val="2084450147"/>
+            <w:divId w:val="639386089"/>
             <w:rPr>
               <w:rFonts w:ascii="Times New Roman" w:eastAsia="Times New Roman" w:hAnsi="Times New Roman" w:cs="Times New Roman"/>
               <w:color w:val="000000"/>
@@ -43670,7 +43782,7 @@
             <w:autoSpaceDN w:val="0"/>
             <w:ind w:hanging="640"/>
             <w:jc w:val="both"/>
-            <w:divId w:val="654072383"/>
+            <w:divId w:val="1144086852"/>
             <w:rPr>
               <w:rFonts w:ascii="Times New Roman" w:eastAsia="Times New Roman" w:hAnsi="Times New Roman" w:cs="Times New Roman"/>
               <w:color w:val="000000"/>
@@ -43716,6 +43828,13 @@
               <w:color w:val="000000"/>
             </w:rPr>
           </w:pPr>
+          <w:r>
+            <w:rPr>
+              <w:rFonts w:ascii="Times New Roman" w:eastAsia="Times New Roman" w:hAnsi="Times New Roman" w:cs="Times New Roman"/>
+              <w:color w:val="000000"/>
+            </w:rPr>
+            <w:t> </w:t>
+          </w:r>
         </w:p>
       </w:sdtContent>
     </w:sdt>
@@ -45679,6 +45798,7 @@
   <w:style w:type="character" w:default="1" w:styleId="Fuentedeprrafopredeter">
     <w:name w:val="Default Paragraph Font"/>
     <w:uiPriority w:val="1"/>
+    <w:semiHidden/>
     <w:unhideWhenUsed/>
   </w:style>
   <w:style w:type="table" w:default="1" w:styleId="Tablanormal">
@@ -46513,16 +46633,23 @@
   <w:rsids>
     <w:rsidRoot w:val="00EF0BFD"/>
     <w:rsid w:val="00116C73"/>
+    <w:rsid w:val="001B103B"/>
     <w:rsid w:val="002B49BF"/>
+    <w:rsid w:val="00314595"/>
     <w:rsid w:val="00322F0F"/>
     <w:rsid w:val="003A0A94"/>
     <w:rsid w:val="003A375F"/>
     <w:rsid w:val="005336E9"/>
+    <w:rsid w:val="006166BB"/>
     <w:rsid w:val="006A6F4C"/>
     <w:rsid w:val="00711BC1"/>
     <w:rsid w:val="007E3EC3"/>
+    <w:rsid w:val="008116C9"/>
+    <w:rsid w:val="00925F92"/>
     <w:rsid w:val="00B033B3"/>
     <w:rsid w:val="00EF0BFD"/>
+    <w:rsid w:val="00F221D4"/>
+    <w:rsid w:val="00FB45CB"/>
   </w:rsids>
   <m:mathPr>
     <m:mathFont m:val="Cambria Math"/>
@@ -47324,8 +47451,8 @@
   </we:alternateReferences>
   <we:properties>
     <we:property name="MENDELEY_BIBLIOGRAPHY_IS_DIRTY" value="true"/>
-    <we:property name="MENDELEY_BIBLIOGRAPHY_LAST_MODIFIED" value="1783881504476"/>
-    <we:property name="MENDELEY_CITATIONS" value="[{&quot;citationID&quot;:&quot;MENDELEY_CITATION_d1f4b0f3-c16e-466c-8bfa-670575522dac&quot;,&quot;properties&quot;:{&quot;noteIndex&quot;:0},&quot;isEdited&quot;:false,&quot;manualOverride&quot;:{&quot;isManuallyOverridden&quot;:false,&quot;citeprocText&quot;:&quot;[1]&quot;,&quot;manualOverrideText&quot;:&quot;&quot;},&quot;citationTag&quot;:&quot;MENDELEY_CITATION_v3_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&quot;,&quot;citationItems&quot;:[{&quot;id&quot;:&quot;8b459ffd-756d-3939-9e41-8c07ad9f20f2&quot;,&quot;itemData&quot;:{&quot;type&quot;:&quot;article&quot;,&quot;id&quot;:&quot;8b459ffd-756d-3939-9e41-8c07ad9f20f2&quot;,&quot;title&quot;:&quot;29148:2018 — Requirements engineering&quot;,&quot;author&quot;:[{&quot;family&quot;:&quot;ISO/IEC/IEEE&quot;,&quot;given&quot;:&quot;&quot;,&quot;parse-names&quot;:false,&quot;dropping-particle&quot;:&quot;&quot;,&quot;non-dropping-particle&quot;:&quot;&quot;}],&quot;DOI&quot;:&quot;10.1109/IEEESTD.2018.8559686&quot;,&quot;ISBN&quot;:&quot;978-1-5044-5302-8&quot;,&quot;issued&quot;:{&quot;date-parts&quot;:[[2018]]},&quot;publisher-place&quot;:&quot;Piscataway, NJ, USA&quot;,&quot;publisher&quot;:&quot;IEEE&quot;,&quot;container-title-short&quot;:&quot;&quot;},&quot;isTemporary&quot;:false,&quot;suppress-author&quot;:false,&quot;composite&quot;:false,&quot;author-only&quot;:false}]},{&quot;citationID&quot;:&quot;MENDELEY_CITATION_4946858a-3c80-4c59-bd5f-f99988864337&quot;,&quot;properties&quot;:{&quot;noteIndex&quot;:0},&quot;isEdited&quot;:false,&quot;manualOverride&quot;:{&quot;isManuallyOverridden&quot;:false,&quot;citeprocText&quot;:&quot;[1]&quot;,&quot;manualOverrideText&quot;:&quot;&quot;},&quot;citationTag&quot;:&quot;MENDELEY_CITATION_v3_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&quot;,&quot;citationItems&quot;:[{&quot;id&quot;:&quot;8b459ffd-756d-3939-9e41-8c07ad9f20f2&quot;,&quot;itemData&quot;:{&quot;type&quot;:&quot;article&quot;,&quot;id&quot;:&quot;8b459ffd-756d-3939-9e41-8c07ad9f20f2&quot;,&quot;title&quot;:&quot;29148:2018 — Requirements engineering&quot;,&quot;author&quot;:[{&quot;family&quot;:&quot;ISO/IEC/IEEE&quot;,&quot;given&quot;:&quot;&quot;,&quot;parse-names&quot;:false,&quot;dropping-particle&quot;:&quot;&quot;,&quot;non-dropping-particle&quot;:&quot;&quot;}],&quot;DOI&quot;:&quot;10.1109/IEEESTD.2018.8559686&quot;,&quot;ISBN&quot;:&quot;978-1-5044-5302-8&quot;,&quot;issued&quot;:{&quot;date-parts&quot;:[[2018]]},&quot;publisher-place&quot;:&quot;Piscataway, NJ, USA&quot;,&quot;publisher&quot;:&quot;IEEE&quot;,&quot;container-title-short&quot;:&quot;&quot;},&quot;isTemporary&quot;:false,&quot;suppress-author&quot;:false,&quot;composite&quot;:false,&quot;author-only&quot;:false}]},{&quot;citationID&quot;:&quot;MENDELEY_CITATION_e018ed9c-7d24-44f5-a3e7-a4c260ef6e9e&quot;,&quot;properties&quot;:{&quot;noteIndex&quot;:0},&quot;isEdited&quot;:false,&quot;manualOverride&quot;:{&quot;isManuallyOverridden&quot;:false,&quot;citeprocText&quot;:&quot;[2]&quot;,&quot;manualOverrideText&quot;:&quot;&quot;},&quot;citationTag&quot;:&quot;MENDELEY_CITATION_v3_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&quot;,&quot;citationItems&quot;:[{&quot;id&quot;:&quot;e2b26073-7ef3-371d-af2e-9af8bf0591d2&quot;,&quot;itemData&quot;:{&quot;type&quot;:&quot;book&quot;,&quot;id&quot;:&quot;e2b26073-7ef3-371d-af2e-9af8bf0591d2&quot;,&quot;title&quot;:&quot;Requirements engineering : fundamentals, principles, and techniques&quot;,&quot;author&quot;:[{&quot;family&quot;:&quot;Pohl&quot;,&quot;given&quot;:&quot;Klaus.&quot;,&quot;parse-names&quot;:false,&quot;dropping-particle&quot;:&quot;&quot;,&quot;non-dropping-particle&quot;:&quot;&quot;}],&quot;ISBN&quot;:&quot;9783662692042&quot;,&quot;issued&quot;:{&quot;date-parts&quot;:[[2025]]},&quot;number-of-pages&quot;:&quot;814&quot;,&quot;abstract&quot;:&quot;Second edition.&quot;,&quot;publisher&quot;:&quot;Springer&quot;,&quot;container-title-short&quot;:&quot;&quot;},&quot;isTemporary&quot;:false,&quot;suppress-author&quot;:false,&quot;composite&quot;:false,&quot;author-only&quot;:false}]},{&quot;citationID&quot;:&quot;MENDELEY_CITATION_1df5f673-f934-40c4-acac-a2f628c714fe&quot;,&quot;properties&quot;:{&quot;noteIndex&quot;:0},&quot;isEdited&quot;:false,&quot;manualOverride&quot;:{&quot;isManuallyOverridden&quot;:false,&quot;citeprocText&quot;:&quot;[1]&quot;,&quot;manualOverrideText&quot;:&quot;&quot;},&quot;citationTag&quot;:&quot;MENDELEY_CITATION_v3_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&quot;,&quot;citationItems&quot;:[{&quot;id&quot;:&quot;8b459ffd-756d-3939-9e41-8c07ad9f20f2&quot;,&quot;itemData&quot;:{&quot;type&quot;:&quot;article&quot;,&quot;id&quot;:&quot;8b459ffd-756d-3939-9e41-8c07ad9f20f2&quot;,&quot;title&quot;:&quot;29148:2018 — Requirements engineering&quot;,&quot;author&quot;:[{&quot;family&quot;:&quot;ISO/IEC/IEEE&quot;,&quot;given&quot;:&quot;&quot;,&quot;parse-names&quot;:false,&quot;dropping-particle&quot;:&quot;&quot;,&quot;non-dropping-particle&quot;:&quot;&quot;}],&quot;DOI&quot;:&quot;10.1109/IEEESTD.2018.8559686&quot;,&quot;ISBN&quot;:&quot;978-1-5044-5302-8&quot;,&quot;issued&quot;:{&quot;date-parts&quot;:[[2018]]},&quot;publisher-place&quot;:&quot;Piscataway, NJ, USA&quot;,&quot;publisher&quot;:&quot;IEEE&quot;,&quot;container-title-short&quot;:&quot;&quot;},&quot;isTemporary&quot;:false,&quot;suppress-author&quot;:false,&quot;composite&quot;:false,&quot;author-only&quot;:false}]},{&quot;citationID&quot;:&quot;MENDELEY_CITATION_b0180692-3631-44e9-b572-ce8091c94df4&quot;,&quot;properties&quot;:{&quot;noteIndex&quot;:0},&quot;isEdited&quot;:false,&quot;manualOverride&quot;:{&quot;isManuallyOverridden&quot;:false,&quot;citeprocText&quot;:&quot;[3]&quot;,&quot;manualOverrideText&quot;:&quot;&quot;},&quot;citationTag&quot;:&quot;MENDELEY_CITATION_v3_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&quot;,&quot;citationItems&quot;:[{&quot;id&quot;:&quot;e6dea4ac-962f-3053-a6bc-34fc5f37acee&quot;,&quot;itemData&quot;:{&quot;type&quot;:&quot;article-journal&quot;,&quot;id&quot;:&quot;e6dea4ac-962f-3053-a6bc-34fc5f37acee&quot;,&quot;title&quot;:&quot;Advances in automated support for requirements engineering: a systematic literature review&quot;,&quot;author&quot;:[{&quot;family&quot;:&quot;Umar&quot;,&quot;given&quot;:&quot;Muhammad Aminu&quot;,&quot;parse-names&quot;:false,&quot;dropping-particle&quot;:&quot;&quot;,&quot;non-dropping-particle&quot;:&quot;&quot;},{&quot;family&quot;:&quot;Lano&quot;,&quot;given&quot;:&quot;Kevin&quot;,&quot;parse-names&quot;:false,&quot;dropping-particle&quot;:&quot;&quot;,&quot;non-dropping-particle&quot;:&quot;&quot;}],&quot;container-title&quot;:&quot;Requirements Engineering&quot;,&quot;container-title-short&quot;:&quot;Requir. Eng.&quot;,&quot;DOI&quot;:&quot;10.1007/s00766-023-00411-0&quot;,&quot;ISSN&quot;:&quot;0947-3602&quot;,&quot;issued&quot;:{&quot;date-parts&quot;:[[2024,6,3]]},&quot;page&quot;:&quot;177-207&quot;,&quot;abstract&quot;:&quot;&lt;p&gt;Requirements Engineering (RE) has undergone several transitions over the years, from traditional methods to agile approaches emphasising increased automation. In many software development projects, requirements are expressed in natural language and embedded within large volumes of text documents. At the same time, RE activities aim to define software systems' functionalities and constraints. However, manually executing these tasks is time-consuming and prone to errors. Numerous research efforts have proposed tools and technologies for automating RE activities to address this challenge, which are documented in published works. This review aims to examine empirical evidence on automated RE and analyse its impact on the RE sub-domain and software development. To achieve our goal, we conducted a Systematic Literature Review (SLR) following established guidelines for conducting SLRs. We aimed to identify, aggregate, and analyse papers on automated RE published between 1996 and 2022. We outlined the output of the support tool, the RE phase covered, levels of automation, development approach, and evaluation approaches. We identified 85 papers that discussed automated RE from various perspectives and methodologies. The results of this review demonstrate the significance of automated RE for the software development community, which has the potential to shorten development cycles and reduce associated costs. The support tools primarily assist in generating UML models (44.7%) and other activities such as omission of steps, consistency checking, and requirement validation. The analysis phase of RE is the most widely automated phase, with 49.53% of automated tools developed for this purpose. Natural language processing technologies, particularly POS tagging and Parser, are widely employed in developing these support tools. Controlled experimental methods are the most frequently used (48.2%) for evaluating automated RE tools, while user studies are the least employed evaluation method (8.2%). This paper contributes to the existing body of knowledge by providing an updated overview of the research literature, enabling a better understanding of trends and state-of-the-art practices in automated RE for researchers and practitioners. It also paves the way for future research directions in automated requirements engineering.&lt;/p&gt;&quot;,&quot;issue&quot;:&quot;2&quot;,&quot;volume&quot;:&quot;29&quot;},&quot;isTemporary&quot;:false,&quot;suppress-author&quot;:false,&quot;composite&quot;:false,&quot;author-only&quot;:false}]},{&quot;citationID&quot;:&quot;MENDELEY_CITATION_9dd78bfa-88b6-43c6-9ea9-f9e291f6e305&quot;,&quot;properties&quot;:{&quot;noteIndex&quot;:0},&quot;isEdited&quot;:false,&quot;manualOverride&quot;:{&quot;isManuallyOverridden&quot;:false,&quot;citeprocText&quot;:&quot;[4]&quot;,&quot;manualOverrideText&quot;:&quot;&quot;},&quot;citationTag&quot;:&quot;MENDELEY_CITATION_v3_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&quot;,&quot;citationItems&quot;:[{&quot;id&quot;:&quot;e255f396-b160-39f8-b810-7138cb6c1d4f&quot;,&quot;itemData&quot;:{&quot;type&quot;:&quot;article&quot;,&quot;id&quot;:&quot;e255f396-b160-39f8-b810-7138cb6c1d4f&quot;,&quot;title&quot;:&quot;15288:2023 — System life cycle processes&quot;,&quot;author&quot;:[{&quot;family&quot;:&quot;ISO/IEC/IEEE&quot;,&quot;given&quot;:&quot;&quot;,&quot;parse-names&quot;:false,&quot;dropping-particle&quot;:&quot;&quot;,&quot;non-dropping-particle&quot;:&quot;&quot;}],&quot;issued&quot;:{&quot;date-parts&quot;:[[2023]]},&quot;issue&quot;:&quot;ISO/IEC/IEEE 15288:2023&quot;,&quot;container-title-short&quot;:&quot;&quot;},&quot;isTemporary&quot;:false,&quot;suppress-author&quot;:false,&quot;composite&quot;:false,&quot;author-only&quot;:false}]},{&quot;citationID&quot;:&quot;MENDELEY_CITATION_d0a992e6-43d2-4bad-a2ea-14d17f715b23&quot;,&quot;properties&quot;:{&quot;noteIndex&quot;:0},&quot;isEdited&quot;:false,&quot;manualOverride&quot;:{&quot;isManuallyOverridden&quot;:false,&quot;citeprocText&quot;:&quot;[5]&quot;,&quot;manualOverrideText&quot;:&quot;&quot;},&quot;citationTag&quot;:&quot;MENDELEY_CITATION_v3_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&quot;,&quot;citationItems&quot;:[{&quot;id&quot;:&quot;4326de62-a1f1-370d-99b5-e2d8d6481a94&quot;,&quot;itemData&quot;:{&quot;type&quot;:&quot;article&quot;,&quot;id&quot;:&quot;4326de62-a1f1-370d-99b5-e2d8d6481a94&quot;,&quot;title&quot;:&quot;12207:2017 — Systems and software engineering — Software life cycle processes&quot;,&quot;author&quot;:[{&quot;family&quot;:&quot;ISO/IEC/IEEE&quot;,&quot;given&quot;:&quot;&quot;,&quot;parse-names&quot;:false,&quot;dropping-particle&quot;:&quot;&quot;,&quot;non-dropping-particle&quot;:&quot;&quot;}],&quot;issued&quot;:{&quot;date-parts&quot;:[[2017]]},&quot;issue&quot;:&quot;ISO/IEC/IEEE 12207:2017&quot;,&quot;container-title-short&quot;:&quot;&quot;},&quot;isTemporary&quot;:false,&quot;suppress-author&quot;:false,&quot;composite&quot;:false,&quot;author-only&quot;:false}]},{&quot;citationID&quot;:&quot;MENDELEY_CITATION_89e6926f-86bd-42d1-8958-ce1661c27a30&quot;,&quot;properties&quot;:{&quot;noteIndex&quot;:0},&quot;isEdited&quot;:false,&quot;manualOverride&quot;:{&quot;isManuallyOverridden&quot;:false,&quot;citeprocText&quot;:&quot;[6]&quot;,&quot;manualOverrideText&quot;:&quot;&quot;},&quot;citationTag&quot;:&quot;MENDELEY_CITATION_v3_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&quot;,&quot;citationItems&quot;:[{&quot;id&quot;:&quot;9003cc2d-8e1b-3761-9c43-cf67f96021b9&quot;,&quot;itemData&quot;:{&quot;type&quot;:&quot;article&quot;,&quot;id&quot;:&quot;9003cc2d-8e1b-3761-9c43-cf67f96021b9&quot;,&quot;title&quot;:&quot;25010:2023 Systems and software Quality Requirements and Evaluation (SQuaRE) — Product quality model&quot;,&quot;author&quot;:[{&quot;family&quot;:&quot;ISO/IEC&quot;,&quot;given&quot;:&quot;&quot;,&quot;parse-names&quot;:false,&quot;dropping-particle&quot;:&quot;&quot;,&quot;non-dropping-particle&quot;:&quot;&quot;}],&quot;issued&quot;:{&quot;date-parts&quot;:[[2023]]},&quot;issue&quot;:&quot;ISO/IEC 25010:2023&quot;,&quot;container-title-short&quot;:&quot;&quot;},&quot;isTemporary&quot;:false,&quot;suppress-author&quot;:false,&quot;composite&quot;:false,&quot;author-only&quot;:false}]},{&quot;citationID&quot;:&quot;MENDELEY_CITATION_0fbdbc46-8a3e-47bb-bd1e-a2db294aac5c&quot;,&quot;properties&quot;:{&quot;noteIndex&quot;:0},&quot;isEdited&quot;:false,&quot;manualOverride&quot;:{&quot;isManuallyOverridden&quot;:false,&quot;citeprocText&quot;:&quot;[2]&quot;,&quot;manualOverrideText&quot;:&quot;&quot;},&quot;citationTag&quot;:&quot;MENDELEY_CITATION_v3_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&quot;,&quot;citationItems&quot;:[{&quot;id&quot;:&quot;e2b26073-7ef3-371d-af2e-9af8bf0591d2&quot;,&quot;itemData&quot;:{&quot;type&quot;:&quot;book&quot;,&quot;id&quot;:&quot;e2b26073-7ef3-371d-af2e-9af8bf0591d2&quot;,&quot;title&quot;:&quot;Requirements engineering : fundamentals, principles, and techniques&quot;,&quot;author&quot;:[{&quot;family&quot;:&quot;Pohl&quot;,&quot;given&quot;:&quot;Klaus.&quot;,&quot;parse-names&quot;:false,&quot;dropping-particle&quot;:&quot;&quot;,&quot;non-dropping-particle&quot;:&quot;&quot;}],&quot;ISBN&quot;:&quot;9783662692042&quot;,&quot;issued&quot;:{&quot;date-parts&quot;:[[2025]]},&quot;number-of-pages&quot;:&quot;814&quot;,&quot;abstract&quot;:&quot;Second edition.&quot;,&quot;publisher&quot;:&quot;Springer&quot;,&quot;container-title-short&quot;:&quot;&quot;},&quot;isTemporary&quot;:false,&quot;suppress-author&quot;:false,&quot;composite&quot;:false,&quot;author-only&quot;:false}]},{&quot;citationID&quot;:&quot;MENDELEY_CITATION_5a19125a-f94e-4c1d-a9ee-de90b4f409b9&quot;,&quot;properties&quot;:{&quot;noteIndex&quot;:0},&quot;isEdited&quot;:false,&quot;manualOverride&quot;:{&quot;isManuallyOverridden&quot;:false,&quot;citeprocText&quot;:&quot;[7]&quot;,&quot;manualOverrideText&quot;:&quot;&quot;},&quot;citationTag&quot;:&quot;MENDELEY_CITATION_v3_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&quot;,&quot;citationItems&quot;:[{&quot;id&quot;:&quot;b4a67c60-32e8-3898-8c2f-38b6887aa554&quot;,&quot;itemData&quot;:{&quot;type&quot;:&quot;book&quot;,&quot;id&quot;:&quot;b4a67c60-32e8-3898-8c2f-38b6887aa554&quot;,&quot;title&quot;:&quot;SWEBOK Guide v4.0&quot;,&quot;author&quot;:[{&quot;family&quot;:&quot;Washizaki&quot;,&quot;given&quot;:&quot;H&quot;,&quot;parse-names&quot;:false,&quot;dropping-particle&quot;:&quot;&quot;,&quot;non-dropping-particle&quot;:&quot;&quot;}],&quot;editor&quot;:[{&quot;family&quot;:&quot;Washizaki&quot;,&quot;given&quot;:&quot;H&quot;,&quot;parse-names&quot;:false,&quot;dropping-particle&quot;:&quot;&quot;,&quot;non-dropping-particle&quot;:&quot;&quot;}],&quot;URL&quot;:&quot;https://www.computer.org/education/bodies-of-knowledge/software-engineering&quot;,&quot;issued&quot;:{&quot;date-parts&quot;:[[2024]]},&quot;publisher&quot;:&quot;IEEE Computer Society&quot;,&quot;container-title-short&quot;:&quot;&quot;},&quot;isTemporary&quot;:false,&quot;suppress-author&quot;:false,&quot;composite&quot;:false,&quot;author-only&quot;:false}]},{&quot;citationID&quot;:&quot;MENDELEY_CITATION_d5e8a7f7-08de-4147-93e6-c3e18c13a771&quot;,&quot;properties&quot;:{&quot;noteIndex&quot;:0},&quot;isEdited&quot;:false,&quot;manualOverride&quot;:{&quot;isManuallyOverridden&quot;:false,&quot;citeprocText&quot;:&quot;[8]&quot;,&quot;manualOverrideText&quot;:&quot;&quot;},&quot;citationTag&quot;:&quot;MENDELEY_CITATION_v3_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&quot;,&quot;citationItems&quot;:[{&quot;id&quot;:&quot;daa08e9f-9677-3412-8e94-5091b7fddc56&quot;,&quot;itemData&quot;:{&quot;type&quot;:&quot;book&quot;,&quot;id&quot;:&quot;daa08e9f-9677-3412-8e94-5091b7fddc56&quot;,&quot;title&quot;:&quot;A Guide to the Project Management Body of Knowledge (PMBOK® Guide) – Seventh Edition and The Standard for Project Management&quot;,&quot;author&quot;:[{&quot;family&quot;:&quot;Institute&quot;,&quot;given&quot;:&quot;Project Management&quot;,&quot;parse-names&quot;:false,&quot;dropping-particle&quot;:&quot;&quot;,&quot;non-dropping-particle&quot;:&quot;&quot;}],&quot;ISBN&quot;:&quot;9781628256642&quot;,&quot;issued&quot;:{&quot;date-parts&quot;:[[2021]]},&quot;publisher-place&quot;:&quot;Newtown Square, PA&quot;,&quot;publisher&quot;:&quot;Project Management Institute&quot;,&quot;container-title-short&quot;:&quot;&quot;},&quot;isTemporary&quot;:false,&quot;suppress-author&quot;:false,&quot;composite&quot;:false,&quot;author-only&quot;:false}]},{&quot;citationID&quot;:&quot;MENDELEY_CITATION_da3ed054-d07a-496b-8435-6806fb559b7d&quot;,&quot;properties&quot;:{&quot;noteIndex&quot;:0},&quot;isEdited&quot;:false,&quot;manualOverride&quot;:{&quot;isManuallyOverridden&quot;:false,&quot;citeprocText&quot;:&quot;[9]&quot;,&quot;manualOverrideText&quot;:&quot;&quot;},&quot;citationTag&quot;:&quot;MENDELEY_CITATION_v3_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&quot;,&quot;citationItems&quot;:[{&quot;id&quot;:&quot;66151fa6-eac6-3909-b0c3-058dd6c6e5c7&quot;,&quot;itemData&quot;:{&quot;type&quot;:&quot;article&quot;,&quot;id&quot;:&quot;66151fa6-eac6-3909-b0c3-058dd6c6e5c7&quot;,&quot;title&quot;:&quot;CPRE Foundation Level Syllabus v3.1&quot;,&quot;author&quot;:[{&quot;family&quot;:&quot;IREB&quot;,&quot;given&quot;:&quot;&quot;,&quot;parse-names&quot;:false,&quot;dropping-particle&quot;:&quot;&quot;,&quot;non-dropping-particle&quot;:&quot;&quot;}],&quot;URL&quot;:&quot;https://www.ireb.org&quot;,&quot;issued&quot;:{&quot;date-parts&quot;:[[2022]]},&quot;container-title-short&quot;:&quot;&quot;},&quot;isTemporary&quot;:false,&quot;suppress-author&quot;:false,&quot;composite&quot;:false,&quot;author-only&quot;:false}]},{&quot;citationID&quot;:&quot;MENDELEY_CITATION_5668133c-8149-4de7-8e71-0d08dfa988e8&quot;,&quot;properties&quot;:{&quot;noteIndex&quot;:0},&quot;isEdited&quot;:false,&quot;manualOverride&quot;:{&quot;isManuallyOverridden&quot;:false,&quot;citeprocText&quot;:&quot;[1]&quot;,&quot;manualOverrideText&quot;:&quot;&quot;},&quot;citationTag&quot;:&quot;MENDELEY_CITATION_v3_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&quot;,&quot;citationItems&quot;:[{&quot;id&quot;:&quot;8b459ffd-756d-3939-9e41-8c07ad9f20f2&quot;,&quot;itemData&quot;:{&quot;type&quot;:&quot;article&quot;,&quot;id&quot;:&quot;8b459ffd-756d-3939-9e41-8c07ad9f20f2&quot;,&quot;title&quot;:&quot;29148:2018 — Requirements engineering&quot;,&quot;author&quot;:[{&quot;family&quot;:&quot;ISO/IEC/IEEE&quot;,&quot;given&quot;:&quot;&quot;,&quot;parse-names&quot;:false,&quot;dropping-particle&quot;:&quot;&quot;,&quot;non-dropping-particle&quot;:&quot;&quot;}],&quot;DOI&quot;:&quot;10.1109/IEEESTD.2018.8559686&quot;,&quot;ISBN&quot;:&quot;978-1-5044-5302-8&quot;,&quot;issued&quot;:{&quot;date-parts&quot;:[[2018]]},&quot;publisher-place&quot;:&quot;Piscataway, NJ, USA&quot;,&quot;publisher&quot;:&quot;IEEE&quot;,&quot;container-title-short&quot;:&quot;&quot;},&quot;isTemporary&quot;:false,&quot;suppress-author&quot;:false,&quot;composite&quot;:false,&quot;author-only&quot;:false}]},{&quot;citationID&quot;:&quot;MENDELEY_CITATION_38c3613e-9e78-4d87-af2a-9e3063aa327c&quot;,&quot;properties&quot;:{&quot;noteIndex&quot;:0},&quot;isEdited&quot;:false,&quot;manualOverride&quot;:{&quot;isManuallyOverridden&quot;:false,&quot;citeprocText&quot;:&quot;[10]&quot;,&quot;manualOverrideText&quot;:&quot;&quot;},&quot;citationTag&quot;:&quot;MENDELEY_CITATION_v3_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&quot;,&quot;citationItems&quot;:[{&quot;id&quot;:&quot;585f87df-c637-3e52-902f-9e282702414f&quot;,&quot;itemData&quot;:{&quot;type&quot;:&quot;article-journal&quot;,&quot;id&quot;:&quot;585f87df-c637-3e52-902f-9e282702414f&quot;,&quot;title&quot;:&quot;Structured SRS for e-Government Services With Boilerplate Design and Interface&quot;,&quot;author&quot;:[{&quot;family&quot;:&quot;Oztekin&quot;,&quot;given&quot;:&quot;Gonca Canan&quot;,&quot;parse-names&quot;:false,&quot;dropping-particle&quot;:&quot;&quot;,&quot;non-dropping-particle&quot;:&quot;&quot;},{&quot;family&quot;:&quot;Menekse Dalveren&quot;,&quot;given&quot;:&quot;Gonca Gokce&quot;,&quot;parse-names&quot;:false,&quot;dropping-particle&quot;:&quot;&quot;,&quot;non-dropping-particle&quot;:&quot;&quot;}],&quot;container-title&quot;:&quot;IEEE Access&quot;,&quot;DOI&quot;:&quot;10.1109/ACCESS.2023.3287882&quot;,&quot;ISSN&quot;:&quot;2169-3536&quot;,&quot;issued&quot;:{&quot;date-parts&quot;:[[2023]]},&quot;page&quot;:&quot;62906-62917&quot;,&quot;volume&quot;:&quot;11&quot;,&quot;container-title-short&quot;:&quot;&quot;},&quot;isTemporary&quot;:false,&quot;suppress-author&quot;:false,&quot;composite&quot;:false,&quot;author-only&quot;:false}]},{&quot;citationID&quot;:&quot;MENDELEY_CITATION_ef6bf1d8-39dd-48c3-9d2d-75fd6e4f6e10&quot;,&quot;properties&quot;:{&quot;noteIndex&quot;:0},&quot;isEdited&quot;:false,&quot;manualOverride&quot;:{&quot;isManuallyOverridden&quot;:false,&quot;citeprocText&quot;:&quot;[11]&quot;,&quot;manualOverrideText&quot;:&quot;&quot;},&quot;citationTag&quot;:&quot;MENDELEY_CITATION_v3_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&quot;,&quot;citationItems&quot;:[{&quot;id&quot;:&quot;53bf9615-9f05-3888-82f8-ecd3ad0cd90a&quot;,&quot;itemData&quot;:{&quot;type&quot;:&quot;book&quot;,&quot;id&quot;:&quot;53bf9615-9f05-3888-82f8-ecd3ad0cd90a&quot;,&quot;title&quot;:&quot;Requirements Engineering&quot;,&quot;author&quot;:[{&quot;family&quot;:&quot;Hull&quot;,&quot;given&quot;:&quot;Elizabeth&quot;,&quot;parse-names&quot;:false,&quot;dropping-particle&quot;:&quot;&quot;,&quot;non-dropping-particle&quot;:&quot;&quot;},{&quot;family&quot;:&quot;Jackson&quot;,&quot;given&quot;:&quot;Ken&quot;,&quot;parse-names&quot;:false,&quot;dropping-particle&quot;:&quot;&quot;,&quot;non-dropping-particle&quot;:&quot;&quot;},{&quot;family&quot;:&quot;Dick&quot;,&quot;given&quot;:&quot;Jeremy&quot;,&quot;parse-names&quot;:false,&quot;dropping-particle&quot;:&quot;&quot;,&quot;non-dropping-particle&quot;:&quot;&quot;}],&quot;DOI&quot;:&quot;10.1007/978-1-84996-405-0&quot;,&quot;ISBN&quot;:&quot;978-1-84996-404-3&quot;,&quot;issued&quot;:{&quot;date-parts&quot;:[[2011]]},&quot;publisher-place&quot;:&quot;London&quot;,&quot;publisher&quot;:&quot;Springer London&quot;,&quot;container-title-short&quot;:&quot;&quot;},&quot;isTemporary&quot;:false,&quot;suppress-author&quot;:false,&quot;composite&quot;:false,&quot;author-only&quot;:false}]},{&quot;citationID&quot;:&quot;MENDELEY_CITATION_9a0bdb73-4607-490e-a571-0179055fa7a6&quot;,&quot;properties&quot;:{&quot;noteIndex&quot;:0},&quot;isEdited&quot;:false,&quot;manualOverride&quot;:{&quot;isManuallyOverridden&quot;:false,&quot;citeprocText&quot;:&quot;[6]&quot;,&quot;manualOverrideText&quot;:&quot;&quot;},&quot;citationTag&quot;:&quot;MENDELEY_CITATION_v3_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&quot;,&quot;citationItems&quot;:[{&quot;id&quot;:&quot;9003cc2d-8e1b-3761-9c43-cf67f96021b9&quot;,&quot;itemData&quot;:{&quot;type&quot;:&quot;article&quot;,&quot;id&quot;:&quot;9003cc2d-8e1b-3761-9c43-cf67f96021b9&quot;,&quot;title&quot;:&quot;25010:2023 Systems and software Quality Requirements and Evaluation (SQuaRE) — Product quality model&quot;,&quot;author&quot;:[{&quot;family&quot;:&quot;ISO/IEC&quot;,&quot;given&quot;:&quot;&quot;,&quot;parse-names&quot;:false,&quot;dropping-particle&quot;:&quot;&quot;,&quot;non-dropping-particle&quot;:&quot;&quot;}],&quot;issued&quot;:{&quot;date-parts&quot;:[[2023]]},&quot;issue&quot;:&quot;ISO/IEC 25010:2023&quot;,&quot;container-title-short&quot;:&quot;&quot;},&quot;isTemporary&quot;:false,&quot;suppress-author&quot;:false,&quot;composite&quot;:false,&quot;author-only&quot;:false}]},{&quot;citationID&quot;:&quot;MENDELEY_CITATION_d517f449-2212-4592-b6c2-2be1c486617c&quot;,&quot;properties&quot;:{&quot;noteIndex&quot;:0},&quot;isEdited&quot;:false,&quot;manualOverride&quot;:{&quot;isManuallyOverridden&quot;:false,&quot;citeprocText&quot;:&quot;[12]&quot;,&quot;manualOverrideText&quot;:&quot;&quot;},&quot;citationTag&quot;:&quot;MENDELEY_CITATION_v3_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&quot;,&quot;citationItems&quot;:[{&quot;id&quot;:&quot;969309ac-d1f5-3d30-89ff-aa1a87f9e65a&quot;,&quot;itemData&quot;:{&quot;type&quot;:&quot;book&quot;,&quot;id&quot;:&quot;969309ac-d1f5-3d30-89ff-aa1a87f9e65a&quot;,&quot;title&quot;:&quot;Requirements analysis and system design&quot;,&quot;author&quot;:[{&quot;family&quot;:&quot;Maciaszek&quot;,&quot;given&quot;:&quot;Leszek.&quot;,&quot;parse-names&quot;:false,&quot;dropping-particle&quot;:&quot;&quot;,&quot;non-dropping-particle&quot;:&quot;&quot;}],&quot;ISBN&quot;:&quot;0321440366&quot;,&quot;issued&quot;:{&quot;date-parts&quot;:[[2007]]},&quot;number-of-pages&quot;:&quot;612&quot;,&quot;abstract&quot;:&quot;3rd ed. Previous edition: 2005. \&quot;This book is the ideal companion for undergraduates studying: systems analysis; systems design; software engineering; software projects; and databases and object technology. It would also be an reference for any practitioners wishing to get up to speed with the latest developments in this area.\&quot;--Jacket. The software process -- Ch. 2. Requirements determination -- Ch. 3. Objects and object modeling -- Ch. 4. Requirements specification -- Ch. 5. Moving from analysis to design -- Ch. 6. System architecture and program design -- Ch. 7. User interface design -- Ch. 8. Persistence and database design -- Ch. 9. Testing and change management -- Ch. 10. Tutorial-style review and reinforcement.&quot;,&quot;publisher&quot;:&quot;Addison-Wesley&quot;,&quot;container-title-short&quot;:&quot;&quot;},&quot;isTemporary&quot;:false,&quot;suppress-author&quot;:false,&quot;composite&quot;:false,&quot;author-only&quot;:false}]},{&quot;citationID&quot;:&quot;MENDELEY_CITATION_a54d54ba-dc08-4317-8081-c98efd264fd8&quot;,&quot;properties&quot;:{&quot;noteIndex&quot;:0},&quot;isEdited&quot;:false,&quot;manualOverride&quot;:{&quot;isManuallyOverridden&quot;:false,&quot;citeprocText&quot;:&quot;[7]&quot;,&quot;manualOverrideText&quot;:&quot;&quot;},&quot;citationTag&quot;:&quot;MENDELEY_CITATION_v3_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&quot;,&quot;citationItems&quot;:[{&quot;id&quot;:&quot;b4a67c60-32e8-3898-8c2f-38b6887aa554&quot;,&quot;itemData&quot;:{&quot;type&quot;:&quot;book&quot;,&quot;id&quot;:&quot;b4a67c60-32e8-3898-8c2f-38b6887aa554&quot;,&quot;title&quot;:&quot;SWEBOK Guide v4.0&quot;,&quot;author&quot;:[{&quot;family&quot;:&quot;Washizaki&quot;,&quot;given&quot;:&quot;H&quot;,&quot;parse-names&quot;:false,&quot;dropping-particle&quot;:&quot;&quot;,&quot;non-dropping-particle&quot;:&quot;&quot;}],&quot;editor&quot;:[{&quot;family&quot;:&quot;Washizaki&quot;,&quot;given&quot;:&quot;H&quot;,&quot;parse-names&quot;:false,&quot;dropping-particle&quot;:&quot;&quot;,&quot;non-dropping-particle&quot;:&quot;&quot;}],&quot;URL&quot;:&quot;https://www.computer.org/education/bodies-of-knowledge/software-engineering&quot;,&quot;issued&quot;:{&quot;date-parts&quot;:[[2024]]},&quot;publisher&quot;:&quot;IEEE Computer Society&quot;,&quot;container-title-short&quot;:&quot;&quot;},&quot;isTemporary&quot;:false,&quot;suppress-author&quot;:false,&quot;composite&quot;:false,&quot;author-only&quot;:false}]},{&quot;citationID&quot;:&quot;MENDELEY_CITATION_71b5ecd2-b926-42c4-b8ac-6ac3b7d0a299&quot;,&quot;properties&quot;:{&quot;noteIndex&quot;:0},&quot;isEdited&quot;:false,&quot;manualOverride&quot;:{&quot;isManuallyOverridden&quot;:false,&quot;citeprocText&quot;:&quot;[2]&quot;,&quot;manualOverrideText&quot;:&quot;&quot;},&quot;citationTag&quot;:&quot;MENDELEY_CITATION_v3_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&quot;,&quot;citationItems&quot;:[{&quot;id&quot;:&quot;e2b26073-7ef3-371d-af2e-9af8bf0591d2&quot;,&quot;itemData&quot;:{&quot;type&quot;:&quot;book&quot;,&quot;id&quot;:&quot;e2b26073-7ef3-371d-af2e-9af8bf0591d2&quot;,&quot;title&quot;:&quot;Requirements engineering : fundamentals, principles, and techniques&quot;,&quot;author&quot;:[{&quot;family&quot;:&quot;Pohl&quot;,&quot;given&quot;:&quot;Klaus.&quot;,&quot;parse-names&quot;:false,&quot;dropping-particle&quot;:&quot;&quot;,&quot;non-dropping-particle&quot;:&quot;&quot;}],&quot;ISBN&quot;:&quot;9783662692042&quot;,&quot;issued&quot;:{&quot;date-parts&quot;:[[2025]]},&quot;number-of-pages&quot;:&quot;814&quot;,&quot;abstract&quot;:&quot;Second edition.&quot;,&quot;publisher&quot;:&quot;Springer&quot;,&quot;container-title-short&quot;:&quot;&quot;},&quot;isTemporary&quot;:false,&quot;suppress-author&quot;:false,&quot;composite&quot;:false,&quot;author-only&quot;:false}]},{&quot;citationID&quot;:&quot;MENDELEY_CITATION_6efc6ef9-53cb-4aca-8ada-eceee85f6186&quot;,&quot;properties&quot;:{&quot;noteIndex&quot;:0},&quot;isEdited&quot;:false,&quot;manualOverride&quot;:{&quot;isManuallyOverridden&quot;:false,&quot;citeprocText&quot;:&quot;[12]&quot;,&quot;manualOverrideText&quot;:&quot;&quot;},&quot;citationTag&quot;:&quot;MENDELEY_CITATION_v3_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&quot;,&quot;citationItems&quot;:[{&quot;id&quot;:&quot;969309ac-d1f5-3d30-89ff-aa1a87f9e65a&quot;,&quot;itemData&quot;:{&quot;type&quot;:&quot;book&quot;,&quot;id&quot;:&quot;969309ac-d1f5-3d30-89ff-aa1a87f9e65a&quot;,&quot;title&quot;:&quot;Requirements analysis and system design&quot;,&quot;author&quot;:[{&quot;family&quot;:&quot;Maciaszek&quot;,&quot;given&quot;:&quot;Leszek.&quot;,&quot;parse-names&quot;:false,&quot;dropping-particle&quot;:&quot;&quot;,&quot;non-dropping-particle&quot;:&quot;&quot;}],&quot;ISBN&quot;:&quot;0321440366&quot;,&quot;issued&quot;:{&quot;date-parts&quot;:[[2007]]},&quot;number-of-pages&quot;:&quot;612&quot;,&quot;abstract&quot;:&quot;3rd ed. Previous edition: 2005. \&quot;This book is the ideal companion for undergraduates studying: systems analysis; systems design; software engineering; software projects; and databases and object technology. It would also be an reference for any practitioners wishing to get up to speed with the latest developments in this area.\&quot;--Jacket. The software process -- Ch. 2. Requirements determination -- Ch. 3. Objects and object modeling -- Ch. 4. Requirements specification -- Ch. 5. Moving from analysis to design -- Ch. 6. System architecture and program design -- Ch. 7. User interface design -- Ch. 8. Persistence and database design -- Ch. 9. Testing and change management -- Ch. 10. Tutorial-style review and reinforcement.&quot;,&quot;publisher&quot;:&quot;Addison-Wesley&quot;,&quot;container-title-short&quot;:&quot;&quot;},&quot;isTemporary&quot;:false,&quot;suppress-author&quot;:false,&quot;composite&quot;:false,&quot;author-only&quot;:false}]},{&quot;citationID&quot;:&quot;MENDELEY_CITATION_c2568ec7-3aaa-4ced-ac6d-67091e151077&quot;,&quot;properties&quot;:{&quot;noteIndex&quot;:0},&quot;isEdited&quot;:false,&quot;manualOverride&quot;:{&quot;isManuallyOverridden&quot;:false,&quot;citeprocText&quot;:&quot;[12]&quot;,&quot;manualOverrideText&quot;:&quot;&quot;},&quot;citationTag&quot;:&quot;MENDELEY_CITATION_v3_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&quot;,&quot;citationItems&quot;:[{&quot;id&quot;:&quot;969309ac-d1f5-3d30-89ff-aa1a87f9e65a&quot;,&quot;itemData&quot;:{&quot;type&quot;:&quot;book&quot;,&quot;id&quot;:&quot;969309ac-d1f5-3d30-89ff-aa1a87f9e65a&quot;,&quot;title&quot;:&quot;Requirements analysis and system design&quot;,&quot;author&quot;:[{&quot;family&quot;:&quot;Maciaszek&quot;,&quot;given&quot;:&quot;Leszek.&quot;,&quot;parse-names&quot;:false,&quot;dropping-particle&quot;:&quot;&quot;,&quot;non-dropping-particle&quot;:&quot;&quot;}],&quot;ISBN&quot;:&quot;0321440366&quot;,&quot;issued&quot;:{&quot;date-parts&quot;:[[2007]]},&quot;number-of-pages&quot;:&quot;612&quot;,&quot;abstract&quot;:&quot;3rd ed. Previous edition: 2005. \&quot;This book is the ideal companion for undergraduates studying: systems analysis; systems design; software engineering; software projects; and databases and object technology. It would also be an reference for any practitioners wishing to get up to speed with the latest developments in this area.\&quot;--Jacket. The software process -- Ch. 2. Requirements determination -- Ch. 3. Objects and object modeling -- Ch. 4. Requirements specification -- Ch. 5. Moving from analysis to design -- Ch. 6. System architecture and program design -- Ch. 7. User interface design -- Ch. 8. Persistence and database design -- Ch. 9. Testing and change management -- Ch. 10. Tutorial-style review and reinforcement.&quot;,&quot;publisher&quot;:&quot;Addison-Wesley&quot;,&quot;container-title-short&quot;:&quot;&quot;},&quot;isTemporary&quot;:false,&quot;suppress-author&quot;:false,&quot;composite&quot;:false,&quot;author-only&quot;:false}]},{&quot;citationID&quot;:&quot;MENDELEY_CITATION_5db54668-57fe-411f-b9b9-81bc2887eac5&quot;,&quot;properties&quot;:{&quot;noteIndex&quot;:0},&quot;isEdited&quot;:false,&quot;manualOverride&quot;:{&quot;isManuallyOverridden&quot;:false,&quot;citeprocText&quot;:&quot;[2]&quot;,&quot;manualOverrideText&quot;:&quot;&quot;},&quot;citationTag&quot;:&quot;MENDELEY_CITATION_v3_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&quot;,&quot;citationItems&quot;:[{&quot;id&quot;:&quot;e2b26073-7ef3-371d-af2e-9af8bf0591d2&quot;,&quot;itemData&quot;:{&quot;type&quot;:&quot;book&quot;,&quot;id&quot;:&quot;e2b26073-7ef3-371d-af2e-9af8bf0591d2&quot;,&quot;title&quot;:&quot;Requirements engineering : fundamentals, principles, and techniques&quot;,&quot;author&quot;:[{&quot;family&quot;:&quot;Pohl&quot;,&quot;given&quot;:&quot;Klaus.&quot;,&quot;parse-names&quot;:false,&quot;dropping-particle&quot;:&quot;&quot;,&quot;non-dropping-particle&quot;:&quot;&quot;}],&quot;ISBN&quot;:&quot;9783662692042&quot;,&quot;issued&quot;:{&quot;date-parts&quot;:[[2025]]},&quot;number-of-pages&quot;:&quot;814&quot;,&quot;abstract&quot;:&quot;Second edition.&quot;,&quot;publisher&quot;:&quot;Springer&quot;,&quot;container-title-short&quot;:&quot;&quot;},&quot;isTemporary&quot;:false,&quot;suppress-author&quot;:false,&quot;composite&quot;:false,&quot;author-only&quot;:false}]},{&quot;citationID&quot;:&quot;MENDELEY_CITATION_5b8cc987-5ef7-4197-bf2d-32f3ed773c15&quot;,&quot;properties&quot;:{&quot;noteIndex&quot;:0},&quot;isEdited&quot;:false,&quot;manualOverride&quot;:{&quot;isManuallyOverridden&quot;:false,&quot;citeprocText&quot;:&quot;[13]&quot;,&quot;manualOverrideText&quot;:&quot;&quot;},&quot;citationTag&quot;:&quot;MENDELEY_CITATION_v3_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&quot;,&quot;citationItems&quot;:[{&quot;id&quot;:&quot;db86bc13-b5b2-3da2-8b6b-b765f7df50dd&quot;,&quot;itemData&quot;:{&quot;type&quot;:&quot;article-journal&quot;,&quot;id&quot;:&quot;db86bc13-b5b2-3da2-8b6b-b765f7df50dd&quot;,&quot;title&quot;:&quot;Statecharts: a visual formalism for complex systems&quot;,&quot;author&quot;:[{&quot;family&quot;:&quot;Harel&quot;,&quot;given&quot;:&quot;David&quot;,&quot;parse-names&quot;:false,&quot;dropping-particle&quot;:&quot;&quot;,&quot;non-dropping-particle&quot;:&quot;&quot;}],&quot;container-title&quot;:&quot;Science of Computer Programming&quot;,&quot;container-title-short&quot;:&quot;Sci. Comput. Program.&quot;,&quot;DOI&quot;:&quot;10.1016/0167-6423(87)90035-9&quot;,&quot;ISSN&quot;:&quot;01676423&quot;,&quot;issued&quot;:{&quot;date-parts&quot;:[[1987,6]]},&quot;page&quot;:&quot;231-274&quot;,&quot;issue&quot;:&quot;3&quot;,&quot;volume&quot;:&quot;8&quot;},&quot;isTemporary&quot;:false,&quot;suppress-author&quot;:false,&quot;composite&quot;:false,&quot;author-only&quot;:false}]},{&quot;citationID&quot;:&quot;MENDELEY_CITATION_bdd90be3-16dd-4414-aa17-3efdf6934353&quot;,&quot;properties&quot;:{&quot;noteIndex&quot;:0},&quot;isEdited&quot;:false,&quot;manualOverride&quot;:{&quot;isManuallyOverridden&quot;:false,&quot;citeprocText&quot;:&quot;[2]&quot;,&quot;manualOverrideText&quot;:&quot;&quot;},&quot;citationTag&quot;:&quot;MENDELEY_CITATION_v3_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&quot;,&quot;citationItems&quot;:[{&quot;id&quot;:&quot;e2b26073-7ef3-371d-af2e-9af8bf0591d2&quot;,&quot;itemData&quot;:{&quot;type&quot;:&quot;book&quot;,&quot;id&quot;:&quot;e2b26073-7ef3-371d-af2e-9af8bf0591d2&quot;,&quot;title&quot;:&quot;Requirements engineering : fundamentals, principles, and techniques&quot;,&quot;author&quot;:[{&quot;family&quot;:&quot;Pohl&quot;,&quot;given&quot;:&quot;Klaus.&quot;,&quot;parse-names&quot;:false,&quot;dropping-particle&quot;:&quot;&quot;,&quot;non-dropping-particle&quot;:&quot;&quot;}],&quot;ISBN&quot;:&quot;9783662692042&quot;,&quot;issued&quot;:{&quot;date-parts&quot;:[[2025]]},&quot;number-of-pages&quot;:&quot;814&quot;,&quot;abstract&quot;:&quot;Second edition.&quot;,&quot;publisher&quot;:&quot;Springer&quot;,&quot;container-title-short&quot;:&quot;&quot;},&quot;isTemporary&quot;:false,&quot;suppress-author&quot;:false,&quot;composite&quot;:false,&quot;author-only&quot;:false}]},{&quot;citationID&quot;:&quot;MENDELEY_CITATION_208525df-7542-417b-84d9-12734a2c4982&quot;,&quot;properties&quot;:{&quot;noteIndex&quot;:0},&quot;isEdited&quot;:false,&quot;manualOverride&quot;:{&quot;isManuallyOverridden&quot;:false,&quot;citeprocText&quot;:&quot;[13]&quot;,&quot;manualOverrideText&quot;:&quot;&quot;},&quot;citationTag&quot;:&quot;MENDELEY_CITATION_v3_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&quot;,&quot;citationItems&quot;:[{&quot;id&quot;:&quot;db86bc13-b5b2-3da2-8b6b-b765f7df50dd&quot;,&quot;itemData&quot;:{&quot;type&quot;:&quot;article-journal&quot;,&quot;id&quot;:&quot;db86bc13-b5b2-3da2-8b6b-b765f7df50dd&quot;,&quot;title&quot;:&quot;Statecharts: a visual formalism for complex systems&quot;,&quot;author&quot;:[{&quot;family&quot;:&quot;Harel&quot;,&quot;given&quot;:&quot;David&quot;,&quot;parse-names&quot;:false,&quot;dropping-particle&quot;:&quot;&quot;,&quot;non-dropping-particle&quot;:&quot;&quot;}],&quot;container-title&quot;:&quot;Science of Computer Programming&quot;,&quot;container-title-short&quot;:&quot;Sci. Comput. Program.&quot;,&quot;DOI&quot;:&quot;10.1016/0167-6423(87)90035-9&quot;,&quot;ISSN&quot;:&quot;01676423&quot;,&quot;issued&quot;:{&quot;date-parts&quot;:[[1987,6]]},&quot;page&quot;:&quot;231-274&quot;,&quot;issue&quot;:&quot;3&quot;,&quot;volume&quot;:&quot;8&quot;},&quot;isTemporary&quot;:false,&quot;suppress-author&quot;:false,&quot;composite&quot;:false,&quot;author-only&quot;:false}]},{&quot;citationID&quot;:&quot;MENDELEY_CITATION_ed6b1fdf-b40c-4062-b87f-dab6dd956f3f&quot;,&quot;properties&quot;:{&quot;noteIndex&quot;:0},&quot;isEdited&quot;:false,&quot;manualOverride&quot;:{&quot;isManuallyOverridden&quot;:false,&quot;citeprocText&quot;:&quot;[2]&quot;,&quot;manualOverrideText&quot;:&quot;&quot;},&quot;citationTag&quot;:&quot;MENDELEY_CITATION_v3_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&quot;,&quot;citationItems&quot;:[{&quot;id&quot;:&quot;e2b26073-7ef3-371d-af2e-9af8bf0591d2&quot;,&quot;itemData&quot;:{&quot;type&quot;:&quot;book&quot;,&quot;id&quot;:&quot;e2b26073-7ef3-371d-af2e-9af8bf0591d2&quot;,&quot;title&quot;:&quot;Requirements engineering : fundamentals, principles, and techniques&quot;,&quot;author&quot;:[{&quot;family&quot;:&quot;Pohl&quot;,&quot;given&quot;:&quot;Klaus.&quot;,&quot;parse-names&quot;:false,&quot;dropping-particle&quot;:&quot;&quot;,&quot;non-dropping-particle&quot;:&quot;&quot;}],&quot;ISBN&quot;:&quot;9783662692042&quot;,&quot;issued&quot;:{&quot;date-parts&quot;:[[2025]]},&quot;number-of-pages&quot;:&quot;814&quot;,&quot;abstract&quot;:&quot;Second edition.&quot;,&quot;publisher&quot;:&quot;Springer&quot;,&quot;container-title-short&quot;:&quot;&quot;},&quot;isTemporary&quot;:false,&quot;suppress-author&quot;:false,&quot;composite&quot;:false,&quot;author-only&quot;:false}]},{&quot;citationID&quot;:&quot;MENDELEY_CITATION_644e8673-699d-4f9e-8d4c-b0a570936ded&quot;,&quot;properties&quot;:{&quot;noteIndex&quot;:0},&quot;isEdited&quot;:false,&quot;manualOverride&quot;:{&quot;isManuallyOverridden&quot;:false,&quot;citeprocText&quot;:&quot;[7]&quot;,&quot;manualOverrideText&quot;:&quot;&quot;},&quot;citationTag&quot;:&quot;MENDELEY_CITATION_v3_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&quot;,&quot;citationItems&quot;:[{&quot;id&quot;:&quot;b4a67c60-32e8-3898-8c2f-38b6887aa554&quot;,&quot;itemData&quot;:{&quot;type&quot;:&quot;book&quot;,&quot;id&quot;:&quot;b4a67c60-32e8-3898-8c2f-38b6887aa554&quot;,&quot;title&quot;:&quot;SWEBOK Guide v4.0&quot;,&quot;author&quot;:[{&quot;family&quot;:&quot;Washizaki&quot;,&quot;given&quot;:&quot;H&quot;,&quot;parse-names&quot;:false,&quot;dropping-particle&quot;:&quot;&quot;,&quot;non-dropping-particle&quot;:&quot;&quot;}],&quot;editor&quot;:[{&quot;family&quot;:&quot;Washizaki&quot;,&quot;given&quot;:&quot;H&quot;,&quot;parse-names&quot;:false,&quot;dropping-particle&quot;:&quot;&quot;,&quot;non-dropping-particle&quot;:&quot;&quot;}],&quot;URL&quot;:&quot;https://www.computer.org/education/bodies-of-knowledge/software-engineering&quot;,&quot;issued&quot;:{&quot;date-parts&quot;:[[2024]]},&quot;publisher&quot;:&quot;IEEE Computer Society&quot;,&quot;container-title-short&quot;:&quot;&quot;},&quot;isTemporary&quot;:false,&quot;suppress-author&quot;:false,&quot;composite&quot;:false,&quot;author-only&quot;:false}]},{&quot;citationID&quot;:&quot;MENDELEY_CITATION_d31edc80-8222-4953-a1ae-57ac2beb536a&quot;,&quot;properties&quot;:{&quot;noteIndex&quot;:0},&quot;isEdited&quot;:false,&quot;manualOverride&quot;:{&quot;isManuallyOverridden&quot;:false,&quot;citeprocText&quot;:&quot;[1]&quot;,&quot;manualOverrideText&quot;:&quot;&quot;},&quot;citationTag&quot;:&quot;MENDELEY_CITATION_v3_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&quot;,&quot;citationItems&quot;:[{&quot;id&quot;:&quot;8b459ffd-756d-3939-9e41-8c07ad9f20f2&quot;,&quot;itemData&quot;:{&quot;type&quot;:&quot;article&quot;,&quot;id&quot;:&quot;8b459ffd-756d-3939-9e41-8c07ad9f20f2&quot;,&quot;title&quot;:&quot;29148:2018 — Requirements engineering&quot;,&quot;author&quot;:[{&quot;family&quot;:&quot;ISO/IEC/IEEE&quot;,&quot;given&quot;:&quot;&quot;,&quot;parse-names&quot;:false,&quot;dropping-particle&quot;:&quot;&quot;,&quot;non-dropping-particle&quot;:&quot;&quot;}],&quot;DOI&quot;:&quot;10.1109/IEEESTD.2018.8559686&quot;,&quot;ISBN&quot;:&quot;978-1-5044-5302-8&quot;,&quot;issued&quot;:{&quot;date-parts&quot;:[[2018]]},&quot;publisher-place&quot;:&quot;Piscataway, NJ, USA&quot;,&quot;publisher&quot;:&quot;IEEE&quot;,&quot;container-title-short&quot;:&quot;&quot;},&quot;isTemporary&quot;:false,&quot;suppress-author&quot;:false,&quot;composite&quot;:false,&quot;author-only&quot;:false}]},{&quot;citationID&quot;:&quot;MENDELEY_CITATION_250681a3-3a60-40f4-b127-6caf818bc97a&quot;,&quot;properties&quot;:{&quot;noteIndex&quot;:0},&quot;isEdited&quot;:false,&quot;manualOverride&quot;:{&quot;isManuallyOverridden&quot;:false,&quot;citeprocText&quot;:&quot;[1]&quot;,&quot;manualOverrideText&quot;:&quot;&quot;},&quot;citationItems&quot;:[{&quot;id&quot;:&quot;8b459ffd-756d-3939-9e41-8c07ad9f20f2&quot;,&quot;itemData&quot;:{&quot;type&quot;:&quot;article&quot;,&quot;id&quot;:&quot;8b459ffd-756d-3939-9e41-8c07ad9f20f2&quot;,&quot;title&quot;:&quot;29148:2018 — Requirements engineering&quot;,&quot;author&quot;:[{&quot;family&quot;:&quot;ISO/IEC/IEEE&quot;,&quot;given&quot;:&quot;&quot;,&quot;parse-names&quot;:false,&quot;dropping-particle&quot;:&quot;&quot;,&quot;non-dropping-particle&quot;:&quot;&quot;}],&quot;DOI&quot;:&quot;10.1109/IEEESTD.2018.8559686&quot;,&quot;ISBN&quot;:&quot;978-1-5044-5302-8&quot;,&quot;issued&quot;:{&quot;date-parts&quot;:[[2018]]},&quot;publisher-place&quot;:&quot;Piscataway, NJ, USA&quot;,&quot;publisher&quot;:&quot;IEEE&quot;,&quot;container-title-short&quot;:&quot;&quot;},&quot;isTemporary&quot;:false,&quot;suppress-author&quot;:false,&quot;composite&quot;:false,&quot;author-only&quot;:false}],&quot;citationTag&quot;:&quot;MENDELEY_CITATION_v3_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&quot;},{&quot;citationID&quot;:&quot;MENDELEY_CITATION_17dca949-85ed-4402-b25f-3cf863a0a703&quot;,&quot;properties&quot;:{&quot;noteIndex&quot;:0},&quot;isEdited&quot;:false,&quot;manualOverride&quot;:{&quot;isManuallyOverridden&quot;:false,&quot;citeprocText&quot;:&quot;[6]&quot;,&quot;manualOverrideText&quot;:&quot;&quot;},&quot;citationItems&quot;:[{&quot;id&quot;:&quot;9003cc2d-8e1b-3761-9c43-cf67f96021b9&quot;,&quot;itemData&quot;:{&quot;type&quot;:&quot;article&quot;,&quot;id&quot;:&quot;9003cc2d-8e1b-3761-9c43-cf67f96021b9&quot;,&quot;title&quot;:&quot;25010:2023 Systems and software Quality Requirements and Evaluation (SQuaRE) — Product quality model&quot;,&quot;author&quot;:[{&quot;family&quot;:&quot;ISO/IEC&quot;,&quot;given&quot;:&quot;&quot;,&quot;parse-names&quot;:false,&quot;dropping-particle&quot;:&quot;&quot;,&quot;non-dropping-particle&quot;:&quot;&quot;}],&quot;issued&quot;:{&quot;date-parts&quot;:[[2023]]},&quot;issue&quot;:&quot;ISO/IEC 25010:2023&quot;,&quot;container-title-short&quot;:&quot;&quot;},&quot;isTemporary&quot;:false,&quot;suppress-author&quot;:false,&quot;composite&quot;:false,&quot;author-only&quot;:false}],&quot;citationTag&quot;:&quot;MENDELEY_CITATION_v3_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&quot;},{&quot;citationID&quot;:&quot;MENDELEY_CITATION_5da23a8a-031e-4fe2-b3ab-6e6c5413d96c&quot;,&quot;properties&quot;:{&quot;noteIndex&quot;:0},&quot;isEdited&quot;:false,&quot;manualOverride&quot;:{&quot;isManuallyOverridden&quot;:false,&quot;citeprocText&quot;:&quot;[9]&quot;,&quot;manualOverrideText&quot;:&quot;&quot;},&quot;citationItems&quot;:[{&quot;id&quot;:&quot;66151fa6-eac6-3909-b0c3-058dd6c6e5c7&quot;,&quot;itemData&quot;:{&quot;type&quot;:&quot;article&quot;,&quot;id&quot;:&quot;66151fa6-eac6-3909-b0c3-058dd6c6e5c7&quot;,&quot;title&quot;:&quot;CPRE Foundation Level Syllabus v3.1&quot;,&quot;author&quot;:[{&quot;family&quot;:&quot;IREB&quot;,&quot;given&quot;:&quot;&quot;,&quot;parse-names&quot;:false,&quot;dropping-particle&quot;:&quot;&quot;,&quot;non-dropping-particle&quot;:&quot;&quot;}],&quot;URL&quot;:&quot;https://www.ireb.org&quot;,&quot;issued&quot;:{&quot;date-parts&quot;:[[2022]]},&quot;container-title-short&quot;:&quot;&quot;},&quot;isTemporary&quot;:false,&quot;suppress-author&quot;:false,&quot;composite&quot;:false,&quot;author-only&quot;:false}],&quot;citationTag&quot;:&quot;MENDELEY_CITATION_v3_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&quot;},{&quot;citationID&quot;:&quot;MENDELEY_CITATION_964cdbf3-f385-479b-a32b-7221f85b390b&quot;,&quot;properties&quot;:{&quot;noteIndex&quot;:0},&quot;isEdited&quot;:false,&quot;manualOverride&quot;:{&quot;isManuallyOverridden&quot;:false,&quot;citeprocText&quot;:&quot;[9]&quot;,&quot;manualOverrideText&quot;:&quot;&quot;},&quot;citationItems&quot;:[{&quot;id&quot;:&quot;66151fa6-eac6-3909-b0c3-058dd6c6e5c7&quot;,&quot;itemData&quot;:{&quot;type&quot;:&quot;article&quot;,&quot;id&quot;:&quot;66151fa6-eac6-3909-b0c3-058dd6c6e5c7&quot;,&quot;title&quot;:&quot;CPRE Foundation Level Syllabus v3.1&quot;,&quot;author&quot;:[{&quot;family&quot;:&quot;IREB&quot;,&quot;given&quot;:&quot;&quot;,&quot;parse-names&quot;:false,&quot;dropping-particle&quot;:&quot;&quot;,&quot;non-dropping-particle&quot;:&quot;&quot;}],&quot;URL&quot;:&quot;https://www.ireb.org&quot;,&quot;issued&quot;:{&quot;date-parts&quot;:[[2022]]},&quot;container-title-short&quot;:&quot;&quot;},&quot;isTemporary&quot;:false,&quot;suppress-author&quot;:false,&quot;composite&quot;:false,&quot;author-only&quot;:false}],&quot;citationTag&quot;:&quot;MENDELEY_CITATION_v3_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&quot;},{&quot;citationID&quot;:&quot;MENDELEY_CITATION_af7eb058-ebb9-492f-9541-07ba14a26a5e&quot;,&quot;properties&quot;:{&quot;noteIndex&quot;:0},&quot;isEdited&quot;:false,&quot;manualOverride&quot;:{&quot;isManuallyOverridden&quot;:false,&quot;citeprocText&quot;:&quot;[6]&quot;,&quot;manualOverrideText&quot;:&quot;&quot;},&quot;citationItems&quot;:[{&quot;id&quot;:&quot;9003cc2d-8e1b-3761-9c43-cf67f96021b9&quot;,&quot;itemData&quot;:{&quot;type&quot;:&quot;article&quot;,&quot;id&quot;:&quot;9003cc2d-8e1b-3761-9c43-cf67f96021b9&quot;,&quot;title&quot;:&quot;25010:2023 Systems and software Quality Requirements and Evaluation (SQuaRE) — Product quality model&quot;,&quot;author&quot;:[{&quot;family&quot;:&quot;ISO/IEC&quot;,&quot;given&quot;:&quot;&quot;,&quot;parse-names&quot;:false,&quot;dropping-particle&quot;:&quot;&quot;,&quot;non-dropping-particle&quot;:&quot;&quot;}],&quot;issued&quot;:{&quot;date-parts&quot;:[[2023]]},&quot;issue&quot;:&quot;ISO/IEC 25010:2023&quot;,&quot;container-title-short&quot;:&quot;&quot;},&quot;isTemporary&quot;:false,&quot;suppress-author&quot;:false,&quot;composite&quot;:false,&quot;author-only&quot;:false}],&quot;citationTag&quot;:&quot;MENDELEY_CITATION_v3_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&quot;},{&quot;citationID&quot;:&quot;MENDELEY_CITATION_b4a97bcc-b593-415a-a75b-9e911f653053&quot;,&quot;properties&quot;:{&quot;noteIndex&quot;:0},&quot;isEdited&quot;:false,&quot;manualOverride&quot;:{&quot;isManuallyOverridden&quot;:false,&quot;citeprocText&quot;:&quot;[1]&quot;,&quot;manualOverrideText&quot;:&quot;&quot;},&quot;citationItems&quot;:[{&quot;id&quot;:&quot;8b459ffd-756d-3939-9e41-8c07ad9f20f2&quot;,&quot;itemData&quot;:{&quot;type&quot;:&quot;article&quot;,&quot;id&quot;:&quot;8b459ffd-756d-3939-9e41-8c07ad9f20f2&quot;,&quot;title&quot;:&quot;29148:2018 — Requirements engineering&quot;,&quot;author&quot;:[{&quot;family&quot;:&quot;ISO/IEC/IEEE&quot;,&quot;given&quot;:&quot;&quot;,&quot;parse-names&quot;:false,&quot;dropping-particle&quot;:&quot;&quot;,&quot;non-dropping-particle&quot;:&quot;&quot;}],&quot;DOI&quot;:&quot;10.1109/IEEESTD.2018.8559686&quot;,&quot;ISBN&quot;:&quot;978-1-5044-5302-8&quot;,&quot;issued&quot;:{&quot;date-parts&quot;:[[2018]]},&quot;publisher-place&quot;:&quot;Piscataway, NJ, USA&quot;,&quot;publisher&quot;:&quot;IEEE&quot;,&quot;container-title-short&quot;:&quot;&quot;},&quot;isTemporary&quot;:false,&quot;suppress-author&quot;:false,&quot;composite&quot;:false,&quot;author-only&quot;:false}],&quot;citationTag&quot;:&quot;MENDELEY_CITATION_v3_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&quot;},{&quot;citationID&quot;:&quot;MENDELEY_CITATION_0c4b0fa0-c84e-41e5-b6d5-397ca69593e6&quot;,&quot;properties&quot;:{&quot;noteIndex&quot;:0},&quot;isEdited&quot;:false,&quot;manualOverride&quot;:{&quot;isManuallyOverridden&quot;:false,&quot;citeprocText&quot;:&quot;[6]&quot;,&quot;manualOverrideText&quot;:&quot;&quot;},&quot;citationItems&quot;:[{&quot;id&quot;:&quot;9003cc2d-8e1b-3761-9c43-cf67f96021b9&quot;,&quot;itemData&quot;:{&quot;type&quot;:&quot;article&quot;,&quot;id&quot;:&quot;9003cc2d-8e1b-3761-9c43-cf67f96021b9&quot;,&quot;title&quot;:&quot;25010:2023 Systems and software Quality Requirements and Evaluation (SQuaRE) — Product quality model&quot;,&quot;author&quot;:[{&quot;family&quot;:&quot;ISO/IEC&quot;,&quot;given&quot;:&quot;&quot;,&quot;parse-names&quot;:false,&quot;dropping-particle&quot;:&quot;&quot;,&quot;non-dropping-particle&quot;:&quot;&quot;}],&quot;issued&quot;:{&quot;date-parts&quot;:[[2023]]},&quot;issue&quot;:&quot;ISO/IEC 25010:2023&quot;,&quot;container-title-short&quot;:&quot;&quot;},&quot;isTemporary&quot;:false,&quot;suppress-author&quot;:false,&quot;composite&quot;:false,&quot;author-only&quot;:false}],&quot;citationTag&quot;:&quot;MENDELEY_CITATION_v3_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&quot;},{&quot;citationID&quot;:&quot;MENDELEY_CITATION_f3b2d815-8406-48c9-94c2-bc778c3df9a2&quot;,&quot;properties&quot;:{&quot;noteIndex&quot;:0},&quot;isEdited&quot;:false,&quot;manualOverride&quot;:{&quot;isManuallyOverridden&quot;:false,&quot;citeprocText&quot;:&quot;[9]&quot;,&quot;manualOverrideText&quot;:&quot;&quot;},&quot;citationItems&quot;:[{&quot;id&quot;:&quot;66151fa6-eac6-3909-b0c3-058dd6c6e5c7&quot;,&quot;itemData&quot;:{&quot;type&quot;:&quot;article&quot;,&quot;id&quot;:&quot;66151fa6-eac6-3909-b0c3-058dd6c6e5c7&quot;,&quot;title&quot;:&quot;CPRE Foundation Level Syllabus v3.1&quot;,&quot;author&quot;:[{&quot;family&quot;:&quot;IREB&quot;,&quot;given&quot;:&quot;&quot;,&quot;parse-names&quot;:false,&quot;dropping-particle&quot;:&quot;&quot;,&quot;non-dropping-particle&quot;:&quot;&quot;}],&quot;URL&quot;:&quot;https://www.ireb.org&quot;,&quot;issued&quot;:{&quot;date-parts&quot;:[[2022]]},&quot;container-title-short&quot;:&quot;&quot;},&quot;isTemporary&quot;:false,&quot;suppress-author&quot;:false,&quot;composite&quot;:false,&quot;author-only&quot;:false}],&quot;citationTag&quot;:&quot;MENDELEY_CITATION_v3_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&quot;},{&quot;citationID&quot;:&quot;MENDELEY_CITATION_5c6a4b38-facc-472a-8cf1-33668bb9a349&quot;,&quot;properties&quot;:{&quot;noteIndex&quot;:0},&quot;isEdited&quot;:false,&quot;manualOverride&quot;:{&quot;isManuallyOverridden&quot;:false,&quot;citeprocText&quot;:&quot;[6]&quot;,&quot;manualOverrideText&quot;:&quot;&quot;},&quot;citationItems&quot;:[{&quot;id&quot;:&quot;9003cc2d-8e1b-3761-9c43-cf67f96021b9&quot;,&quot;itemData&quot;:{&quot;type&quot;:&quot;article&quot;,&quot;id&quot;:&quot;9003cc2d-8e1b-3761-9c43-cf67f96021b9&quot;,&quot;title&quot;:&quot;25010:2023 Systems and software Quality Requirements and Evaluation (SQuaRE) — Product quality model&quot;,&quot;author&quot;:[{&quot;family&quot;:&quot;ISO/IEC&quot;,&quot;given&quot;:&quot;&quot;,&quot;parse-names&quot;:false,&quot;dropping-particle&quot;:&quot;&quot;,&quot;non-dropping-particle&quot;:&quot;&quot;}],&quot;issued&quot;:{&quot;date-parts&quot;:[[2023]]},&quot;issue&quot;:&quot;ISO/IEC 25010:2023&quot;,&quot;container-title-short&quot;:&quot;&quot;},&quot;isTemporary&quot;:false,&quot;suppress-author&quot;:false,&quot;composite&quot;:false,&quot;author-only&quot;:false}],&quot;citationTag&quot;:&quot;MENDELEY_CITATION_v3_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&quot;},{&quot;citationID&quot;:&quot;MENDELEY_CITATION_275202db-54da-4b6b-930d-bb2e03a406a9&quot;,&quot;properties&quot;:{&quot;noteIndex&quot;:0},&quot;isEdited&quot;:false,&quot;manualOverride&quot;:{&quot;isManuallyOverridden&quot;:false,&quot;citeprocText&quot;:&quot;[11]&quot;,&quot;manualOverrideText&quot;:&quot;&quot;},&quot;citationItems&quot;:[{&quot;id&quot;:&quot;53bf9615-9f05-3888-82f8-ecd3ad0cd90a&quot;,&quot;itemData&quot;:{&quot;type&quot;:&quot;book&quot;,&quot;id&quot;:&quot;53bf9615-9f05-3888-82f8-ecd3ad0cd90a&quot;,&quot;title&quot;:&quot;Requirements Engineering&quot;,&quot;author&quot;:[{&quot;family&quot;:&quot;Hull&quot;,&quot;given&quot;:&quot;Elizabeth&quot;,&quot;parse-names&quot;:false,&quot;dropping-particle&quot;:&quot;&quot;,&quot;non-dropping-particle&quot;:&quot;&quot;},{&quot;family&quot;:&quot;Jackson&quot;,&quot;given&quot;:&quot;Ken&quot;,&quot;parse-names&quot;:false,&quot;dropping-particle&quot;:&quot;&quot;,&quot;non-dropping-particle&quot;:&quot;&quot;},{&quot;family&quot;:&quot;Dick&quot;,&quot;given&quot;:&quot;Jeremy&quot;,&quot;parse-names&quot;:false,&quot;dropping-particle&quot;:&quot;&quot;,&quot;non-dropping-particle&quot;:&quot;&quot;}],&quot;DOI&quot;:&quot;10.1007/978-1-84996-405-0&quot;,&quot;ISBN&quot;:&quot;978-1-84996-404-3&quot;,&quot;issued&quot;:{&quot;date-parts&quot;:[[2011]]},&quot;publisher-place&quot;:&quot;London&quot;,&quot;publisher&quot;:&quot;Springer London&quot;,&quot;container-title-short&quot;:&quot;&quot;},&quot;isTemporary&quot;:false,&quot;suppress-author&quot;:false,&quot;composite&quot;:false,&quot;author-only&quot;:false}],&quot;citationTag&quot;:&quot;MENDELEY_CITATION_v3_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&quot;},{&quot;citationID&quot;:&quot;MENDELEY_CITATION_ea197790-0cb8-4b6d-98dd-f5b3d7671533&quot;,&quot;properties&quot;:{&quot;noteIndex&quot;:0},&quot;isEdited&quot;:false,&quot;manualOverride&quot;:{&quot;isManuallyOverridden&quot;:false,&quot;citeprocText&quot;:&quot;[1]&quot;,&quot;manualOverrideText&quot;:&quot;&quot;},&quot;citationItems&quot;:[{&quot;id&quot;:&quot;8b459ffd-756d-3939-9e41-8c07ad9f20f2&quot;,&quot;itemData&quot;:{&quot;type&quot;:&quot;article&quot;,&quot;id&quot;:&quot;8b459ffd-756d-3939-9e41-8c07ad9f20f2&quot;,&quot;title&quot;:&quot;29148:2018 — Requirements engineering&quot;,&quot;author&quot;:[{&quot;family&quot;:&quot;ISO/IEC/IEEE&quot;,&quot;given&quot;:&quot;&quot;,&quot;parse-names&quot;:false,&quot;dropping-particle&quot;:&quot;&quot;,&quot;non-dropping-particle&quot;:&quot;&quot;}],&quot;DOI&quot;:&quot;10.1109/IEEESTD.2018.8559686&quot;,&quot;ISBN&quot;:&quot;978-1-5044-5302-8&quot;,&quot;issued&quot;:{&quot;date-parts&quot;:[[2018]]},&quot;publisher-place&quot;:&quot;Piscataway, NJ, USA&quot;,&quot;publisher&quot;:&quot;IEEE&quot;,&quot;container-title-short&quot;:&quot;&quot;},&quot;isTemporary&quot;:false,&quot;suppress-author&quot;:false,&quot;composite&quot;:false,&quot;author-only&quot;:false}],&quot;citationTag&quot;:&quot;MENDELEY_CITATION_v3_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&quot;},{&quot;citationID&quot;:&quot;MENDELEY_CITATION_e6d93d5a-3291-458b-b4ef-baa9bfe0a007&quot;,&quot;properties&quot;:{&quot;noteIndex&quot;:0},&quot;isEdited&quot;:false,&quot;manualOverride&quot;:{&quot;isManuallyOverridden&quot;:false,&quot;citeprocText&quot;:&quot;[13]&quot;,&quot;manualOverrideText&quot;:&quot;&quot;},&quot;citationItems&quot;:[{&quot;id&quot;:&quot;db86bc13-b5b2-3da2-8b6b-b765f7df50dd&quot;,&quot;itemData&quot;:{&quot;type&quot;:&quot;article-journal&quot;,&quot;id&quot;:&quot;db86bc13-b5b2-3da2-8b6b-b765f7df50dd&quot;,&quot;title&quot;:&quot;Statecharts: a visual formalism for complex systems&quot;,&quot;author&quot;:[{&quot;family&quot;:&quot;Harel&quot;,&quot;given&quot;:&quot;David&quot;,&quot;parse-names&quot;:false,&quot;dropping-particle&quot;:&quot;&quot;,&quot;non-dropping-particle&quot;:&quot;&quot;}],&quot;container-title&quot;:&quot;Science of Computer Programming&quot;,&quot;container-title-short&quot;:&quot;Sci. Comput. Program.&quot;,&quot;DOI&quot;:&quot;10.1016/0167-6423(87)90035-9&quot;,&quot;ISSN&quot;:&quot;01676423&quot;,&quot;issued&quot;:{&quot;date-parts&quot;:[[1987,6]]},&quot;page&quot;:&quot;231-274&quot;,&quot;issue&quot;:&quot;3&quot;,&quot;volume&quot;:&quot;8&quot;},&quot;isTemporary&quot;:false,&quot;suppress-author&quot;:false,&quot;composite&quot;:false,&quot;author-only&quot;:false}],&quot;citationTag&quot;:&quot;MENDELEY_CITATION_v3_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&quot;},{&quot;citationID&quot;:&quot;MENDELEY_CITATION_276e05fa-5c2f-4517-8641-6384f570a87e&quot;,&quot;properties&quot;:{&quot;noteIndex&quot;:0},&quot;isEdited&quot;:false,&quot;manualOverride&quot;:{&quot;isManuallyOverridden&quot;:false,&quot;citeprocText&quot;:&quot;[13]&quot;,&quot;manualOverrideText&quot;:&quot;&quot;},&quot;citationItems&quot;:[{&quot;id&quot;:&quot;db86bc13-b5b2-3da2-8b6b-b765f7df50dd&quot;,&quot;itemData&quot;:{&quot;type&quot;:&quot;article-journal&quot;,&quot;id&quot;:&quot;db86bc13-b5b2-3da2-8b6b-b765f7df50dd&quot;,&quot;title&quot;:&quot;Statecharts: a visual formalism for complex systems&quot;,&quot;author&quot;:[{&quot;family&quot;:&quot;Harel&quot;,&quot;given&quot;:&quot;David&quot;,&quot;parse-names&quot;:false,&quot;dropping-particle&quot;:&quot;&quot;,&quot;non-dropping-particle&quot;:&quot;&quot;}],&quot;container-title&quot;:&quot;Science of Computer Programming&quot;,&quot;container-title-short&quot;:&quot;Sci. Comput. Program.&quot;,&quot;DOI&quot;:&quot;10.1016/0167-6423(87)90035-9&quot;,&quot;ISSN&quot;:&quot;01676423&quot;,&quot;issued&quot;:{&quot;date-parts&quot;:[[1987,6]]},&quot;page&quot;:&quot;231-274&quot;,&quot;issue&quot;:&quot;3&quot;,&quot;volume&quot;:&quot;8&quot;},&quot;isTemporary&quot;:false,&quot;suppress-author&quot;:false,&quot;composite&quot;:false,&quot;author-only&quot;:false}],&quot;citationTag&quot;:&quot;MENDELEY_CITATION_v3_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&quot;},{&quot;citationID&quot;:&quot;MENDELEY_CITATION_31e3516a-4fbb-4bb7-8498-d0e80d1d9069&quot;,&quot;properties&quot;:{&quot;noteIndex&quot;:0},&quot;isEdited&quot;:false,&quot;manualOverride&quot;:{&quot;isManuallyOverridden&quot;:false,&quot;citeprocText&quot;:&quot;[2]&quot;,&quot;manualOverrideText&quot;:&quot;&quot;},&quot;citationItems&quot;:[{&quot;id&quot;:&quot;e2b26073-7ef3-371d-af2e-9af8bf0591d2&quot;,&quot;itemData&quot;:{&quot;type&quot;:&quot;book&quot;,&quot;id&quot;:&quot;e2b26073-7ef3-371d-af2e-9af8bf0591d2&quot;,&quot;title&quot;:&quot;Requirements engineering : fundamentals, principles, and techniques&quot;,&quot;author&quot;:[{&quot;family&quot;:&quot;Pohl&quot;,&quot;given&quot;:&quot;Klaus.&quot;,&quot;parse-names&quot;:false,&quot;dropping-particle&quot;:&quot;&quot;,&quot;non-dropping-particle&quot;:&quot;&quot;}],&quot;ISBN&quot;:&quot;9783662692042&quot;,&quot;issued&quot;:{&quot;date-parts&quot;:[[2025]]},&quot;number-of-pages&quot;:&quot;814&quot;,&quot;abstract&quot;:&quot;Second edition.&quot;,&quot;publisher&quot;:&quot;Springer&quot;,&quot;container-title-short&quot;:&quot;&quot;},&quot;isTemporary&quot;:false,&quot;suppress-author&quot;:false,&quot;composite&quot;:false,&quot;author-only&quot;:false}],&quot;citationTag&quot;:&quot;MENDELEY_CITATION_v3_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&quot;},{&quot;citationID&quot;:&quot;MENDELEY_CITATION_d870b60a-d020-466c-b5f3-151b0f23703a&quot;,&quot;properties&quot;:{&quot;noteIndex&quot;:0},&quot;isEdited&quot;:false,&quot;manualOverride&quot;:{&quot;isManuallyOverridden&quot;:false,&quot;citeprocText&quot;:&quot;[2]&quot;,&quot;manualOverrideText&quot;:&quot;&quot;},&quot;citationTag&quot;:&quot;MENDELEY_CITATION_v3_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&quot;,&quot;citationItems&quot;:[{&quot;id&quot;:&quot;e2b26073-7ef3-371d-af2e-9af8bf0591d2&quot;,&quot;itemData&quot;:{&quot;type&quot;:&quot;book&quot;,&quot;id&quot;:&quot;e2b26073-7ef3-371d-af2e-9af8bf0591d2&quot;,&quot;title&quot;:&quot;Requirements engineering : fundamentals, principles, and techniques&quot;,&quot;author&quot;:[{&quot;family&quot;:&quot;Pohl&quot;,&quot;given&quot;:&quot;Klaus.&quot;,&quot;parse-names&quot;:false,&quot;dropping-particle&quot;:&quot;&quot;,&quot;non-dropping-particle&quot;:&quot;&quot;}],&quot;ISBN&quot;:&quot;9783662692042&quot;,&quot;issued&quot;:{&quot;date-parts&quot;:[[2025]]},&quot;number-of-pages&quot;:&quot;814&quot;,&quot;abstract&quot;:&quot;Second edition.&quot;,&quot;publisher&quot;:&quot;Springer&quot;,&quot;container-title-short&quot;:&quot;&quot;},&quot;isTemporary&quot;:false,&quot;suppress-author&quot;:false,&quot;composite&quot;:false,&quot;author-only&quot;:false}]},{&quot;citationID&quot;:&quot;MENDELEY_CITATION_2d303c17-2d5d-4aaa-90d3-d52b2eb0a732&quot;,&quot;properties&quot;:{&quot;noteIndex&quot;:0},&quot;isEdited&quot;:false,&quot;manualOverride&quot;:{&quot;isManuallyOverridden&quot;:false,&quot;citeprocText&quot;:&quot;[1]&quot;,&quot;manualOverrideText&quot;:&quot;&quot;},&quot;citationTag&quot;:&quot;MENDELEY_CITATION_v3_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&quot;,&quot;citationItems&quot;:[{&quot;id&quot;:&quot;8b459ffd-756d-3939-9e41-8c07ad9f20f2&quot;,&quot;itemData&quot;:{&quot;type&quot;:&quot;article&quot;,&quot;id&quot;:&quot;8b459ffd-756d-3939-9e41-8c07ad9f20f2&quot;,&quot;title&quot;:&quot;29148:2018 — Requirements engineering&quot;,&quot;author&quot;:[{&quot;family&quot;:&quot;ISO/IEC/IEEE&quot;,&quot;given&quot;:&quot;&quot;,&quot;parse-names&quot;:false,&quot;dropping-particle&quot;:&quot;&quot;,&quot;non-dropping-particle&quot;:&quot;&quot;}],&quot;DOI&quot;:&quot;10.1109/IEEESTD.2018.8559686&quot;,&quot;ISBN&quot;:&quot;978-1-5044-5302-8&quot;,&quot;issued&quot;:{&quot;date-parts&quot;:[[2018]]},&quot;publisher-place&quot;:&quot;Piscataway, NJ, USA&quot;,&quot;publisher&quot;:&quot;IEEE&quot;,&quot;container-title-short&quot;:&quot;&quot;},&quot;isTemporary&quot;:false,&quot;suppress-author&quot;:false,&quot;composite&quot;:false,&quot;author-only&quot;:false}]},{&quot;citationID&quot;:&quot;MENDELEY_CITATION_f28f9ceb-f4fe-4a0d-83e0-7e129248ec7f&quot;,&quot;properties&quot;:{&quot;noteIndex&quot;:0},&quot;isEdited&quot;:false,&quot;manualOverride&quot;:{&quot;isManuallyOverridden&quot;:false,&quot;citeprocText&quot;:&quot;[13]&quot;,&quot;manualOverrideText&quot;:&quot;&quot;},&quot;citationTag&quot;:&quot;MENDELEY_CITATION_v3_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&quot;,&quot;citationItems&quot;:[{&quot;id&quot;:&quot;db86bc13-b5b2-3da2-8b6b-b765f7df50dd&quot;,&quot;itemData&quot;:{&quot;type&quot;:&quot;article-journal&quot;,&quot;id&quot;:&quot;db86bc13-b5b2-3da2-8b6b-b765f7df50dd&quot;,&quot;title&quot;:&quot;Statecharts: a visual formalism for complex systems&quot;,&quot;author&quot;:[{&quot;family&quot;:&quot;Harel&quot;,&quot;given&quot;:&quot;David&quot;,&quot;parse-names&quot;:false,&quot;dropping-particle&quot;:&quot;&quot;,&quot;non-dropping-particle&quot;:&quot;&quot;}],&quot;container-title&quot;:&quot;Science of Computer Programming&quot;,&quot;container-title-short&quot;:&quot;Sci. Comput. Program.&quot;,&quot;DOI&quot;:&quot;10.1016/0167-6423(87)90035-9&quot;,&quot;ISSN&quot;:&quot;01676423&quot;,&quot;issued&quot;:{&quot;date-parts&quot;:[[1987,6]]},&quot;page&quot;:&quot;231-274&quot;,&quot;issue&quot;:&quot;3&quot;,&quot;volume&quot;:&quot;8&quot;},&quot;isTemporary&quot;:false,&quot;suppress-author&quot;:false,&quot;composite&quot;:false,&quot;author-only&quot;:false}]},{&quot;citationID&quot;:&quot;MENDELEY_CITATION_260c2393-61d8-45d2-bd64-1c11a604406d&quot;,&quot;properties&quot;:{&quot;noteIndex&quot;:0},&quot;isEdited&quot;:false,&quot;manualOverride&quot;:{&quot;isManuallyOverridden&quot;:false,&quot;citeprocText&quot;:&quot;[7]&quot;,&quot;manualOverrideText&quot;:&quot;&quot;},&quot;citationTag&quot;:&quot;MENDELEY_CITATION_v3_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&quot;,&quot;citationItems&quot;:[{&quot;id&quot;:&quot;b4a67c60-32e8-3898-8c2f-38b6887aa554&quot;,&quot;itemData&quot;:{&quot;type&quot;:&quot;book&quot;,&quot;id&quot;:&quot;b4a67c60-32e8-3898-8c2f-38b6887aa554&quot;,&quot;title&quot;:&quot;SWEBOK Guide v4.0&quot;,&quot;author&quot;:[{&quot;family&quot;:&quot;Washizaki&quot;,&quot;given&quot;:&quot;H&quot;,&quot;parse-names&quot;:false,&quot;dropping-particle&quot;:&quot;&quot;,&quot;non-dropping-particle&quot;:&quot;&quot;}],&quot;editor&quot;:[{&quot;family&quot;:&quot;Washizaki&quot;,&quot;given&quot;:&quot;H&quot;,&quot;parse-names&quot;:false,&quot;dropping-particle&quot;:&quot;&quot;,&quot;non-dropping-particle&quot;:&quot;&quot;}],&quot;URL&quot;:&quot;https://www.computer.org/education/bodies-of-knowledge/software-engineering&quot;,&quot;issued&quot;:{&quot;date-parts&quot;:[[2024]]},&quot;publisher&quot;:&quot;IEEE Computer Society&quot;,&quot;container-title-short&quot;:&quot;&quot;},&quot;isTemporary&quot;:false,&quot;suppress-author&quot;:false,&quot;composite&quot;:false,&quot;author-only&quot;:false}]},{&quot;citationID&quot;:&quot;MENDELEY_CITATION_b324f80c-b66e-4185-ba58-f884a610d39c&quot;,&quot;properties&quot;:{&quot;noteIndex&quot;:0},&quot;isEdited&quot;:false,&quot;manualOverride&quot;:{&quot;isManuallyOverridden&quot;:false,&quot;citeprocText&quot;:&quot;[6]&quot;,&quot;manualOverrideText&quot;:&quot;&quot;},&quot;citationTag&quot;:&quot;MENDELEY_CITATION_v3_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&quot;,&quot;citationItems&quot;:[{&quot;id&quot;:&quot;9003cc2d-8e1b-3761-9c43-cf67f96021b9&quot;,&quot;itemData&quot;:{&quot;type&quot;:&quot;article&quot;,&quot;id&quot;:&quot;9003cc2d-8e1b-3761-9c43-cf67f96021b9&quot;,&quot;title&quot;:&quot;25010:2023 Systems and software Quality Requirements and Evaluation (SQuaRE) — Product quality model&quot;,&quot;author&quot;:[{&quot;family&quot;:&quot;ISO/IEC&quot;,&quot;given&quot;:&quot;&quot;,&quot;parse-names&quot;:false,&quot;dropping-particle&quot;:&quot;&quot;,&quot;non-dropping-particle&quot;:&quot;&quot;}],&quot;issued&quot;:{&quot;date-parts&quot;:[[2023]]},&quot;issue&quot;:&quot;ISO/IEC 25010:2023&quot;,&quot;container-title-short&quot;:&quot;&quot;},&quot;isTemporary&quot;:false,&quot;suppress-author&quot;:false,&quot;composite&quot;:false,&quot;author-only&quot;:false}]},{&quot;citationID&quot;:&quot;MENDELEY_CITATION_5b2b5e24-97c3-4a54-b0fe-1eaf620d3e38&quot;,&quot;properties&quot;:{&quot;noteIndex&quot;:0},&quot;isEdited&quot;:false,&quot;manualOverride&quot;:{&quot;isManuallyOverridden&quot;:false,&quot;citeprocText&quot;:&quot;[9]&quot;,&quot;manualOverrideText&quot;:&quot;&quot;},&quot;citationItems&quot;:[{&quot;id&quot;:&quot;66151fa6-eac6-3909-b0c3-058dd6c6e5c7&quot;,&quot;itemData&quot;:{&quot;type&quot;:&quot;article&quot;,&quot;id&quot;:&quot;66151fa6-eac6-3909-b0c3-058dd6c6e5c7&quot;,&quot;title&quot;:&quot;CPRE Foundation Level Syllabus v3.1&quot;,&quot;author&quot;:[{&quot;family&quot;:&quot;IREB&quot;,&quot;given&quot;:&quot;&quot;,&quot;parse-names&quot;:false,&quot;dropping-particle&quot;:&quot;&quot;,&quot;non-dropping-particle&quot;:&quot;&quot;}],&quot;URL&quot;:&quot;https://www.ireb.org&quot;,&quot;issued&quot;:{&quot;date-parts&quot;:[[2022]]},&quot;container-title-short&quot;:&quot;&quot;},&quot;isTemporary&quot;:false,&quot;suppress-author&quot;:false,&quot;composite&quot;:false,&quot;author-only&quot;:false}],&quot;citationTag&quot;:&quot;MENDELEY_CITATION_v3_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&quot;},{&quot;citationID&quot;:&quot;MENDELEY_CITATION_1a580333-17ef-4077-83fa-73911b8e11af&quot;,&quot;properties&quot;:{&quot;noteIndex&quot;:0},&quot;isEdited&quot;:false,&quot;manualOverride&quot;:{&quot;isManuallyOverridden&quot;:false,&quot;citeprocText&quot;:&quot;[6]&quot;,&quot;manualOverrideText&quot;:&quot;&quot;},&quot;citationItems&quot;:[{&quot;id&quot;:&quot;9003cc2d-8e1b-3761-9c43-cf67f96021b9&quot;,&quot;itemData&quot;:{&quot;type&quot;:&quot;article&quot;,&quot;id&quot;:&quot;9003cc2d-8e1b-3761-9c43-cf67f96021b9&quot;,&quot;title&quot;:&quot;25010:2023 Systems and software Quality Requirements and Evaluation (SQuaRE) — Product quality model&quot;,&quot;author&quot;:[{&quot;family&quot;:&quot;ISO/IEC&quot;,&quot;given&quot;:&quot;&quot;,&quot;parse-names&quot;:false,&quot;dropping-particle&quot;:&quot;&quot;,&quot;non-dropping-particle&quot;:&quot;&quot;}],&quot;issued&quot;:{&quot;date-parts&quot;:[[2023]]},&quot;issue&quot;:&quot;ISO/IEC 25010:2023&quot;,&quot;container-title-short&quot;:&quot;&quot;},&quot;isTemporary&quot;:false,&quot;suppress-author&quot;:false,&quot;composite&quot;:false,&quot;author-only&quot;:false}],&quot;citationTag&quot;:&quot;MENDELEY_CITATION_v3_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&quot;},{&quot;citationID&quot;:&quot;MENDELEY_CITATION_ef237b22-674b-4880-b4f1-247018e29a9f&quot;,&quot;properties&quot;:{&quot;noteIndex&quot;:0},&quot;isEdited&quot;:false,&quot;manualOverride&quot;:{&quot;isManuallyOverridden&quot;:false,&quot;citeprocText&quot;:&quot;[1]&quot;,&quot;manualOverrideText&quot;:&quot;&quot;},&quot;citationItems&quot;:[{&quot;id&quot;:&quot;8b459ffd-756d-3939-9e41-8c07ad9f20f2&quot;,&quot;itemData&quot;:{&quot;type&quot;:&quot;article&quot;,&quot;id&quot;:&quot;8b459ffd-756d-3939-9e41-8c07ad9f20f2&quot;,&quot;title&quot;:&quot;29148:2018 — Requirements engineering&quot;,&quot;author&quot;:[{&quot;family&quot;:&quot;ISO/IEC/IEEE&quot;,&quot;given&quot;:&quot;&quot;,&quot;parse-names&quot;:false,&quot;dropping-particle&quot;:&quot;&quot;,&quot;non-dropping-particle&quot;:&quot;&quot;}],&quot;DOI&quot;:&quot;10.1109/IEEESTD.2018.8559686&quot;,&quot;ISBN&quot;:&quot;978-1-5044-5302-8&quot;,&quot;issued&quot;:{&quot;date-parts&quot;:[[2018]]},&quot;publisher-place&quot;:&quot;Piscataway, NJ, USA&quot;,&quot;publisher&quot;:&quot;IEEE&quot;,&quot;container-title-short&quot;:&quot;&quot;},&quot;isTemporary&quot;:false,&quot;suppress-author&quot;:false,&quot;composite&quot;:false,&quot;author-only&quot;:false}],&quot;citationTag&quot;:&quot;MENDELEY_CITATION_v3_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&quot;},{&quot;citationID&quot;:&quot;MENDELEY_CITATION_c7de4e5e-b700-40fb-bb3f-dbe97a7f1a5d&quot;,&quot;properties&quot;:{&quot;noteIndex&quot;:0},&quot;isEdited&quot;:false,&quot;manualOverride&quot;:{&quot;isManuallyOverridden&quot;:false,&quot;citeprocText&quot;:&quot;[6]&quot;,&quot;manualOverrideText&quot;:&quot;&quot;},&quot;citationItems&quot;:[{&quot;id&quot;:&quot;9003cc2d-8e1b-3761-9c43-cf67f96021b9&quot;,&quot;itemData&quot;:{&quot;type&quot;:&quot;article&quot;,&quot;id&quot;:&quot;9003cc2d-8e1b-3761-9c43-cf67f96021b9&quot;,&quot;title&quot;:&quot;25010:2023 Systems and software Quality Requirements and Evaluation (SQuaRE) — Product quality model&quot;,&quot;author&quot;:[{&quot;family&quot;:&quot;ISO/IEC&quot;,&quot;given&quot;:&quot;&quot;,&quot;parse-names&quot;:false,&quot;dropping-particle&quot;:&quot;&quot;,&quot;non-dropping-particle&quot;:&quot;&quot;}],&quot;issued&quot;:{&quot;date-parts&quot;:[[2023]]},&quot;issue&quot;:&quot;ISO/IEC 25010:2023&quot;,&quot;container-title-short&quot;:&quot;&quot;},&quot;isTemporary&quot;:false,&quot;suppress-author&quot;:false,&quot;composite&quot;:false,&quot;author-only&quot;:false}],&quot;citationTag&quot;:&quot;MENDELEY_CITATION_v3_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&quot;},{&quot;citationID&quot;:&quot;MENDELEY_CITATION_404b60ad-688e-422d-a7de-a93171e0338d&quot;,&quot;properties&quot;:{&quot;noteIndex&quot;:0},&quot;isEdited&quot;:false,&quot;manualOverride&quot;:{&quot;isManuallyOverridden&quot;:false,&quot;citeprocText&quot;:&quot;[9]&quot;,&quot;manualOverrideText&quot;:&quot;&quot;},&quot;citationItems&quot;:[{&quot;id&quot;:&quot;66151fa6-eac6-3909-b0c3-058dd6c6e5c7&quot;,&quot;itemData&quot;:{&quot;type&quot;:&quot;article&quot;,&quot;id&quot;:&quot;66151fa6-eac6-3909-b0c3-058dd6c6e5c7&quot;,&quot;title&quot;:&quot;CPRE Foundation Level Syllabus v3.1&quot;,&quot;author&quot;:[{&quot;family&quot;:&quot;IREB&quot;,&quot;given&quot;:&quot;&quot;,&quot;parse-names&quot;:false,&quot;dropping-particle&quot;:&quot;&quot;,&quot;non-dropping-particle&quot;:&quot;&quot;}],&quot;URL&quot;:&quot;https://www.ireb.org&quot;,&quot;issued&quot;:{&quot;date-parts&quot;:[[2022]]},&quot;container-title-short&quot;:&quot;&quot;},&quot;isTemporary&quot;:false,&quot;suppress-author&quot;:false,&quot;composite&quot;:false,&quot;author-only&quot;:false}],&quot;citationTag&quot;:&quot;MENDELEY_CITATION_v3_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&quot;},{&quot;citationID&quot;:&quot;MENDELEY_CITATION_a1b31c94-c58f-4694-9071-e6665d2d0963&quot;,&quot;properties&quot;:{&quot;noteIndex&quot;:0},&quot;isEdited&quot;:false,&quot;manualOverride&quot;:{&quot;isManuallyOverridden&quot;:false,&quot;citeprocText&quot;:&quot;[6]&quot;,&quot;manualOverrideText&quot;:&quot;&quot;},&quot;citationItems&quot;:[{&quot;id&quot;:&quot;9003cc2d-8e1b-3761-9c43-cf67f96021b9&quot;,&quot;itemData&quot;:{&quot;type&quot;:&quot;article&quot;,&quot;id&quot;:&quot;9003cc2d-8e1b-3761-9c43-cf67f96021b9&quot;,&quot;title&quot;:&quot;25010:2023 Systems and software Quality Requirements and Evaluation (SQuaRE) — Product quality model&quot;,&quot;author&quot;:[{&quot;family&quot;:&quot;ISO/IEC&quot;,&quot;given&quot;:&quot;&quot;,&quot;parse-names&quot;:false,&quot;dropping-particle&quot;:&quot;&quot;,&quot;non-dropping-particle&quot;:&quot;&quot;}],&quot;issued&quot;:{&quot;date-parts&quot;:[[2023]]},&quot;issue&quot;:&quot;ISO/IEC 25010:2023&quot;,&quot;container-title-short&quot;:&quot;&quot;},&quot;isTemporary&quot;:false,&quot;suppress-author&quot;:false,&quot;composite&quot;:false,&quot;author-only&quot;:false}],&quot;citationTag&quot;:&quot;MENDELEY_CITATION_v3_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&quot;},{&quot;citationID&quot;:&quot;MENDELEY_CITATION_ee44cd7b-0f27-4905-b755-50dd2d8f3a9b&quot;,&quot;properties&quot;:{&quot;noteIndex&quot;:0},&quot;isEdited&quot;:false,&quot;manualOverride&quot;:{&quot;isManuallyOverridden&quot;:false,&quot;citeprocText&quot;:&quot;[11]&quot;,&quot;manualOverrideText&quot;:&quot;&quot;},&quot;citationItems&quot;:[{&quot;id&quot;:&quot;53bf9615-9f05-3888-82f8-ecd3ad0cd90a&quot;,&quot;itemData&quot;:{&quot;type&quot;:&quot;book&quot;,&quot;id&quot;:&quot;53bf9615-9f05-3888-82f8-ecd3ad0cd90a&quot;,&quot;title&quot;:&quot;Requirements Engineering&quot;,&quot;author&quot;:[{&quot;family&quot;:&quot;Hull&quot;,&quot;given&quot;:&quot;Elizabeth&quot;,&quot;parse-names&quot;:false,&quot;dropping-particle&quot;:&quot;&quot;,&quot;non-dropping-particle&quot;:&quot;&quot;},{&quot;family&quot;:&quot;Jackson&quot;,&quot;given&quot;:&quot;Ken&quot;,&quot;parse-names&quot;:false,&quot;dropping-particle&quot;:&quot;&quot;,&quot;non-dropping-particle&quot;:&quot;&quot;},{&quot;family&quot;:&quot;Dick&quot;,&quot;given&quot;:&quot;Jeremy&quot;,&quot;parse-names&quot;:false,&quot;dropping-particle&quot;:&quot;&quot;,&quot;non-dropping-particle&quot;:&quot;&quot;}],&quot;DOI&quot;:&quot;10.1007/978-1-84996-405-0&quot;,&quot;ISBN&quot;:&quot;978-1-84996-404-3&quot;,&quot;issued&quot;:{&quot;date-parts&quot;:[[2011]]},&quot;publisher-place&quot;:&quot;London&quot;,&quot;publisher&quot;:&quot;Springer London&quot;,&quot;container-title-short&quot;:&quot;&quot;},&quot;isTemporary&quot;:false,&quot;suppress-author&quot;:false,&quot;composite&quot;:false,&quot;author-only&quot;:false}],&quot;citationTag&quot;:&quot;MENDELEY_CITATION_v3_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&quot;},{&quot;citationID&quot;:&quot;MENDELEY_CITATION_c3f3f90d-abba-4418-84f1-8cc105abedb2&quot;,&quot;properties&quot;:{&quot;noteIndex&quot;:0},&quot;isEdited&quot;:false,&quot;manualOverride&quot;:{&quot;isManuallyOverridden&quot;:false,&quot;citeprocText&quot;:&quot;[1]&quot;,&quot;manualOverrideText&quot;:&quot;&quot;},&quot;citationItems&quot;:[{&quot;id&quot;:&quot;8b459ffd-756d-3939-9e41-8c07ad9f20f2&quot;,&quot;itemData&quot;:{&quot;type&quot;:&quot;article&quot;,&quot;id&quot;:&quot;8b459ffd-756d-3939-9e41-8c07ad9f20f2&quot;,&quot;title&quot;:&quot;29148:2018 — Requirements engineering&quot;,&quot;author&quot;:[{&quot;family&quot;:&quot;ISO/IEC/IEEE&quot;,&quot;given&quot;:&quot;&quot;,&quot;parse-names&quot;:false,&quot;dropping-particle&quot;:&quot;&quot;,&quot;non-dropping-particle&quot;:&quot;&quot;}],&quot;DOI&quot;:&quot;10.1109/IEEESTD.2018.8559686&quot;,&quot;ISBN&quot;:&quot;978-1-5044-5302-8&quot;,&quot;issued&quot;:{&quot;date-parts&quot;:[[2018]]},&quot;publisher-place&quot;:&quot;Piscataway, NJ, USA&quot;,&quot;publisher&quot;:&quot;IEEE&quot;,&quot;container-title-short&quot;:&quot;&quot;},&quot;isTemporary&quot;:false,&quot;suppress-author&quot;:false,&quot;composite&quot;:false,&quot;author-only&quot;:false}],&quot;citationTag&quot;:&quot;MENDELEY_CITATION_v3_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&quot;}]"/>
+    <we:property name="MENDELEY_BIBLIOGRAPHY_LAST_MODIFIED" value="1783889194314"/>
+    <we:property name="MENDELEY_CITATIONS" value="[{&quot;citationID&quot;:&quot;MENDELEY_CITATION_d1f4b0f3-c16e-466c-8bfa-670575522dac&quot;,&quot;properties&quot;:{&quot;noteIndex&quot;:0},&quot;isEdited&quot;:false,&quot;manualOverride&quot;:{&quot;isManuallyOverridden&quot;:false,&quot;citeprocText&quot;:&quot;[1]&quot;,&quot;manualOverrideText&quot;:&quot;&quot;},&quot;citationTag&quot;:&quot;MENDELEY_CITATION_v3_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&quot;,&quot;citationItems&quot;:[{&quot;id&quot;:&quot;8b459ffd-756d-3939-9e41-8c07ad9f20f2&quot;,&quot;itemData&quot;:{&quot;type&quot;:&quot;article&quot;,&quot;id&quot;:&quot;8b459ffd-756d-3939-9e41-8c07ad9f20f2&quot;,&quot;title&quot;:&quot;29148:2018 — Requirements engineering&quot;,&quot;author&quot;:[{&quot;family&quot;:&quot;ISO/IEC/IEEE&quot;,&quot;given&quot;:&quot;&quot;,&quot;parse-names&quot;:false,&quot;dropping-particle&quot;:&quot;&quot;,&quot;non-dropping-particle&quot;:&quot;&quot;}],&quot;DOI&quot;:&quot;10.1109/IEEESTD.2018.8559686&quot;,&quot;ISBN&quot;:&quot;978-1-5044-5302-8&quot;,&quot;issued&quot;:{&quot;date-parts&quot;:[[2018]]},&quot;publisher-place&quot;:&quot;Piscataway, NJ, USA&quot;,&quot;publisher&quot;:&quot;IEEE&quot;,&quot;container-title-short&quot;:&quot;&quot;},&quot;isTemporary&quot;:false,&quot;suppress-author&quot;:false,&quot;composite&quot;:false,&quot;author-only&quot;:false}]},{&quot;citationID&quot;:&quot;MENDELEY_CITATION_4946858a-3c80-4c59-bd5f-f99988864337&quot;,&quot;properties&quot;:{&quot;noteIndex&quot;:0},&quot;isEdited&quot;:false,&quot;manualOverride&quot;:{&quot;isManuallyOverridden&quot;:false,&quot;citeprocText&quot;:&quot;[1]&quot;,&quot;manualOverrideText&quot;:&quot;&quot;},&quot;citationTag&quot;:&quot;MENDELEY_CITATION_v3_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&quot;,&quot;citationItems&quot;:[{&quot;id&quot;:&quot;8b459ffd-756d-3939-9e41-8c07ad9f20f2&quot;,&quot;itemData&quot;:{&quot;type&quot;:&quot;article&quot;,&quot;id&quot;:&quot;8b459ffd-756d-3939-9e41-8c07ad9f20f2&quot;,&quot;title&quot;:&quot;29148:2018 — Requirements engineering&quot;,&quot;author&quot;:[{&quot;family&quot;:&quot;ISO/IEC/IEEE&quot;,&quot;given&quot;:&quot;&quot;,&quot;parse-names&quot;:false,&quot;dropping-particle&quot;:&quot;&quot;,&quot;non-dropping-particle&quot;:&quot;&quot;}],&quot;DOI&quot;:&quot;10.1109/IEEESTD.2018.8559686&quot;,&quot;ISBN&quot;:&quot;978-1-5044-5302-8&quot;,&quot;issued&quot;:{&quot;date-parts&quot;:[[2018]]},&quot;publisher-place&quot;:&quot;Piscataway, NJ, USA&quot;,&quot;publisher&quot;:&quot;IEEE&quot;,&quot;container-title-short&quot;:&quot;&quot;},&quot;isTemporary&quot;:false,&quot;suppress-author&quot;:false,&quot;composite&quot;:false,&quot;author-only&quot;:false}]},{&quot;citationID&quot;:&quot;MENDELEY_CITATION_e018ed9c-7d24-44f5-a3e7-a4c260ef6e9e&quot;,&quot;properties&quot;:{&quot;noteIndex&quot;:0},&quot;isEdited&quot;:false,&quot;manualOverride&quot;:{&quot;isManuallyOverridden&quot;:false,&quot;citeprocText&quot;:&quot;[2]&quot;,&quot;manualOverrideText&quot;:&quot;&quot;},&quot;citationTag&quot;:&quot;MENDELEY_CITATION_v3_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&quot;,&quot;citationItems&quot;:[{&quot;id&quot;:&quot;e2b26073-7ef3-371d-af2e-9af8bf0591d2&quot;,&quot;itemData&quot;:{&quot;type&quot;:&quot;book&quot;,&quot;id&quot;:&quot;e2b26073-7ef3-371d-af2e-9af8bf0591d2&quot;,&quot;title&quot;:&quot;Requirements engineering : fundamentals, principles, and techniques&quot;,&quot;author&quot;:[{&quot;family&quot;:&quot;Pohl&quot;,&quot;given&quot;:&quot;Klaus.&quot;,&quot;parse-names&quot;:false,&quot;dropping-particle&quot;:&quot;&quot;,&quot;non-dropping-particle&quot;:&quot;&quot;}],&quot;ISBN&quot;:&quot;9783662692042&quot;,&quot;issued&quot;:{&quot;date-parts&quot;:[[2025]]},&quot;number-of-pages&quot;:&quot;814&quot;,&quot;abstract&quot;:&quot;Second edition.&quot;,&quot;publisher&quot;:&quot;Springer&quot;,&quot;container-title-short&quot;:&quot;&quot;},&quot;isTemporary&quot;:false,&quot;suppress-author&quot;:false,&quot;composite&quot;:false,&quot;author-only&quot;:false}]},{&quot;citationID&quot;:&quot;MENDELEY_CITATION_1df5f673-f934-40c4-acac-a2f628c714fe&quot;,&quot;properties&quot;:{&quot;noteIndex&quot;:0},&quot;isEdited&quot;:false,&quot;manualOverride&quot;:{&quot;isManuallyOverridden&quot;:false,&quot;citeprocText&quot;:&quot;[1]&quot;,&quot;manualOverrideText&quot;:&quot;&quot;},&quot;citationTag&quot;:&quot;MENDELEY_CITATION_v3_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&quot;,&quot;citationItems&quot;:[{&quot;id&quot;:&quot;8b459ffd-756d-3939-9e41-8c07ad9f20f2&quot;,&quot;itemData&quot;:{&quot;type&quot;:&quot;article&quot;,&quot;id&quot;:&quot;8b459ffd-756d-3939-9e41-8c07ad9f20f2&quot;,&quot;title&quot;:&quot;29148:2018 — Requirements engineering&quot;,&quot;author&quot;:[{&quot;family&quot;:&quot;ISO/IEC/IEEE&quot;,&quot;given&quot;:&quot;&quot;,&quot;parse-names&quot;:false,&quot;dropping-particle&quot;:&quot;&quot;,&quot;non-dropping-particle&quot;:&quot;&quot;}],&quot;DOI&quot;:&quot;10.1109/IEEESTD.2018.8559686&quot;,&quot;ISBN&quot;:&quot;978-1-5044-5302-8&quot;,&quot;issued&quot;:{&quot;date-parts&quot;:[[2018]]},&quot;publisher-place&quot;:&quot;Piscataway, NJ, USA&quot;,&quot;publisher&quot;:&quot;IEEE&quot;,&quot;container-title-short&quot;:&quot;&quot;},&quot;isTemporary&quot;:false,&quot;suppress-author&quot;:false,&quot;composite&quot;:false,&quot;author-only&quot;:false}]},{&quot;citationID&quot;:&quot;MENDELEY_CITATION_b0180692-3631-44e9-b572-ce8091c94df4&quot;,&quot;properties&quot;:{&quot;noteIndex&quot;:0},&quot;isEdited&quot;:false,&quot;manualOverride&quot;:{&quot;isManuallyOverridden&quot;:false,&quot;citeprocText&quot;:&quot;[3]&quot;,&quot;manualOverrideText&quot;:&quot;&quot;},&quot;citationTag&quot;:&quot;MENDELEY_CITATION_v3_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&quot;,&quot;citationItems&quot;:[{&quot;id&quot;:&quot;e6dea4ac-962f-3053-a6bc-34fc5f37acee&quot;,&quot;itemData&quot;:{&quot;type&quot;:&quot;article-journal&quot;,&quot;id&quot;:&quot;e6dea4ac-962f-3053-a6bc-34fc5f37acee&quot;,&quot;title&quot;:&quot;Advances in automated support for requirements engineering: a systematic literature review&quot;,&quot;author&quot;:[{&quot;family&quot;:&quot;Umar&quot;,&quot;given&quot;:&quot;Muhammad Aminu&quot;,&quot;parse-names&quot;:false,&quot;dropping-particle&quot;:&quot;&quot;,&quot;non-dropping-particle&quot;:&quot;&quot;},{&quot;family&quot;:&quot;Lano&quot;,&quot;given&quot;:&quot;Kevin&quot;,&quot;parse-names&quot;:false,&quot;dropping-particle&quot;:&quot;&quot;,&quot;non-dropping-particle&quot;:&quot;&quot;}],&quot;container-title&quot;:&quot;Requirements Engineering&quot;,&quot;container-title-short&quot;:&quot;Requir. Eng.&quot;,&quot;DOI&quot;:&quot;10.1007/s00766-023-00411-0&quot;,&quot;ISSN&quot;:&quot;0947-3602&quot;,&quot;issued&quot;:{&quot;date-parts&quot;:[[2024,6,3]]},&quot;page&quot;:&quot;177-207&quot;,&quot;abstract&quot;:&quot;&lt;p&gt;Requirements Engineering (RE) has undergone several transitions over the years, from traditional methods to agile approaches emphasising increased automation. In many software development projects, requirements are expressed in natural language and embedded within large volumes of text documents. At the same time, RE activities aim to define software systems' functionalities and constraints. However, manually executing these tasks is time-consuming and prone to errors. Numerous research efforts have proposed tools and technologies for automating RE activities to address this challenge, which are documented in published works. This review aims to examine empirical evidence on automated RE and analyse its impact on the RE sub-domain and software development. To achieve our goal, we conducted a Systematic Literature Review (SLR) following established guidelines for conducting SLRs. We aimed to identify, aggregate, and analyse papers on automated RE published between 1996 and 2022. We outlined the output of the support tool, the RE phase covered, levels of automation, development approach, and evaluation approaches. We identified 85 papers that discussed automated RE from various perspectives and methodologies. The results of this review demonstrate the significance of automated RE for the software development community, which has the potential to shorten development cycles and reduce associated costs. The support tools primarily assist in generating UML models (44.7%) and other activities such as omission of steps, consistency checking, and requirement validation. The analysis phase of RE is the most widely automated phase, with 49.53% of automated tools developed for this purpose. Natural language processing technologies, particularly POS tagging and Parser, are widely employed in developing these support tools. Controlled experimental methods are the most frequently used (48.2%) for evaluating automated RE tools, while user studies are the least employed evaluation method (8.2%). This paper contributes to the existing body of knowledge by providing an updated overview of the research literature, enabling a better understanding of trends and state-of-the-art practices in automated RE for researchers and practitioners. It also paves the way for future research directions in automated requirements engineering.&lt;/p&gt;&quot;,&quot;issue&quot;:&quot;2&quot;,&quot;volume&quot;:&quot;29&quot;},&quot;isTemporary&quot;:false,&quot;suppress-author&quot;:false,&quot;composite&quot;:false,&quot;author-only&quot;:false}]},{&quot;citationID&quot;:&quot;MENDELEY_CITATION_9dd78bfa-88b6-43c6-9ea9-f9e291f6e305&quot;,&quot;properties&quot;:{&quot;noteIndex&quot;:0},&quot;isEdited&quot;:false,&quot;manualOverride&quot;:{&quot;isManuallyOverridden&quot;:false,&quot;citeprocText&quot;:&quot;[4]&quot;,&quot;manualOverrideText&quot;:&quot;&quot;},&quot;citationTag&quot;:&quot;MENDELEY_CITATION_v3_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&quot;,&quot;citationItems&quot;:[{&quot;id&quot;:&quot;e255f396-b160-39f8-b810-7138cb6c1d4f&quot;,&quot;itemData&quot;:{&quot;type&quot;:&quot;article&quot;,&quot;id&quot;:&quot;e255f396-b160-39f8-b810-7138cb6c1d4f&quot;,&quot;title&quot;:&quot;15288:2023 — System life cycle processes&quot;,&quot;author&quot;:[{&quot;family&quot;:&quot;ISO/IEC/IEEE&quot;,&quot;given&quot;:&quot;&quot;,&quot;parse-names&quot;:false,&quot;dropping-particle&quot;:&quot;&quot;,&quot;non-dropping-particle&quot;:&quot;&quot;}],&quot;issued&quot;:{&quot;date-parts&quot;:[[2023]]},&quot;issue&quot;:&quot;ISO/IEC/IEEE 15288:2023&quot;,&quot;container-title-short&quot;:&quot;&quot;},&quot;isTemporary&quot;:false,&quot;suppress-author&quot;:false,&quot;composite&quot;:false,&quot;author-only&quot;:false}]},{&quot;citationID&quot;:&quot;MENDELEY_CITATION_d0a992e6-43d2-4bad-a2ea-14d17f715b23&quot;,&quot;properties&quot;:{&quot;noteIndex&quot;:0},&quot;isEdited&quot;:false,&quot;manualOverride&quot;:{&quot;isManuallyOverridden&quot;:false,&quot;citeprocText&quot;:&quot;[5]&quot;,&quot;manualOverrideText&quot;:&quot;&quot;},&quot;citationTag&quot;:&quot;MENDELEY_CITATION_v3_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&quot;,&quot;citationItems&quot;:[{&quot;id&quot;:&quot;4326de62-a1f1-370d-99b5-e2d8d6481a94&quot;,&quot;itemData&quot;:{&quot;type&quot;:&quot;article&quot;,&quot;id&quot;:&quot;4326de62-a1f1-370d-99b5-e2d8d6481a94&quot;,&quot;title&quot;:&quot;12207:2017 — Systems and software engineering — Software life cycle processes&quot;,&quot;author&quot;:[{&quot;family&quot;:&quot;ISO/IEC/IEEE&quot;,&quot;given&quot;:&quot;&quot;,&quot;parse-names&quot;:false,&quot;dropping-particle&quot;:&quot;&quot;,&quot;non-dropping-particle&quot;:&quot;&quot;}],&quot;issued&quot;:{&quot;date-parts&quot;:[[2017]]},&quot;issue&quot;:&quot;ISO/IEC/IEEE 12207:2017&quot;,&quot;container-title-short&quot;:&quot;&quot;},&quot;isTemporary&quot;:false,&quot;suppress-author&quot;:false,&quot;composite&quot;:false,&quot;author-only&quot;:false}]},{&quot;citationID&quot;:&quot;MENDELEY_CITATION_89e6926f-86bd-42d1-8958-ce1661c27a30&quot;,&quot;properties&quot;:{&quot;noteIndex&quot;:0},&quot;isEdited&quot;:false,&quot;manualOverride&quot;:{&quot;isManuallyOverridden&quot;:false,&quot;citeprocText&quot;:&quot;[6]&quot;,&quot;manualOverrideText&quot;:&quot;&quot;},&quot;citationTag&quot;:&quot;MENDELEY_CITATION_v3_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&quot;,&quot;citationItems&quot;:[{&quot;id&quot;:&quot;9003cc2d-8e1b-3761-9c43-cf67f96021b9&quot;,&quot;itemData&quot;:{&quot;type&quot;:&quot;article&quot;,&quot;id&quot;:&quot;9003cc2d-8e1b-3761-9c43-cf67f96021b9&quot;,&quot;title&quot;:&quot;25010:2023 Systems and software Quality Requirements and Evaluation (SQuaRE) — Product quality model&quot;,&quot;author&quot;:[{&quot;family&quot;:&quot;ISO/IEC&quot;,&quot;given&quot;:&quot;&quot;,&quot;parse-names&quot;:false,&quot;dropping-particle&quot;:&quot;&quot;,&quot;non-dropping-particle&quot;:&quot;&quot;}],&quot;issued&quot;:{&quot;date-parts&quot;:[[2023]]},&quot;issue&quot;:&quot;ISO/IEC 25010:2023&quot;,&quot;container-title-short&quot;:&quot;&quot;},&quot;isTemporary&quot;:false,&quot;suppress-author&quot;:false,&quot;composite&quot;:false,&quot;author-only&quot;:false}]},{&quot;citationID&quot;:&quot;MENDELEY_CITATION_0fbdbc46-8a3e-47bb-bd1e-a2db294aac5c&quot;,&quot;properties&quot;:{&quot;noteIndex&quot;:0},&quot;isEdited&quot;:false,&quot;manualOverride&quot;:{&quot;isManuallyOverridden&quot;:false,&quot;citeprocText&quot;:&quot;[2]&quot;,&quot;manualOverrideText&quot;:&quot;&quot;},&quot;citationTag&quot;:&quot;MENDELEY_CITATION_v3_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&quot;,&quot;citationItems&quot;:[{&quot;id&quot;:&quot;e2b26073-7ef3-371d-af2e-9af8bf0591d2&quot;,&quot;itemData&quot;:{&quot;type&quot;:&quot;book&quot;,&quot;id&quot;:&quot;e2b26073-7ef3-371d-af2e-9af8bf0591d2&quot;,&quot;title&quot;:&quot;Requirements engineering : fundamentals, principles, and techniques&quot;,&quot;author&quot;:[{&quot;family&quot;:&quot;Pohl&quot;,&quot;given&quot;:&quot;Klaus.&quot;,&quot;parse-names&quot;:false,&quot;dropping-particle&quot;:&quot;&quot;,&quot;non-dropping-particle&quot;:&quot;&quot;}],&quot;ISBN&quot;:&quot;9783662692042&quot;,&quot;issued&quot;:{&quot;date-parts&quot;:[[2025]]},&quot;number-of-pages&quot;:&quot;814&quot;,&quot;abstract&quot;:&quot;Second edition.&quot;,&quot;publisher&quot;:&quot;Springer&quot;,&quot;container-title-short&quot;:&quot;&quot;},&quot;isTemporary&quot;:false,&quot;suppress-author&quot;:false,&quot;composite&quot;:false,&quot;author-only&quot;:false}]},{&quot;citationID&quot;:&quot;MENDELEY_CITATION_5a19125a-f94e-4c1d-a9ee-de90b4f409b9&quot;,&quot;properties&quot;:{&quot;noteIndex&quot;:0},&quot;isEdited&quot;:false,&quot;manualOverride&quot;:{&quot;isManuallyOverridden&quot;:false,&quot;citeprocText&quot;:&quot;[7]&quot;,&quot;manualOverrideText&quot;:&quot;&quot;},&quot;citationTag&quot;:&quot;MENDELEY_CITATION_v3_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&quot;,&quot;citationItems&quot;:[{&quot;id&quot;:&quot;b4a67c60-32e8-3898-8c2f-38b6887aa554&quot;,&quot;itemData&quot;:{&quot;type&quot;:&quot;book&quot;,&quot;id&quot;:&quot;b4a67c60-32e8-3898-8c2f-38b6887aa554&quot;,&quot;title&quot;:&quot;SWEBOK Guide v4.0&quot;,&quot;author&quot;:[{&quot;family&quot;:&quot;Washizaki&quot;,&quot;given&quot;:&quot;H&quot;,&quot;parse-names&quot;:false,&quot;dropping-particle&quot;:&quot;&quot;,&quot;non-dropping-particle&quot;:&quot;&quot;}],&quot;editor&quot;:[{&quot;family&quot;:&quot;Washizaki&quot;,&quot;given&quot;:&quot;H&quot;,&quot;parse-names&quot;:false,&quot;dropping-particle&quot;:&quot;&quot;,&quot;non-dropping-particle&quot;:&quot;&quot;}],&quot;URL&quot;:&quot;https://www.computer.org/education/bodies-of-knowledge/software-engineering&quot;,&quot;issued&quot;:{&quot;date-parts&quot;:[[2024]]},&quot;publisher&quot;:&quot;IEEE Computer Society&quot;,&quot;container-title-short&quot;:&quot;&quot;},&quot;isTemporary&quot;:false,&quot;suppress-author&quot;:false,&quot;composite&quot;:false,&quot;author-only&quot;:false}]},{&quot;citationID&quot;:&quot;MENDELEY_CITATION_d5e8a7f7-08de-4147-93e6-c3e18c13a771&quot;,&quot;properties&quot;:{&quot;noteIndex&quot;:0},&quot;isEdited&quot;:false,&quot;manualOverride&quot;:{&quot;isManuallyOverridden&quot;:false,&quot;citeprocText&quot;:&quot;[8]&quot;,&quot;manualOverrideText&quot;:&quot;&quot;},&quot;citationTag&quot;:&quot;MENDELEY_CITATION_v3_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&quot;,&quot;citationItems&quot;:[{&quot;id&quot;:&quot;daa08e9f-9677-3412-8e94-5091b7fddc56&quot;,&quot;itemData&quot;:{&quot;type&quot;:&quot;book&quot;,&quot;id&quot;:&quot;daa08e9f-9677-3412-8e94-5091b7fddc56&quot;,&quot;title&quot;:&quot;A Guide to the Project Management Body of Knowledge (PMBOK® Guide) – Seventh Edition and The Standard for Project Management&quot;,&quot;author&quot;:[{&quot;family&quot;:&quot;Institute&quot;,&quot;given&quot;:&quot;Project Management&quot;,&quot;parse-names&quot;:false,&quot;dropping-particle&quot;:&quot;&quot;,&quot;non-dropping-particle&quot;:&quot;&quot;}],&quot;ISBN&quot;:&quot;9781628256642&quot;,&quot;issued&quot;:{&quot;date-parts&quot;:[[2021]]},&quot;publisher-place&quot;:&quot;Newtown Square, PA&quot;,&quot;publisher&quot;:&quot;Project Management Institute&quot;,&quot;container-title-short&quot;:&quot;&quot;},&quot;isTemporary&quot;:false,&quot;suppress-author&quot;:false,&quot;composite&quot;:false,&quot;author-only&quot;:false}]},{&quot;citationID&quot;:&quot;MENDELEY_CITATION_da3ed054-d07a-496b-8435-6806fb559b7d&quot;,&quot;properties&quot;:{&quot;noteIndex&quot;:0},&quot;isEdited&quot;:false,&quot;manualOverride&quot;:{&quot;isManuallyOverridden&quot;:false,&quot;citeprocText&quot;:&quot;[9]&quot;,&quot;manualOverrideText&quot;:&quot;&quot;},&quot;citationTag&quot;:&quot;MENDELEY_CITATION_v3_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&quot;,&quot;citationItems&quot;:[{&quot;id&quot;:&quot;66151fa6-eac6-3909-b0c3-058dd6c6e5c7&quot;,&quot;itemData&quot;:{&quot;type&quot;:&quot;article&quot;,&quot;id&quot;:&quot;66151fa6-eac6-3909-b0c3-058dd6c6e5c7&quot;,&quot;title&quot;:&quot;CPRE Foundation Level Syllabus v3.1&quot;,&quot;author&quot;:[{&quot;family&quot;:&quot;IREB&quot;,&quot;given&quot;:&quot;&quot;,&quot;parse-names&quot;:false,&quot;dropping-particle&quot;:&quot;&quot;,&quot;non-dropping-particle&quot;:&quot;&quot;}],&quot;URL&quot;:&quot;https://www.ireb.org&quot;,&quot;issued&quot;:{&quot;date-parts&quot;:[[2022]]},&quot;container-title-short&quot;:&quot;&quot;},&quot;isTemporary&quot;:false,&quot;suppress-author&quot;:false,&quot;composite&quot;:false,&quot;author-only&quot;:false}]},{&quot;citationID&quot;:&quot;MENDELEY_CITATION_5668133c-8149-4de7-8e71-0d08dfa988e8&quot;,&quot;properties&quot;:{&quot;noteIndex&quot;:0},&quot;isEdited&quot;:false,&quot;manualOverride&quot;:{&quot;isManuallyOverridden&quot;:false,&quot;citeprocText&quot;:&quot;[1]&quot;,&quot;manualOverrideText&quot;:&quot;&quot;},&quot;citationTag&quot;:&quot;MENDELEY_CITATION_v3_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&quot;,&quot;citationItems&quot;:[{&quot;id&quot;:&quot;8b459ffd-756d-3939-9e41-8c07ad9f20f2&quot;,&quot;itemData&quot;:{&quot;type&quot;:&quot;article&quot;,&quot;id&quot;:&quot;8b459ffd-756d-3939-9e41-8c07ad9f20f2&quot;,&quot;title&quot;:&quot;29148:2018 — Requirements engineering&quot;,&quot;author&quot;:[{&quot;family&quot;:&quot;ISO/IEC/IEEE&quot;,&quot;given&quot;:&quot;&quot;,&quot;parse-names&quot;:false,&quot;dropping-particle&quot;:&quot;&quot;,&quot;non-dropping-particle&quot;:&quot;&quot;}],&quot;DOI&quot;:&quot;10.1109/IEEESTD.2018.8559686&quot;,&quot;ISBN&quot;:&quot;978-1-5044-5302-8&quot;,&quot;issued&quot;:{&quot;date-parts&quot;:[[2018]]},&quot;publisher-place&quot;:&quot;Piscataway, NJ, USA&quot;,&quot;publisher&quot;:&quot;IEEE&quot;,&quot;container-title-short&quot;:&quot;&quot;},&quot;isTemporary&quot;:false,&quot;suppress-author&quot;:false,&quot;composite&quot;:false,&quot;author-only&quot;:false}]},{&quot;citationID&quot;:&quot;MENDELEY_CITATION_38c3613e-9e78-4d87-af2a-9e3063aa327c&quot;,&quot;properties&quot;:{&quot;noteIndex&quot;:0},&quot;isEdited&quot;:false,&quot;manualOverride&quot;:{&quot;isManuallyOverridden&quot;:false,&quot;citeprocText&quot;:&quot;[10]&quot;,&quot;manualOverrideText&quot;:&quot;&quot;},&quot;citationTag&quot;:&quot;MENDELEY_CITATION_v3_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&quot;,&quot;citationItems&quot;:[{&quot;id&quot;:&quot;585f87df-c637-3e52-902f-9e282702414f&quot;,&quot;itemData&quot;:{&quot;type&quot;:&quot;article-journal&quot;,&quot;id&quot;:&quot;585f87df-c637-3e52-902f-9e282702414f&quot;,&quot;title&quot;:&quot;Structured SRS for e-Government Services With Boilerplate Design and Interface&quot;,&quot;author&quot;:[{&quot;family&quot;:&quot;Oztekin&quot;,&quot;given&quot;:&quot;Gonca Canan&quot;,&quot;parse-names&quot;:false,&quot;dropping-particle&quot;:&quot;&quot;,&quot;non-dropping-particle&quot;:&quot;&quot;},{&quot;family&quot;:&quot;Menekse Dalveren&quot;,&quot;given&quot;:&quot;Gonca Gokce&quot;,&quot;parse-names&quot;:false,&quot;dropping-particle&quot;:&quot;&quot;,&quot;non-dropping-particle&quot;:&quot;&quot;}],&quot;container-title&quot;:&quot;IEEE Access&quot;,&quot;DOI&quot;:&quot;10.1109/ACCESS.2023.3287882&quot;,&quot;ISSN&quot;:&quot;2169-3536&quot;,&quot;issued&quot;:{&quot;date-parts&quot;:[[2023]]},&quot;page&quot;:&quot;62906-62917&quot;,&quot;volume&quot;:&quot;11&quot;,&quot;container-title-short&quot;:&quot;&quot;},&quot;isTemporary&quot;:false,&quot;suppress-author&quot;:false,&quot;composite&quot;:false,&quot;author-only&quot;:false}]},{&quot;citationID&quot;:&quot;MENDELEY_CITATION_ef6bf1d8-39dd-48c3-9d2d-75fd6e4f6e10&quot;,&quot;properties&quot;:{&quot;noteIndex&quot;:0},&quot;isEdited&quot;:false,&quot;manualOverride&quot;:{&quot;isManuallyOverridden&quot;:false,&quot;citeprocText&quot;:&quot;[11]&quot;,&quot;manualOverrideText&quot;:&quot;&quot;},&quot;citationTag&quot;:&quot;MENDELEY_CITATION_v3_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&quot;,&quot;citationItems&quot;:[{&quot;id&quot;:&quot;53bf9615-9f05-3888-82f8-ecd3ad0cd90a&quot;,&quot;itemData&quot;:{&quot;type&quot;:&quot;book&quot;,&quot;id&quot;:&quot;53bf9615-9f05-3888-82f8-ecd3ad0cd90a&quot;,&quot;title&quot;:&quot;Requirements Engineering&quot;,&quot;author&quot;:[{&quot;family&quot;:&quot;Hull&quot;,&quot;given&quot;:&quot;Elizabeth&quot;,&quot;parse-names&quot;:false,&quot;dropping-particle&quot;:&quot;&quot;,&quot;non-dropping-particle&quot;:&quot;&quot;},{&quot;family&quot;:&quot;Jackson&quot;,&quot;given&quot;:&quot;Ken&quot;,&quot;parse-names&quot;:false,&quot;dropping-particle&quot;:&quot;&quot;,&quot;non-dropping-particle&quot;:&quot;&quot;},{&quot;family&quot;:&quot;Dick&quot;,&quot;given&quot;:&quot;Jeremy&quot;,&quot;parse-names&quot;:false,&quot;dropping-particle&quot;:&quot;&quot;,&quot;non-dropping-particle&quot;:&quot;&quot;}],&quot;DOI&quot;:&quot;10.1007/978-1-84996-405-0&quot;,&quot;ISBN&quot;:&quot;978-1-84996-404-3&quot;,&quot;issued&quot;:{&quot;date-parts&quot;:[[2011]]},&quot;publisher-place&quot;:&quot;London&quot;,&quot;publisher&quot;:&quot;Springer London&quot;,&quot;container-title-short&quot;:&quot;&quot;},&quot;isTemporary&quot;:false,&quot;suppress-author&quot;:false,&quot;composite&quot;:false,&quot;author-only&quot;:false}]},{&quot;citationID&quot;:&quot;MENDELEY_CITATION_9a0bdb73-4607-490e-a571-0179055fa7a6&quot;,&quot;properties&quot;:{&quot;noteIndex&quot;:0},&quot;isEdited&quot;:false,&quot;manualOverride&quot;:{&quot;isManuallyOverridden&quot;:false,&quot;citeprocText&quot;:&quot;[6]&quot;,&quot;manualOverrideText&quot;:&quot;&quot;},&quot;citationTag&quot;:&quot;MENDELEY_CITATION_v3_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&quot;,&quot;citationItems&quot;:[{&quot;id&quot;:&quot;9003cc2d-8e1b-3761-9c43-cf67f96021b9&quot;,&quot;itemData&quot;:{&quot;type&quot;:&quot;article&quot;,&quot;id&quot;:&quot;9003cc2d-8e1b-3761-9c43-cf67f96021b9&quot;,&quot;title&quot;:&quot;25010:2023 Systems and software Quality Requirements and Evaluation (SQuaRE) — Product quality model&quot;,&quot;author&quot;:[{&quot;family&quot;:&quot;ISO/IEC&quot;,&quot;given&quot;:&quot;&quot;,&quot;parse-names&quot;:false,&quot;dropping-particle&quot;:&quot;&quot;,&quot;non-dropping-particle&quot;:&quot;&quot;}],&quot;issued&quot;:{&quot;date-parts&quot;:[[2023]]},&quot;issue&quot;:&quot;ISO/IEC 25010:2023&quot;,&quot;container-title-short&quot;:&quot;&quot;},&quot;isTemporary&quot;:false,&quot;suppress-author&quot;:false,&quot;composite&quot;:false,&quot;author-only&quot;:false}]},{&quot;citationID&quot;:&quot;MENDELEY_CITATION_d517f449-2212-4592-b6c2-2be1c486617c&quot;,&quot;properties&quot;:{&quot;noteIndex&quot;:0},&quot;isEdited&quot;:false,&quot;manualOverride&quot;:{&quot;isManuallyOverridden&quot;:false,&quot;citeprocText&quot;:&quot;[12]&quot;,&quot;manualOverrideText&quot;:&quot;&quot;},&quot;citationTag&quot;:&quot;MENDELEY_CITATION_v3_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&quot;,&quot;citationItems&quot;:[{&quot;id&quot;:&quot;969309ac-d1f5-3d30-89ff-aa1a87f9e65a&quot;,&quot;itemData&quot;:{&quot;type&quot;:&quot;book&quot;,&quot;id&quot;:&quot;969309ac-d1f5-3d30-89ff-aa1a87f9e65a&quot;,&quot;title&quot;:&quot;Requirements analysis and system design&quot;,&quot;author&quot;:[{&quot;family&quot;:&quot;Maciaszek&quot;,&quot;given&quot;:&quot;Leszek.&quot;,&quot;parse-names&quot;:false,&quot;dropping-particle&quot;:&quot;&quot;,&quot;non-dropping-particle&quot;:&quot;&quot;}],&quot;ISBN&quot;:&quot;0321440366&quot;,&quot;issued&quot;:{&quot;date-parts&quot;:[[2007]]},&quot;number-of-pages&quot;:&quot;612&quot;,&quot;abstract&quot;:&quot;3rd ed. Previous edition: 2005. \&quot;This book is the ideal companion for undergraduates studying: systems analysis; systems design; software engineering; software projects; and databases and object technology. It would also be an reference for any practitioners wishing to get up to speed with the latest developments in this area.\&quot;--Jacket. The software process -- Ch. 2. Requirements determination -- Ch. 3. Objects and object modeling -- Ch. 4. Requirements specification -- Ch. 5. Moving from analysis to design -- Ch. 6. System architecture and program design -- Ch. 7. User interface design -- Ch. 8. Persistence and database design -- Ch. 9. Testing and change management -- Ch. 10. Tutorial-style review and reinforcement.&quot;,&quot;publisher&quot;:&quot;Addison-Wesley&quot;,&quot;container-title-short&quot;:&quot;&quot;},&quot;isTemporary&quot;:false,&quot;suppress-author&quot;:false,&quot;composite&quot;:false,&quot;author-only&quot;:false}]},{&quot;citationID&quot;:&quot;MENDELEY_CITATION_a54d54ba-dc08-4317-8081-c98efd264fd8&quot;,&quot;properties&quot;:{&quot;noteIndex&quot;:0},&quot;isEdited&quot;:false,&quot;manualOverride&quot;:{&quot;isManuallyOverridden&quot;:false,&quot;citeprocText&quot;:&quot;[7]&quot;,&quot;manualOverrideText&quot;:&quot;&quot;},&quot;citationTag&quot;:&quot;MENDELEY_CITATION_v3_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&quot;,&quot;citationItems&quot;:[{&quot;id&quot;:&quot;b4a67c60-32e8-3898-8c2f-38b6887aa554&quot;,&quot;itemData&quot;:{&quot;type&quot;:&quot;book&quot;,&quot;id&quot;:&quot;b4a67c60-32e8-3898-8c2f-38b6887aa554&quot;,&quot;title&quot;:&quot;SWEBOK Guide v4.0&quot;,&quot;author&quot;:[{&quot;family&quot;:&quot;Washizaki&quot;,&quot;given&quot;:&quot;H&quot;,&quot;parse-names&quot;:false,&quot;dropping-particle&quot;:&quot;&quot;,&quot;non-dropping-particle&quot;:&quot;&quot;}],&quot;editor&quot;:[{&quot;family&quot;:&quot;Washizaki&quot;,&quot;given&quot;:&quot;H&quot;,&quot;parse-names&quot;:false,&quot;dropping-particle&quot;:&quot;&quot;,&quot;non-dropping-particle&quot;:&quot;&quot;}],&quot;URL&quot;:&quot;https://www.computer.org/education/bodies-of-knowledge/software-engineering&quot;,&quot;issued&quot;:{&quot;date-parts&quot;:[[2024]]},&quot;publisher&quot;:&quot;IEEE Computer Society&quot;,&quot;container-title-short&quot;:&quot;&quot;},&quot;isTemporary&quot;:false,&quot;suppress-author&quot;:false,&quot;composite&quot;:false,&quot;author-only&quot;:false}]},{&quot;citationID&quot;:&quot;MENDELEY_CITATION_71b5ecd2-b926-42c4-b8ac-6ac3b7d0a299&quot;,&quot;properties&quot;:{&quot;noteIndex&quot;:0},&quot;isEdited&quot;:false,&quot;manualOverride&quot;:{&quot;isManuallyOverridden&quot;:false,&quot;citeprocText&quot;:&quot;[2]&quot;,&quot;manualOverrideText&quot;:&quot;&quot;},&quot;citationTag&quot;:&quot;MENDELEY_CITATION_v3_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&quot;,&quot;citationItems&quot;:[{&quot;id&quot;:&quot;e2b26073-7ef3-371d-af2e-9af8bf0591d2&quot;,&quot;itemData&quot;:{&quot;type&quot;:&quot;book&quot;,&quot;id&quot;:&quot;e2b26073-7ef3-371d-af2e-9af8bf0591d2&quot;,&quot;title&quot;:&quot;Requirements engineering : fundamentals, principles, and techniques&quot;,&quot;author&quot;:[{&quot;family&quot;:&quot;Pohl&quot;,&quot;given&quot;:&quot;Klaus.&quot;,&quot;parse-names&quot;:false,&quot;dropping-particle&quot;:&quot;&quot;,&quot;non-dropping-particle&quot;:&quot;&quot;}],&quot;ISBN&quot;:&quot;9783662692042&quot;,&quot;issued&quot;:{&quot;date-parts&quot;:[[2025]]},&quot;number-of-pages&quot;:&quot;814&quot;,&quot;abstract&quot;:&quot;Second edition.&quot;,&quot;publisher&quot;:&quot;Springer&quot;,&quot;container-title-short&quot;:&quot;&quot;},&quot;isTemporary&quot;:false,&quot;suppress-author&quot;:false,&quot;composite&quot;:false,&quot;author-only&quot;:false}]},{&quot;citationID&quot;:&quot;MENDELEY_CITATION_6efc6ef9-53cb-4aca-8ada-eceee85f6186&quot;,&quot;properties&quot;:{&quot;noteIndex&quot;:0},&quot;isEdited&quot;:false,&quot;manualOverride&quot;:{&quot;isManuallyOverridden&quot;:false,&quot;citeprocText&quot;:&quot;[12]&quot;,&quot;manualOverrideText&quot;:&quot;&quot;},&quot;citationTag&quot;:&quot;MENDELEY_CITATION_v3_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&quot;,&quot;citationItems&quot;:[{&quot;id&quot;:&quot;969309ac-d1f5-3d30-89ff-aa1a87f9e65a&quot;,&quot;itemData&quot;:{&quot;type&quot;:&quot;book&quot;,&quot;id&quot;:&quot;969309ac-d1f5-3d30-89ff-aa1a87f9e65a&quot;,&quot;title&quot;:&quot;Requirements analysis and system design&quot;,&quot;author&quot;:[{&quot;family&quot;:&quot;Maciaszek&quot;,&quot;given&quot;:&quot;Leszek.&quot;,&quot;parse-names&quot;:false,&quot;dropping-particle&quot;:&quot;&quot;,&quot;non-dropping-particle&quot;:&quot;&quot;}],&quot;ISBN&quot;:&quot;0321440366&quot;,&quot;issued&quot;:{&quot;date-parts&quot;:[[2007]]},&quot;number-of-pages&quot;:&quot;612&quot;,&quot;abstract&quot;:&quot;3rd ed. Previous edition: 2005. \&quot;This book is the ideal companion for undergraduates studying: systems analysis; systems design; software engineering; software projects; and databases and object technology. It would also be an reference for any practitioners wishing to get up to speed with the latest developments in this area.\&quot;--Jacket. The software process -- Ch. 2. Requirements determination -- Ch. 3. Objects and object modeling -- Ch. 4. Requirements specification -- Ch. 5. Moving from analysis to design -- Ch. 6. System architecture and program design -- Ch. 7. User interface design -- Ch. 8. Persistence and database design -- Ch. 9. Testing and change management -- Ch. 10. Tutorial-style review and reinforcement.&quot;,&quot;publisher&quot;:&quot;Addison-Wesley&quot;,&quot;container-title-short&quot;:&quot;&quot;},&quot;isTemporary&quot;:false,&quot;suppress-author&quot;:false,&quot;composite&quot;:false,&quot;author-only&quot;:false}]},{&quot;citationID&quot;:&quot;MENDELEY_CITATION_c2568ec7-3aaa-4ced-ac6d-67091e151077&quot;,&quot;properties&quot;:{&quot;noteIndex&quot;:0},&quot;isEdited&quot;:false,&quot;manualOverride&quot;:{&quot;isManuallyOverridden&quot;:false,&quot;citeprocText&quot;:&quot;[12]&quot;,&quot;manualOverrideText&quot;:&quot;&quot;},&quot;citationTag&quot;:&quot;MENDELEY_CITATION_v3_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&quot;,&quot;citationItems&quot;:[{&quot;id&quot;:&quot;969309ac-d1f5-3d30-89ff-aa1a87f9e65a&quot;,&quot;itemData&quot;:{&quot;type&quot;:&quot;book&quot;,&quot;id&quot;:&quot;969309ac-d1f5-3d30-89ff-aa1a87f9e65a&quot;,&quot;title&quot;:&quot;Requirements analysis and system design&quot;,&quot;author&quot;:[{&quot;family&quot;:&quot;Maciaszek&quot;,&quot;given&quot;:&quot;Leszek.&quot;,&quot;parse-names&quot;:false,&quot;dropping-particle&quot;:&quot;&quot;,&quot;non-dropping-particle&quot;:&quot;&quot;}],&quot;ISBN&quot;:&quot;0321440366&quot;,&quot;issued&quot;:{&quot;date-parts&quot;:[[2007]]},&quot;number-of-pages&quot;:&quot;612&quot;,&quot;abstract&quot;:&quot;3rd ed. Previous edition: 2005. \&quot;This book is the ideal companion for undergraduates studying: systems analysis; systems design; software engineering; software projects; and databases and object technology. It would also be an reference for any practitioners wishing to get up to speed with the latest developments in this area.\&quot;--Jacket. The software process -- Ch. 2. Requirements determination -- Ch. 3. Objects and object modeling -- Ch. 4. Requirements specification -- Ch. 5. Moving from analysis to design -- Ch. 6. System architecture and program design -- Ch. 7. User interface design -- Ch. 8. Persistence and database design -- Ch. 9. Testing and change management -- Ch. 10. Tutorial-style review and reinforcement.&quot;,&quot;publisher&quot;:&quot;Addison-Wesley&quot;,&quot;container-title-short&quot;:&quot;&quot;},&quot;isTemporary&quot;:false,&quot;suppress-author&quot;:false,&quot;composite&quot;:false,&quot;author-only&quot;:false}]},{&quot;citationID&quot;:&quot;MENDELEY_CITATION_5db54668-57fe-411f-b9b9-81bc2887eac5&quot;,&quot;properties&quot;:{&quot;noteIndex&quot;:0},&quot;isEdited&quot;:false,&quot;manualOverride&quot;:{&quot;isManuallyOverridden&quot;:false,&quot;citeprocText&quot;:&quot;[2]&quot;,&quot;manualOverrideText&quot;:&quot;&quot;},&quot;citationTag&quot;:&quot;MENDELEY_CITATION_v3_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&quot;,&quot;citationItems&quot;:[{&quot;id&quot;:&quot;e2b26073-7ef3-371d-af2e-9af8bf0591d2&quot;,&quot;itemData&quot;:{&quot;type&quot;:&quot;book&quot;,&quot;id&quot;:&quot;e2b26073-7ef3-371d-af2e-9af8bf0591d2&quot;,&quot;title&quot;:&quot;Requirements engineering : fundamentals, principles, and techniques&quot;,&quot;author&quot;:[{&quot;family&quot;:&quot;Pohl&quot;,&quot;given&quot;:&quot;Klaus.&quot;,&quot;parse-names&quot;:false,&quot;dropping-particle&quot;:&quot;&quot;,&quot;non-dropping-particle&quot;:&quot;&quot;}],&quot;ISBN&quot;:&quot;9783662692042&quot;,&quot;issued&quot;:{&quot;date-parts&quot;:[[2025]]},&quot;number-of-pages&quot;:&quot;814&quot;,&quot;abstract&quot;:&quot;Second edition.&quot;,&quot;publisher&quot;:&quot;Springer&quot;,&quot;container-title-short&quot;:&quot;&quot;},&quot;isTemporary&quot;:false,&quot;suppress-author&quot;:false,&quot;composite&quot;:false,&quot;author-only&quot;:false}]},{&quot;citationID&quot;:&quot;MENDELEY_CITATION_5b8cc987-5ef7-4197-bf2d-32f3ed773c15&quot;,&quot;properties&quot;:{&quot;noteIndex&quot;:0},&quot;isEdited&quot;:false,&quot;manualOverride&quot;:{&quot;isManuallyOverridden&quot;:false,&quot;citeprocText&quot;:&quot;[13]&quot;,&quot;manualOverrideText&quot;:&quot;&quot;},&quot;citationTag&quot;:&quot;MENDELEY_CITATION_v3_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&quot;,&quot;citationItems&quot;:[{&quot;id&quot;:&quot;db86bc13-b5b2-3da2-8b6b-b765f7df50dd&quot;,&quot;itemData&quot;:{&quot;type&quot;:&quot;article-journal&quot;,&quot;id&quot;:&quot;db86bc13-b5b2-3da2-8b6b-b765f7df50dd&quot;,&quot;title&quot;:&quot;Statecharts: a visual formalism for complex systems&quot;,&quot;author&quot;:[{&quot;family&quot;:&quot;Harel&quot;,&quot;given&quot;:&quot;David&quot;,&quot;parse-names&quot;:false,&quot;dropping-particle&quot;:&quot;&quot;,&quot;non-dropping-particle&quot;:&quot;&quot;}],&quot;container-title&quot;:&quot;Science of Computer Programming&quot;,&quot;container-title-short&quot;:&quot;Sci. Comput. Program.&quot;,&quot;DOI&quot;:&quot;10.1016/0167-6423(87)90035-9&quot;,&quot;ISSN&quot;:&quot;01676423&quot;,&quot;issued&quot;:{&quot;date-parts&quot;:[[1987,6]]},&quot;page&quot;:&quot;231-274&quot;,&quot;issue&quot;:&quot;3&quot;,&quot;volume&quot;:&quot;8&quot;},&quot;isTemporary&quot;:false,&quot;suppress-author&quot;:false,&quot;composite&quot;:false,&quot;author-only&quot;:false}]},{&quot;citationID&quot;:&quot;MENDELEY_CITATION_bdd90be3-16dd-4414-aa17-3efdf6934353&quot;,&quot;properties&quot;:{&quot;noteIndex&quot;:0},&quot;isEdited&quot;:false,&quot;manualOverride&quot;:{&quot;isManuallyOverridden&quot;:false,&quot;citeprocText&quot;:&quot;[2]&quot;,&quot;manualOverrideText&quot;:&quot;&quot;},&quot;citationTag&quot;:&quot;MENDELEY_CITATION_v3_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&quot;,&quot;citationItems&quot;:[{&quot;id&quot;:&quot;e2b26073-7ef3-371d-af2e-9af8bf0591d2&quot;,&quot;itemData&quot;:{&quot;type&quot;:&quot;book&quot;,&quot;id&quot;:&quot;e2b26073-7ef3-371d-af2e-9af8bf0591d2&quot;,&quot;title&quot;:&quot;Requirements engineering : fundamentals, principles, and techniques&quot;,&quot;author&quot;:[{&quot;family&quot;:&quot;Pohl&quot;,&quot;given&quot;:&quot;Klaus.&quot;,&quot;parse-names&quot;:false,&quot;dropping-particle&quot;:&quot;&quot;,&quot;non-dropping-particle&quot;:&quot;&quot;}],&quot;ISBN&quot;:&quot;9783662692042&quot;,&quot;issued&quot;:{&quot;date-parts&quot;:[[2025]]},&quot;number-of-pages&quot;:&quot;814&quot;,&quot;abstract&quot;:&quot;Second edition.&quot;,&quot;publisher&quot;:&quot;Springer&quot;,&quot;container-title-short&quot;:&quot;&quot;},&quot;isTemporary&quot;:false,&quot;suppress-author&quot;:false,&quot;composite&quot;:false,&quot;author-only&quot;:false}]},{&quot;citationID&quot;:&quot;MENDELEY_CITATION_208525df-7542-417b-84d9-12734a2c4982&quot;,&quot;properties&quot;:{&quot;noteIndex&quot;:0},&quot;isEdited&quot;:false,&quot;manualOverride&quot;:{&quot;isManuallyOverridden&quot;:false,&quot;citeprocText&quot;:&quot;[13]&quot;,&quot;manualOverrideText&quot;:&quot;&quot;},&quot;citationTag&quot;:&quot;MENDELEY_CITATION_v3_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&quot;,&quot;citationItems&quot;:[{&quot;id&quot;:&quot;db86bc13-b5b2-3da2-8b6b-b765f7df50dd&quot;,&quot;itemData&quot;:{&quot;type&quot;:&quot;article-journal&quot;,&quot;id&quot;:&quot;db86bc13-b5b2-3da2-8b6b-b765f7df50dd&quot;,&quot;title&quot;:&quot;Statecharts: a visual formalism for complex systems&quot;,&quot;author&quot;:[{&quot;family&quot;:&quot;Harel&quot;,&quot;given&quot;:&quot;David&quot;,&quot;parse-names&quot;:false,&quot;dropping-particle&quot;:&quot;&quot;,&quot;non-dropping-particle&quot;:&quot;&quot;}],&quot;container-title&quot;:&quot;Science of Computer Programming&quot;,&quot;container-title-short&quot;:&quot;Sci. Comput. Program.&quot;,&quot;DOI&quot;:&quot;10.1016/0167-6423(87)90035-9&quot;,&quot;ISSN&quot;:&quot;01676423&quot;,&quot;issued&quot;:{&quot;date-parts&quot;:[[1987,6]]},&quot;page&quot;:&quot;231-274&quot;,&quot;issue&quot;:&quot;3&quot;,&quot;volume&quot;:&quot;8&quot;},&quot;isTemporary&quot;:false,&quot;suppress-author&quot;:false,&quot;composite&quot;:false,&quot;author-only&quot;:false}]},{&quot;citationID&quot;:&quot;MENDELEY_CITATION_ed6b1fdf-b40c-4062-b87f-dab6dd956f3f&quot;,&quot;properties&quot;:{&quot;noteIndex&quot;:0},&quot;isEdited&quot;:false,&quot;manualOverride&quot;:{&quot;isManuallyOverridden&quot;:false,&quot;citeprocText&quot;:&quot;[2]&quot;,&quot;manualOverrideText&quot;:&quot;&quot;},&quot;citationTag&quot;:&quot;MENDELEY_CITATION_v3_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&quot;,&quot;citationItems&quot;:[{&quot;id&quot;:&quot;e2b26073-7ef3-371d-af2e-9af8bf0591d2&quot;,&quot;itemData&quot;:{&quot;type&quot;:&quot;book&quot;,&quot;id&quot;:&quot;e2b26073-7ef3-371d-af2e-9af8bf0591d2&quot;,&quot;title&quot;:&quot;Requirements engineering : fundamentals, principles, and techniques&quot;,&quot;author&quot;:[{&quot;family&quot;:&quot;Pohl&quot;,&quot;given&quot;:&quot;Klaus.&quot;,&quot;parse-names&quot;:false,&quot;dropping-particle&quot;:&quot;&quot;,&quot;non-dropping-particle&quot;:&quot;&quot;}],&quot;ISBN&quot;:&quot;9783662692042&quot;,&quot;issued&quot;:{&quot;date-parts&quot;:[[2025]]},&quot;number-of-pages&quot;:&quot;814&quot;,&quot;abstract&quot;:&quot;Second edition.&quot;,&quot;publisher&quot;:&quot;Springer&quot;,&quot;container-title-short&quot;:&quot;&quot;},&quot;isTemporary&quot;:false,&quot;suppress-author&quot;:false,&quot;composite&quot;:false,&quot;author-only&quot;:false}]},{&quot;citationID&quot;:&quot;MENDELEY_CITATION_644e8673-699d-4f9e-8d4c-b0a570936ded&quot;,&quot;properties&quot;:{&quot;noteIndex&quot;:0},&quot;isEdited&quot;:false,&quot;manualOverride&quot;:{&quot;isManuallyOverridden&quot;:false,&quot;citeprocText&quot;:&quot;[7]&quot;,&quot;manualOverrideText&quot;:&quot;&quot;},&quot;citationTag&quot;:&quot;MENDELEY_CITATION_v3_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&quot;,&quot;citationItems&quot;:[{&quot;id&quot;:&quot;b4a67c60-32e8-3898-8c2f-38b6887aa554&quot;,&quot;itemData&quot;:{&quot;type&quot;:&quot;book&quot;,&quot;id&quot;:&quot;b4a67c60-32e8-3898-8c2f-38b6887aa554&quot;,&quot;title&quot;:&quot;SWEBOK Guide v4.0&quot;,&quot;author&quot;:[{&quot;family&quot;:&quot;Washizaki&quot;,&quot;given&quot;:&quot;H&quot;,&quot;parse-names&quot;:false,&quot;dropping-particle&quot;:&quot;&quot;,&quot;non-dropping-particle&quot;:&quot;&quot;}],&quot;editor&quot;:[{&quot;family&quot;:&quot;Washizaki&quot;,&quot;given&quot;:&quot;H&quot;,&quot;parse-names&quot;:false,&quot;dropping-particle&quot;:&quot;&quot;,&quot;non-dropping-particle&quot;:&quot;&quot;}],&quot;URL&quot;:&quot;https://www.computer.org/education/bodies-of-knowledge/software-engineering&quot;,&quot;issued&quot;:{&quot;date-parts&quot;:[[2024]]},&quot;publisher&quot;:&quot;IEEE Computer Society&quot;,&quot;container-title-short&quot;:&quot;&quot;},&quot;isTemporary&quot;:false,&quot;suppress-author&quot;:false,&quot;composite&quot;:false,&quot;author-only&quot;:false}]},{&quot;citationID&quot;:&quot;MENDELEY_CITATION_d31edc80-8222-4953-a1ae-57ac2beb536a&quot;,&quot;properties&quot;:{&quot;noteIndex&quot;:0},&quot;isEdited&quot;:false,&quot;manualOverride&quot;:{&quot;isManuallyOverridden&quot;:false,&quot;citeprocText&quot;:&quot;[1]&quot;,&quot;manualOverrideText&quot;:&quot;&quot;},&quot;citationTag&quot;:&quot;MENDELEY_CITATION_v3_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&quot;,&quot;citationItems&quot;:[{&quot;id&quot;:&quot;8b459ffd-756d-3939-9e41-8c07ad9f20f2&quot;,&quot;itemData&quot;:{&quot;type&quot;:&quot;article&quot;,&quot;id&quot;:&quot;8b459ffd-756d-3939-9e41-8c07ad9f20f2&quot;,&quot;title&quot;:&quot;29148:2018 — Requirements engineering&quot;,&quot;author&quot;:[{&quot;family&quot;:&quot;ISO/IEC/IEEE&quot;,&quot;given&quot;:&quot;&quot;,&quot;parse-names&quot;:false,&quot;dropping-particle&quot;:&quot;&quot;,&quot;non-dropping-particle&quot;:&quot;&quot;}],&quot;DOI&quot;:&quot;10.1109/IEEESTD.2018.8559686&quot;,&quot;ISBN&quot;:&quot;978-1-5044-5302-8&quot;,&quot;issued&quot;:{&quot;date-parts&quot;:[[2018]]},&quot;publisher-place&quot;:&quot;Piscataway, NJ, USA&quot;,&quot;publisher&quot;:&quot;IEEE&quot;,&quot;container-title-short&quot;:&quot;&quot;},&quot;isTemporary&quot;:false,&quot;suppress-author&quot;:false,&quot;composite&quot;:false,&quot;author-only&quot;:false}]},{&quot;citationID&quot;:&quot;MENDELEY_CITATION_250681a3-3a60-40f4-b127-6caf818bc97a&quot;,&quot;properties&quot;:{&quot;noteIndex&quot;:0},&quot;isEdited&quot;:false,&quot;manualOverride&quot;:{&quot;isManuallyOverridden&quot;:false,&quot;citeprocText&quot;:&quot;[1]&quot;,&quot;manualOverrideText&quot;:&quot;&quot;},&quot;citationTag&quot;:&quot;MENDELEY_CITATION_v3_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&quot;,&quot;citationItems&quot;:[{&quot;id&quot;:&quot;8b459ffd-756d-3939-9e41-8c07ad9f20f2&quot;,&quot;itemData&quot;:{&quot;type&quot;:&quot;article&quot;,&quot;id&quot;:&quot;8b459ffd-756d-3939-9e41-8c07ad9f20f2&quot;,&quot;title&quot;:&quot;29148:2018 — Requirements engineering&quot;,&quot;author&quot;:[{&quot;family&quot;:&quot;ISO/IEC/IEEE&quot;,&quot;given&quot;:&quot;&quot;,&quot;parse-names&quot;:false,&quot;dropping-particle&quot;:&quot;&quot;,&quot;non-dropping-particle&quot;:&quot;&quot;}],&quot;DOI&quot;:&quot;10.1109/IEEESTD.2018.8559686&quot;,&quot;ISBN&quot;:&quot;978-1-5044-5302-8&quot;,&quot;issued&quot;:{&quot;date-parts&quot;:[[2018]]},&quot;publisher-place&quot;:&quot;Piscataway, NJ, USA&quot;,&quot;publisher&quot;:&quot;IEEE&quot;,&quot;container-title-short&quot;:&quot;&quot;},&quot;isTemporary&quot;:false,&quot;suppress-author&quot;:false,&quot;composite&quot;:false,&quot;author-only&quot;:false}]},{&quot;citationID&quot;:&quot;MENDELEY_CITATION_17dca949-85ed-4402-b25f-3cf863a0a703&quot;,&quot;properties&quot;:{&quot;noteIndex&quot;:0},&quot;isEdited&quot;:false,&quot;manualOverride&quot;:{&quot;isManuallyOverridden&quot;:false,&quot;citeprocText&quot;:&quot;[6]&quot;,&quot;manualOverrideText&quot;:&quot;&quot;},&quot;citationTag&quot;:&quot;MENDELEY_CITATION_v3_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&quot;,&quot;citationItems&quot;:[{&quot;id&quot;:&quot;9003cc2d-8e1b-3761-9c43-cf67f96021b9&quot;,&quot;itemData&quot;:{&quot;type&quot;:&quot;article&quot;,&quot;id&quot;:&quot;9003cc2d-8e1b-3761-9c43-cf67f96021b9&quot;,&quot;title&quot;:&quot;25010:2023 Systems and software Quality Requirements and Evaluation (SQuaRE) — Product quality model&quot;,&quot;author&quot;:[{&quot;family&quot;:&quot;ISO/IEC&quot;,&quot;given&quot;:&quot;&quot;,&quot;parse-names&quot;:false,&quot;dropping-particle&quot;:&quot;&quot;,&quot;non-dropping-particle&quot;:&quot;&quot;}],&quot;issued&quot;:{&quot;date-parts&quot;:[[2023]]},&quot;issue&quot;:&quot;ISO/IEC 25010:2023&quot;,&quot;container-title-short&quot;:&quot;&quot;},&quot;isTemporary&quot;:false,&quot;suppress-author&quot;:false,&quot;composite&quot;:false,&quot;author-only&quot;:false}]},{&quot;citationID&quot;:&quot;MENDELEY_CITATION_5da23a8a-031e-4fe2-b3ab-6e6c5413d96c&quot;,&quot;properties&quot;:{&quot;noteIndex&quot;:0},&quot;isEdited&quot;:false,&quot;manualOverride&quot;:{&quot;isManuallyOverridden&quot;:false,&quot;citeprocText&quot;:&quot;[9]&quot;,&quot;manualOverrideText&quot;:&quot;&quot;},&quot;citationTag&quot;:&quot;MENDELEY_CITATION_v3_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&quot;,&quot;citationItems&quot;:[{&quot;id&quot;:&quot;66151fa6-eac6-3909-b0c3-058dd6c6e5c7&quot;,&quot;itemData&quot;:{&quot;type&quot;:&quot;article&quot;,&quot;id&quot;:&quot;66151fa6-eac6-3909-b0c3-058dd6c6e5c7&quot;,&quot;title&quot;:&quot;CPRE Foundation Level Syllabus v3.1&quot;,&quot;author&quot;:[{&quot;family&quot;:&quot;IREB&quot;,&quot;given&quot;:&quot;&quot;,&quot;parse-names&quot;:false,&quot;dropping-particle&quot;:&quot;&quot;,&quot;non-dropping-particle&quot;:&quot;&quot;}],&quot;URL&quot;:&quot;https://www.ireb.org&quot;,&quot;issued&quot;:{&quot;date-parts&quot;:[[2022]]},&quot;container-title-short&quot;:&quot;&quot;},&quot;isTemporary&quot;:false,&quot;suppress-author&quot;:false,&quot;composite&quot;:false,&quot;author-only&quot;:false}]},{&quot;citationID&quot;:&quot;MENDELEY_CITATION_964cdbf3-f385-479b-a32b-7221f85b390b&quot;,&quot;properties&quot;:{&quot;noteIndex&quot;:0},&quot;isEdited&quot;:false,&quot;manualOverride&quot;:{&quot;isManuallyOverridden&quot;:false,&quot;citeprocText&quot;:&quot;[9]&quot;,&quot;manualOverrideText&quot;:&quot;&quot;},&quot;citationTag&quot;:&quot;MENDELEY_CITATION_v3_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&quot;,&quot;citationItems&quot;:[{&quot;id&quot;:&quot;66151fa6-eac6-3909-b0c3-058dd6c6e5c7&quot;,&quot;itemData&quot;:{&quot;type&quot;:&quot;article&quot;,&quot;id&quot;:&quot;66151fa6-eac6-3909-b0c3-058dd6c6e5c7&quot;,&quot;title&quot;:&quot;CPRE Foundation Level Syllabus v3.1&quot;,&quot;author&quot;:[{&quot;family&quot;:&quot;IREB&quot;,&quot;given&quot;:&quot;&quot;,&quot;parse-names&quot;:false,&quot;dropping-particle&quot;:&quot;&quot;,&quot;non-dropping-particle&quot;:&quot;&quot;}],&quot;URL&quot;:&quot;https://www.ireb.org&quot;,&quot;issued&quot;:{&quot;date-parts&quot;:[[2022]]},&quot;container-title-short&quot;:&quot;&quot;},&quot;isTemporary&quot;:false,&quot;suppress-author&quot;:false,&quot;composite&quot;:false,&quot;author-only&quot;:false}]},{&quot;citationID&quot;:&quot;MENDELEY_CITATION_af7eb058-ebb9-492f-9541-07ba14a26a5e&quot;,&quot;properties&quot;:{&quot;noteIndex&quot;:0},&quot;isEdited&quot;:false,&quot;manualOverride&quot;:{&quot;isManuallyOverridden&quot;:false,&quot;citeprocText&quot;:&quot;[6]&quot;,&quot;manualOverrideText&quot;:&quot;&quot;},&quot;citationTag&quot;:&quot;MENDELEY_CITATION_v3_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&quot;,&quot;citationItems&quot;:[{&quot;id&quot;:&quot;9003cc2d-8e1b-3761-9c43-cf67f96021b9&quot;,&quot;itemData&quot;:{&quot;type&quot;:&quot;article&quot;,&quot;id&quot;:&quot;9003cc2d-8e1b-3761-9c43-cf67f96021b9&quot;,&quot;title&quot;:&quot;25010:2023 Systems and software Quality Requirements and Evaluation (SQuaRE) — Product quality model&quot;,&quot;author&quot;:[{&quot;family&quot;:&quot;ISO/IEC&quot;,&quot;given&quot;:&quot;&quot;,&quot;parse-names&quot;:false,&quot;dropping-particle&quot;:&quot;&quot;,&quot;non-dropping-particle&quot;:&quot;&quot;}],&quot;issued&quot;:{&quot;date-parts&quot;:[[2023]]},&quot;issue&quot;:&quot;ISO/IEC 25010:2023&quot;,&quot;container-title-short&quot;:&quot;&quot;},&quot;isTemporary&quot;:false,&quot;suppress-author&quot;:false,&quot;composite&quot;:false,&quot;author-only&quot;:false}]},{&quot;citationID&quot;:&quot;MENDELEY_CITATION_b4a97bcc-b593-415a-a75b-9e911f653053&quot;,&quot;properties&quot;:{&quot;noteIndex&quot;:0},&quot;isEdited&quot;:false,&quot;manualOverride&quot;:{&quot;isManuallyOverridden&quot;:false,&quot;citeprocText&quot;:&quot;[1]&quot;,&quot;manualOverrideText&quot;:&quot;&quot;},&quot;citationTag&quot;:&quot;MENDELEY_CITATION_v3_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&quot;,&quot;citationItems&quot;:[{&quot;id&quot;:&quot;8b459ffd-756d-3939-9e41-8c07ad9f20f2&quot;,&quot;itemData&quot;:{&quot;type&quot;:&quot;article&quot;,&quot;id&quot;:&quot;8b459ffd-756d-3939-9e41-8c07ad9f20f2&quot;,&quot;title&quot;:&quot;29148:2018 — Requirements engineering&quot;,&quot;author&quot;:[{&quot;family&quot;:&quot;ISO/IEC/IEEE&quot;,&quot;given&quot;:&quot;&quot;,&quot;parse-names&quot;:false,&quot;dropping-particle&quot;:&quot;&quot;,&quot;non-dropping-particle&quot;:&quot;&quot;}],&quot;DOI&quot;:&quot;10.1109/IEEESTD.2018.8559686&quot;,&quot;ISBN&quot;:&quot;978-1-5044-5302-8&quot;,&quot;issued&quot;:{&quot;date-parts&quot;:[[2018]]},&quot;publisher-place&quot;:&quot;Piscataway, NJ, USA&quot;,&quot;publisher&quot;:&quot;IEEE&quot;,&quot;container-title-short&quot;:&quot;&quot;},&quot;isTemporary&quot;:false,&quot;suppress-author&quot;:false,&quot;composite&quot;:false,&quot;author-only&quot;:false}]},{&quot;citationID&quot;:&quot;MENDELEY_CITATION_0c4b0fa0-c84e-41e5-b6d5-397ca69593e6&quot;,&quot;properties&quot;:{&quot;noteIndex&quot;:0},&quot;isEdited&quot;:false,&quot;manualOverride&quot;:{&quot;isManuallyOverridden&quot;:false,&quot;citeprocText&quot;:&quot;[6]&quot;,&quot;manualOverrideText&quot;:&quot;&quot;},&quot;citationTag&quot;:&quot;MENDELEY_CITATION_v3_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&quot;,&quot;citationItems&quot;:[{&quot;id&quot;:&quot;9003cc2d-8e1b-3761-9c43-cf67f96021b9&quot;,&quot;itemData&quot;:{&quot;type&quot;:&quot;article&quot;,&quot;id&quot;:&quot;9003cc2d-8e1b-3761-9c43-cf67f96021b9&quot;,&quot;title&quot;:&quot;25010:2023 Systems and software Quality Requirements and Evaluation (SQuaRE) — Product quality model&quot;,&quot;author&quot;:[{&quot;family&quot;:&quot;ISO/IEC&quot;,&quot;given&quot;:&quot;&quot;,&quot;parse-names&quot;:false,&quot;dropping-particle&quot;:&quot;&quot;,&quot;non-dropping-particle&quot;:&quot;&quot;}],&quot;issued&quot;:{&quot;date-parts&quot;:[[2023]]},&quot;issue&quot;:&quot;ISO/IEC 25010:2023&quot;,&quot;container-title-short&quot;:&quot;&quot;},&quot;isTemporary&quot;:false,&quot;suppress-author&quot;:false,&quot;composite&quot;:false,&quot;author-only&quot;:false}]},{&quot;citationID&quot;:&quot;MENDELEY_CITATION_f3b2d815-8406-48c9-94c2-bc778c3df9a2&quot;,&quot;properties&quot;:{&quot;noteIndex&quot;:0},&quot;isEdited&quot;:false,&quot;manualOverride&quot;:{&quot;isManuallyOverridden&quot;:false,&quot;citeprocText&quot;:&quot;[9]&quot;,&quot;manualOverrideText&quot;:&quot;&quot;},&quot;citationTag&quot;:&quot;MENDELEY_CITATION_v3_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&quot;,&quot;citationItems&quot;:[{&quot;id&quot;:&quot;66151fa6-eac6-3909-b0c3-058dd6c6e5c7&quot;,&quot;itemData&quot;:{&quot;type&quot;:&quot;article&quot;,&quot;id&quot;:&quot;66151fa6-eac6-3909-b0c3-058dd6c6e5c7&quot;,&quot;title&quot;:&quot;CPRE Foundation Level Syllabus v3.1&quot;,&quot;author&quot;:[{&quot;family&quot;:&quot;IREB&quot;,&quot;given&quot;:&quot;&quot;,&quot;parse-names&quot;:false,&quot;dropping-particle&quot;:&quot;&quot;,&quot;non-dropping-particle&quot;:&quot;&quot;}],&quot;URL&quot;:&quot;https://www.ireb.org&quot;,&quot;issued&quot;:{&quot;date-parts&quot;:[[2022]]},&quot;container-title-short&quot;:&quot;&quot;},&quot;isTemporary&quot;:false,&quot;suppress-author&quot;:false,&quot;composite&quot;:false,&quot;author-only&quot;:false}]},{&quot;citationID&quot;:&quot;MENDELEY_CITATION_5c6a4b38-facc-472a-8cf1-33668bb9a349&quot;,&quot;properties&quot;:{&quot;noteIndex&quot;:0},&quot;isEdited&quot;:false,&quot;manualOverride&quot;:{&quot;isManuallyOverridden&quot;:false,&quot;citeprocText&quot;:&quot;[6]&quot;,&quot;manualOverrideText&quot;:&quot;&quot;},&quot;citationTag&quot;:&quot;MENDELEY_CITATION_v3_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&quot;,&quot;citationItems&quot;:[{&quot;id&quot;:&quot;9003cc2d-8e1b-3761-9c43-cf67f96021b9&quot;,&quot;itemData&quot;:{&quot;type&quot;:&quot;article&quot;,&quot;id&quot;:&quot;9003cc2d-8e1b-3761-9c43-cf67f96021b9&quot;,&quot;title&quot;:&quot;25010:2023 Systems and software Quality Requirements and Evaluation (SQuaRE) — Product quality model&quot;,&quot;author&quot;:[{&quot;family&quot;:&quot;ISO/IEC&quot;,&quot;given&quot;:&quot;&quot;,&quot;parse-names&quot;:false,&quot;dropping-particle&quot;:&quot;&quot;,&quot;non-dropping-particle&quot;:&quot;&quot;}],&quot;issued&quot;:{&quot;date-parts&quot;:[[2023]]},&quot;issue&quot;:&quot;ISO/IEC 25010:2023&quot;,&quot;container-title-short&quot;:&quot;&quot;},&quot;isTemporary&quot;:false,&quot;suppress-author&quot;:false,&quot;composite&quot;:false,&quot;author-only&quot;:false}]},{&quot;citationID&quot;:&quot;MENDELEY_CITATION_275202db-54da-4b6b-930d-bb2e03a406a9&quot;,&quot;properties&quot;:{&quot;noteIndex&quot;:0},&quot;isEdited&quot;:false,&quot;manualOverride&quot;:{&quot;isManuallyOverridden&quot;:false,&quot;citeprocText&quot;:&quot;[11]&quot;,&quot;manualOverrideText&quot;:&quot;&quot;},&quot;citationTag&quot;:&quot;MENDELEY_CITATION_v3_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&quot;,&quot;citationItems&quot;:[{&quot;id&quot;:&quot;53bf9615-9f05-3888-82f8-ecd3ad0cd90a&quot;,&quot;itemData&quot;:{&quot;type&quot;:&quot;book&quot;,&quot;id&quot;:&quot;53bf9615-9f05-3888-82f8-ecd3ad0cd90a&quot;,&quot;title&quot;:&quot;Requirements Engineering&quot;,&quot;author&quot;:[{&quot;family&quot;:&quot;Hull&quot;,&quot;given&quot;:&quot;Elizabeth&quot;,&quot;parse-names&quot;:false,&quot;dropping-particle&quot;:&quot;&quot;,&quot;non-dropping-particle&quot;:&quot;&quot;},{&quot;family&quot;:&quot;Jackson&quot;,&quot;given&quot;:&quot;Ken&quot;,&quot;parse-names&quot;:false,&quot;dropping-particle&quot;:&quot;&quot;,&quot;non-dropping-particle&quot;:&quot;&quot;},{&quot;family&quot;:&quot;Dick&quot;,&quot;given&quot;:&quot;Jeremy&quot;,&quot;parse-names&quot;:false,&quot;dropping-particle&quot;:&quot;&quot;,&quot;non-dropping-particle&quot;:&quot;&quot;}],&quot;DOI&quot;:&quot;10.1007/978-1-84996-405-0&quot;,&quot;ISBN&quot;:&quot;978-1-84996-404-3&quot;,&quot;issued&quot;:{&quot;date-parts&quot;:[[2011]]},&quot;publisher-place&quot;:&quot;London&quot;,&quot;publisher&quot;:&quot;Springer London&quot;,&quot;container-title-short&quot;:&quot;&quot;},&quot;isTemporary&quot;:false,&quot;suppress-author&quot;:false,&quot;composite&quot;:false,&quot;author-only&quot;:false}]},{&quot;citationID&quot;:&quot;MENDELEY_CITATION_ea197790-0cb8-4b6d-98dd-f5b3d7671533&quot;,&quot;properties&quot;:{&quot;noteIndex&quot;:0},&quot;isEdited&quot;:false,&quot;manualOverride&quot;:{&quot;isManuallyOverridden&quot;:false,&quot;citeprocText&quot;:&quot;[1]&quot;,&quot;manualOverrideText&quot;:&quot;&quot;},&quot;citationTag&quot;:&quot;MENDELEY_CITATION_v3_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&quot;,&quot;citationItems&quot;:[{&quot;id&quot;:&quot;8b459ffd-756d-3939-9e41-8c07ad9f20f2&quot;,&quot;itemData&quot;:{&quot;type&quot;:&quot;article&quot;,&quot;id&quot;:&quot;8b459ffd-756d-3939-9e41-8c07ad9f20f2&quot;,&quot;title&quot;:&quot;29148:2018 — Requirements engineering&quot;,&quot;author&quot;:[{&quot;family&quot;:&quot;ISO/IEC/IEEE&quot;,&quot;given&quot;:&quot;&quot;,&quot;parse-names&quot;:false,&quot;dropping-particle&quot;:&quot;&quot;,&quot;non-dropping-particle&quot;:&quot;&quot;}],&quot;DOI&quot;:&quot;10.1109/IEEESTD.2018.8559686&quot;,&quot;ISBN&quot;:&quot;978-1-5044-5302-8&quot;,&quot;issued&quot;:{&quot;date-parts&quot;:[[2018]]},&quot;publisher-place&quot;:&quot;Piscataway, NJ, USA&quot;,&quot;publisher&quot;:&quot;IEEE&quot;,&quot;container-title-short&quot;:&quot;&quot;},&quot;isTemporary&quot;:false,&quot;suppress-author&quot;:false,&quot;composite&quot;:false,&quot;author-only&quot;:false}]},{&quot;citationID&quot;:&quot;MENDELEY_CITATION_0f5dad17-5e34-4e06-b18d-3c42bcf7b72f&quot;,&quot;properties&quot;:{&quot;noteIndex&quot;:0},&quot;isEdited&quot;:false,&quot;manualOverride&quot;:{&quot;isManuallyOverridden&quot;:false,&quot;citeprocText&quot;:&quot;[12]&quot;,&quot;manualOverrideText&quot;:&quot;&quot;},&quot;citationTag&quot;:&quot;MENDELEY_CITATION_v3_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&quot;,&quot;citationItems&quot;:[{&quot;id&quot;:&quot;969309ac-d1f5-3d30-89ff-aa1a87f9e65a&quot;,&quot;itemData&quot;:{&quot;type&quot;:&quot;book&quot;,&quot;id&quot;:&quot;969309ac-d1f5-3d30-89ff-aa1a87f9e65a&quot;,&quot;title&quot;:&quot;Requirements analysis and system design&quot;,&quot;author&quot;:[{&quot;family&quot;:&quot;Maciaszek&quot;,&quot;given&quot;:&quot;Leszek.&quot;,&quot;parse-names&quot;:false,&quot;dropping-particle&quot;:&quot;&quot;,&quot;non-dropping-particle&quot;:&quot;&quot;}],&quot;ISBN&quot;:&quot;0321440366&quot;,&quot;issued&quot;:{&quot;date-parts&quot;:[[2007]]},&quot;number-of-pages&quot;:&quot;612&quot;,&quot;abstract&quot;:&quot;3rd ed. Previous edition: 2005. \&quot;This book is the ideal companion for undergraduates studying: systems analysis; systems design; software engineering; software projects; and databases and object technology. It would also be an reference for any practitioners wishing to get up to speed with the latest developments in this area.\&quot;--Jacket. The software process -- Ch. 2. Requirements determination -- Ch. 3. Objects and object modeling -- Ch. 4. Requirements specification -- Ch. 5. Moving from analysis to design -- Ch. 6. System architecture and program design -- Ch. 7. User interface design -- Ch. 8. Persistence and database design -- Ch. 9. Testing and change management -- Ch. 10. Tutorial-style review and reinforcement.&quot;,&quot;publisher&quot;:&quot;Addison-Wesley&quot;,&quot;container-title-short&quot;:&quot;&quot;},&quot;isTemporary&quot;:false,&quot;suppress-author&quot;:false,&quot;composite&quot;:false,&quot;author-only&quot;:false}]},{&quot;citationID&quot;:&quot;MENDELEY_CITATION_abdece4b-11d1-4a16-9b9a-56e4879bb013&quot;,&quot;properties&quot;:{&quot;noteIndex&quot;:0},&quot;isEdited&quot;:false,&quot;manualOverride&quot;:{&quot;isManuallyOverridden&quot;:false,&quot;citeprocText&quot;:&quot;[12]&quot;,&quot;manualOverrideText&quot;:&quot;&quot;},&quot;citationTag&quot;:&quot;MENDELEY_CITATION_v3_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&quot;,&quot;citationItems&quot;:[{&quot;id&quot;:&quot;969309ac-d1f5-3d30-89ff-aa1a87f9e65a&quot;,&quot;itemData&quot;:{&quot;type&quot;:&quot;book&quot;,&quot;id&quot;:&quot;969309ac-d1f5-3d30-89ff-aa1a87f9e65a&quot;,&quot;title&quot;:&quot;Requirements analysis and system design&quot;,&quot;author&quot;:[{&quot;family&quot;:&quot;Maciaszek&quot;,&quot;given&quot;:&quot;Leszek.&quot;,&quot;parse-names&quot;:false,&quot;dropping-particle&quot;:&quot;&quot;,&quot;non-dropping-particle&quot;:&quot;&quot;}],&quot;ISBN&quot;:&quot;0321440366&quot;,&quot;issued&quot;:{&quot;date-parts&quot;:[[2007]]},&quot;number-of-pages&quot;:&quot;612&quot;,&quot;abstract&quot;:&quot;3rd ed. Previous edition: 2005. \&quot;This book is the ideal companion for undergraduates studying: systems analysis; systems design; software engineering; software projects; and databases and object technology. It would also be an reference for any practitioners wishing to get up to speed with the latest developments in this area.\&quot;--Jacket. The software process -- Ch. 2. Requirements determination -- Ch. 3. Objects and object modeling -- Ch. 4. Requirements specification -- Ch. 5. Moving from analysis to design -- Ch. 6. System architecture and program design -- Ch. 7. User interface design -- Ch. 8. Persistence and database design -- Ch. 9. Testing and change management -- Ch. 10. Tutorial-style review and reinforcement.&quot;,&quot;publisher&quot;:&quot;Addison-Wesley&quot;,&quot;container-title-short&quot;:&quot;&quot;},&quot;isTemporary&quot;:false,&quot;suppress-author&quot;:false,&quot;composite&quot;:false,&quot;author-only&quot;:false}]},{&quot;citationID&quot;:&quot;MENDELEY_CITATION_e6d93d5a-3291-458b-b4ef-baa9bfe0a007&quot;,&quot;properties&quot;:{&quot;noteIndex&quot;:0},&quot;isEdited&quot;:false,&quot;manualOverride&quot;:{&quot;isManuallyOverridden&quot;:false,&quot;citeprocText&quot;:&quot;[13]&quot;,&quot;manualOverrideText&quot;:&quot;&quot;},&quot;citationTag&quot;:&quot;MENDELEY_CITATION_v3_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&quot;,&quot;citationItems&quot;:[{&quot;id&quot;:&quot;db86bc13-b5b2-3da2-8b6b-b765f7df50dd&quot;,&quot;itemData&quot;:{&quot;type&quot;:&quot;article-journal&quot;,&quot;id&quot;:&quot;db86bc13-b5b2-3da2-8b6b-b765f7df50dd&quot;,&quot;title&quot;:&quot;Statecharts: a visual formalism for complex systems&quot;,&quot;author&quot;:[{&quot;family&quot;:&quot;Harel&quot;,&quot;given&quot;:&quot;David&quot;,&quot;parse-names&quot;:false,&quot;dropping-particle&quot;:&quot;&quot;,&quot;non-dropping-particle&quot;:&quot;&quot;}],&quot;container-title&quot;:&quot;Science of Computer Programming&quot;,&quot;container-title-short&quot;:&quot;Sci. Comput. Program.&quot;,&quot;DOI&quot;:&quot;10.1016/0167-6423(87)90035-9&quot;,&quot;ISSN&quot;:&quot;01676423&quot;,&quot;issued&quot;:{&quot;date-parts&quot;:[[1987,6]]},&quot;page&quot;:&quot;231-274&quot;,&quot;issue&quot;:&quot;3&quot;,&quot;volume&quot;:&quot;8&quot;},&quot;isTemporary&quot;:false,&quot;suppress-author&quot;:false,&quot;composite&quot;:false,&quot;author-only&quot;:false}]},{&quot;citationID&quot;:&quot;MENDELEY_CITATION_276e05fa-5c2f-4517-8641-6384f570a87e&quot;,&quot;properties&quot;:{&quot;noteIndex&quot;:0},&quot;isEdited&quot;:false,&quot;manualOverride&quot;:{&quot;isManuallyOverridden&quot;:false,&quot;citeprocText&quot;:&quot;[13]&quot;,&quot;manualOverrideText&quot;:&quot;&quot;},&quot;citationTag&quot;:&quot;MENDELEY_CITATION_v3_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&quot;,&quot;citationItems&quot;:[{&quot;id&quot;:&quot;db86bc13-b5b2-3da2-8b6b-b765f7df50dd&quot;,&quot;itemData&quot;:{&quot;type&quot;:&quot;article-journal&quot;,&quot;id&quot;:&quot;db86bc13-b5b2-3da2-8b6b-b765f7df50dd&quot;,&quot;title&quot;:&quot;Statecharts: a visual formalism for complex systems&quot;,&quot;author&quot;:[{&quot;family&quot;:&quot;Harel&quot;,&quot;given&quot;:&quot;David&quot;,&quot;parse-names&quot;:false,&quot;dropping-particle&quot;:&quot;&quot;,&quot;non-dropping-particle&quot;:&quot;&quot;}],&quot;container-title&quot;:&quot;Science of Computer Programming&quot;,&quot;container-title-short&quot;:&quot;Sci. Comput. Program.&quot;,&quot;DOI&quot;:&quot;10.1016/0167-6423(87)90035-9&quot;,&quot;ISSN&quot;:&quot;01676423&quot;,&quot;issued&quot;:{&quot;date-parts&quot;:[[1987,6]]},&quot;page&quot;:&quot;231-274&quot;,&quot;issue&quot;:&quot;3&quot;,&quot;volume&quot;:&quot;8&quot;},&quot;isTemporary&quot;:false,&quot;suppress-author&quot;:false,&quot;composite&quot;:false,&quot;author-only&quot;:false}]},{&quot;citationID&quot;:&quot;MENDELEY_CITATION_31e3516a-4fbb-4bb7-8498-d0e80d1d9069&quot;,&quot;properties&quot;:{&quot;noteIndex&quot;:0},&quot;isEdited&quot;:false,&quot;manualOverride&quot;:{&quot;isManuallyOverridden&quot;:false,&quot;citeprocText&quot;:&quot;[2]&quot;,&quot;manualOverrideText&quot;:&quot;&quot;},&quot;citationTag&quot;:&quot;MENDELEY_CITATION_v3_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&quot;,&quot;citationItems&quot;:[{&quot;id&quot;:&quot;e2b26073-7ef3-371d-af2e-9af8bf0591d2&quot;,&quot;itemData&quot;:{&quot;type&quot;:&quot;book&quot;,&quot;id&quot;:&quot;e2b26073-7ef3-371d-af2e-9af8bf0591d2&quot;,&quot;title&quot;:&quot;Requirements engineering : fundamentals, principles, and techniques&quot;,&quot;author&quot;:[{&quot;family&quot;:&quot;Pohl&quot;,&quot;given&quot;:&quot;Klaus.&quot;,&quot;parse-names&quot;:false,&quot;dropping-particle&quot;:&quot;&quot;,&quot;non-dropping-particle&quot;:&quot;&quot;}],&quot;ISBN&quot;:&quot;9783662692042&quot;,&quot;issued&quot;:{&quot;date-parts&quot;:[[2025]]},&quot;number-of-pages&quot;:&quot;814&quot;,&quot;abstract&quot;:&quot;Second edition.&quot;,&quot;publisher&quot;:&quot;Springer&quot;,&quot;container-title-short&quot;:&quot;&quot;},&quot;isTemporary&quot;:false,&quot;suppress-author&quot;:false,&quot;composite&quot;:false,&quot;author-only&quot;:false}]},{&quot;citationID&quot;:&quot;MENDELEY_CITATION_d870b60a-d020-466c-b5f3-151b0f23703a&quot;,&quot;properties&quot;:{&quot;noteIndex&quot;:0},&quot;isEdited&quot;:false,&quot;manualOverride&quot;:{&quot;isManuallyOverridden&quot;:false,&quot;citeprocText&quot;:&quot;[2]&quot;,&quot;manualOverrideText&quot;:&quot;&quot;},&quot;citationTag&quot;:&quot;MENDELEY_CITATION_v3_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&quot;,&quot;citationItems&quot;:[{&quot;id&quot;:&quot;e2b26073-7ef3-371d-af2e-9af8bf0591d2&quot;,&quot;itemData&quot;:{&quot;type&quot;:&quot;book&quot;,&quot;id&quot;:&quot;e2b26073-7ef3-371d-af2e-9af8bf0591d2&quot;,&quot;title&quot;:&quot;Requirements engineering : fundamentals, principles, and techniques&quot;,&quot;author&quot;:[{&quot;family&quot;:&quot;Pohl&quot;,&quot;given&quot;:&quot;Klaus.&quot;,&quot;parse-names&quot;:false,&quot;dropping-particle&quot;:&quot;&quot;,&quot;non-dropping-particle&quot;:&quot;&quot;}],&quot;ISBN&quot;:&quot;9783662692042&quot;,&quot;issued&quot;:{&quot;date-parts&quot;:[[2025]]},&quot;number-of-pages&quot;:&quot;814&quot;,&quot;abstract&quot;:&quot;Second edition.&quot;,&quot;publisher&quot;:&quot;Springer&quot;,&quot;container-title-short&quot;:&quot;&quot;},&quot;isTemporary&quot;:false,&quot;suppress-author&quot;:false,&quot;composite&quot;:false,&quot;author-only&quot;:false}]},{&quot;citationID&quot;:&quot;MENDELEY_CITATION_2d303c17-2d5d-4aaa-90d3-d52b2eb0a732&quot;,&quot;properties&quot;:{&quot;noteIndex&quot;:0},&quot;isEdited&quot;:false,&quot;manualOverride&quot;:{&quot;isManuallyOverridden&quot;:false,&quot;citeprocText&quot;:&quot;[1]&quot;,&quot;manualOverrideText&quot;:&quot;&quot;},&quot;citationTag&quot;:&quot;MENDELEY_CITATION_v3_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&quot;,&quot;citationItems&quot;:[{&quot;id&quot;:&quot;8b459ffd-756d-3939-9e41-8c07ad9f20f2&quot;,&quot;itemData&quot;:{&quot;type&quot;:&quot;article&quot;,&quot;id&quot;:&quot;8b459ffd-756d-3939-9e41-8c07ad9f20f2&quot;,&quot;title&quot;:&quot;29148:2018 — Requirements engineering&quot;,&quot;author&quot;:[{&quot;family&quot;:&quot;ISO/IEC/IEEE&quot;,&quot;given&quot;:&quot;&quot;,&quot;parse-names&quot;:false,&quot;dropping-particle&quot;:&quot;&quot;,&quot;non-dropping-particle&quot;:&quot;&quot;}],&quot;DOI&quot;:&quot;10.1109/IEEESTD.2018.8559686&quot;,&quot;ISBN&quot;:&quot;978-1-5044-5302-8&quot;,&quot;issued&quot;:{&quot;date-parts&quot;:[[2018]]},&quot;publisher-place&quot;:&quot;Piscataway, NJ, USA&quot;,&quot;publisher&quot;:&quot;IEEE&quot;,&quot;container-title-short&quot;:&quot;&quot;},&quot;isTemporary&quot;:false,&quot;suppress-author&quot;:false,&quot;composite&quot;:false,&quot;author-only&quot;:false}]},{&quot;citationID&quot;:&quot;MENDELEY_CITATION_f28f9ceb-f4fe-4a0d-83e0-7e129248ec7f&quot;,&quot;properties&quot;:{&quot;noteIndex&quot;:0},&quot;isEdited&quot;:false,&quot;manualOverride&quot;:{&quot;isManuallyOverridden&quot;:false,&quot;citeprocText&quot;:&quot;[13]&quot;,&quot;manualOverrideText&quot;:&quot;&quot;},&quot;citationTag&quot;:&quot;MENDELEY_CITATION_v3_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&quot;,&quot;citationItems&quot;:[{&quot;id&quot;:&quot;db86bc13-b5b2-3da2-8b6b-b765f7df50dd&quot;,&quot;itemData&quot;:{&quot;type&quot;:&quot;article-journal&quot;,&quot;id&quot;:&quot;db86bc13-b5b2-3da2-8b6b-b765f7df50dd&quot;,&quot;title&quot;:&quot;Statecharts: a visual formalism for complex systems&quot;,&quot;author&quot;:[{&quot;family&quot;:&quot;Harel&quot;,&quot;given&quot;:&quot;David&quot;,&quot;parse-names&quot;:false,&quot;dropping-particle&quot;:&quot;&quot;,&quot;non-dropping-particle&quot;:&quot;&quot;}],&quot;container-title&quot;:&quot;Science of Computer Programming&quot;,&quot;container-title-short&quot;:&quot;Sci. Comput. Program.&quot;,&quot;DOI&quot;:&quot;10.1016/0167-6423(87)90035-9&quot;,&quot;ISSN&quot;:&quot;01676423&quot;,&quot;issued&quot;:{&quot;date-parts&quot;:[[1987,6]]},&quot;page&quot;:&quot;231-274&quot;,&quot;issue&quot;:&quot;3&quot;,&quot;volume&quot;:&quot;8&quot;},&quot;isTemporary&quot;:false,&quot;suppress-author&quot;:false,&quot;composite&quot;:false,&quot;author-only&quot;:false}]},{&quot;citationID&quot;:&quot;MENDELEY_CITATION_260c2393-61d8-45d2-bd64-1c11a604406d&quot;,&quot;properties&quot;:{&quot;noteIndex&quot;:0},&quot;isEdited&quot;:false,&quot;manualOverride&quot;:{&quot;isManuallyOverridden&quot;:false,&quot;citeprocText&quot;:&quot;[7]&quot;,&quot;manualOverrideText&quot;:&quot;&quot;},&quot;citationTag&quot;:&quot;MENDELEY_CITATION_v3_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&quot;,&quot;citationItems&quot;:[{&quot;id&quot;:&quot;b4a67c60-32e8-3898-8c2f-38b6887aa554&quot;,&quot;itemData&quot;:{&quot;type&quot;:&quot;book&quot;,&quot;id&quot;:&quot;b4a67c60-32e8-3898-8c2f-38b6887aa554&quot;,&quot;title&quot;:&quot;SWEBOK Guide v4.0&quot;,&quot;author&quot;:[{&quot;family&quot;:&quot;Washizaki&quot;,&quot;given&quot;:&quot;H&quot;,&quot;parse-names&quot;:false,&quot;dropping-particle&quot;:&quot;&quot;,&quot;non-dropping-particle&quot;:&quot;&quot;}],&quot;editor&quot;:[{&quot;family&quot;:&quot;Washizaki&quot;,&quot;given&quot;:&quot;H&quot;,&quot;parse-names&quot;:false,&quot;dropping-particle&quot;:&quot;&quot;,&quot;non-dropping-particle&quot;:&quot;&quot;}],&quot;URL&quot;:&quot;https://www.computer.org/education/bodies-of-knowledge/software-engineering&quot;,&quot;issued&quot;:{&quot;date-parts&quot;:[[2024]]},&quot;publisher&quot;:&quot;IEEE Computer Society&quot;,&quot;container-title-short&quot;:&quot;&quot;},&quot;isTemporary&quot;:false,&quot;suppress-author&quot;:false,&quot;composite&quot;:false,&quot;author-only&quot;:false}]},{&quot;citationID&quot;:&quot;MENDELEY_CITATION_b324f80c-b66e-4185-ba58-f884a610d39c&quot;,&quot;properties&quot;:{&quot;noteIndex&quot;:0},&quot;isEdited&quot;:false,&quot;manualOverride&quot;:{&quot;isManuallyOverridden&quot;:false,&quot;citeprocText&quot;:&quot;[6]&quot;,&quot;manualOverrideText&quot;:&quot;&quot;},&quot;citationTag&quot;:&quot;MENDELEY_CITATION_v3_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&quot;,&quot;citationItems&quot;:[{&quot;id&quot;:&quot;9003cc2d-8e1b-3761-9c43-cf67f96021b9&quot;,&quot;itemData&quot;:{&quot;type&quot;:&quot;article&quot;,&quot;id&quot;:&quot;9003cc2d-8e1b-3761-9c43-cf67f96021b9&quot;,&quot;title&quot;:&quot;25010:2023 Systems and software Quality Requirements and Evaluation (SQuaRE) — Product quality model&quot;,&quot;author&quot;:[{&quot;family&quot;:&quot;ISO/IEC&quot;,&quot;given&quot;:&quot;&quot;,&quot;parse-names&quot;:false,&quot;dropping-particle&quot;:&quot;&quot;,&quot;non-dropping-particle&quot;:&quot;&quot;}],&quot;issued&quot;:{&quot;date-parts&quot;:[[2023]]},&quot;issue&quot;:&quot;ISO/IEC 25010:2023&quot;,&quot;container-title-short&quot;:&quot;&quot;},&quot;isTemporary&quot;:false,&quot;suppress-author&quot;:false,&quot;composite&quot;:false,&quot;author-only&quot;:false}]},{&quot;citationID&quot;:&quot;MENDELEY_CITATION_5b2b5e24-97c3-4a54-b0fe-1eaf620d3e38&quot;,&quot;properties&quot;:{&quot;noteIndex&quot;:0},&quot;isEdited&quot;:false,&quot;manualOverride&quot;:{&quot;isManuallyOverridden&quot;:false,&quot;citeprocText&quot;:&quot;[9]&quot;,&quot;manualOverrideText&quot;:&quot;&quot;},&quot;citationTag&quot;:&quot;MENDELEY_CITATION_v3_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&quot;,&quot;citationItems&quot;:[{&quot;id&quot;:&quot;66151fa6-eac6-3909-b0c3-058dd6c6e5c7&quot;,&quot;itemData&quot;:{&quot;type&quot;:&quot;article&quot;,&quot;id&quot;:&quot;66151fa6-eac6-3909-b0c3-058dd6c6e5c7&quot;,&quot;title&quot;:&quot;CPRE Foundation Level Syllabus v3.1&quot;,&quot;author&quot;:[{&quot;family&quot;:&quot;IREB&quot;,&quot;given&quot;:&quot;&quot;,&quot;parse-names&quot;:false,&quot;dropping-particle&quot;:&quot;&quot;,&quot;non-dropping-particle&quot;:&quot;&quot;}],&quot;URL&quot;:&quot;https://www.ireb.org&quot;,&quot;issued&quot;:{&quot;date-parts&quot;:[[2022]]},&quot;container-title-short&quot;:&quot;&quot;},&quot;isTemporary&quot;:false,&quot;suppress-author&quot;:false,&quot;composite&quot;:false,&quot;author-only&quot;:false}]},{&quot;citationID&quot;:&quot;MENDELEY_CITATION_1a580333-17ef-4077-83fa-73911b8e11af&quot;,&quot;properties&quot;:{&quot;noteIndex&quot;:0},&quot;isEdited&quot;:false,&quot;manualOverride&quot;:{&quot;isManuallyOverridden&quot;:false,&quot;citeprocText&quot;:&quot;[6]&quot;,&quot;manualOverrideText&quot;:&quot;&quot;},&quot;citationTag&quot;:&quot;MENDELEY_CITATION_v3_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&quot;,&quot;citationItems&quot;:[{&quot;id&quot;:&quot;9003cc2d-8e1b-3761-9c43-cf67f96021b9&quot;,&quot;itemData&quot;:{&quot;type&quot;:&quot;article&quot;,&quot;id&quot;:&quot;9003cc2d-8e1b-3761-9c43-cf67f96021b9&quot;,&quot;title&quot;:&quot;25010:2023 Systems and software Quality Requirements and Evaluation (SQuaRE) — Product quality model&quot;,&quot;author&quot;:[{&quot;family&quot;:&quot;ISO/IEC&quot;,&quot;given&quot;:&quot;&quot;,&quot;parse-names&quot;:false,&quot;dropping-particle&quot;:&quot;&quot;,&quot;non-dropping-particle&quot;:&quot;&quot;}],&quot;issued&quot;:{&quot;date-parts&quot;:[[2023]]},&quot;issue&quot;:&quot;ISO/IEC 25010:2023&quot;,&quot;container-title-short&quot;:&quot;&quot;},&quot;isTemporary&quot;:false,&quot;suppress-author&quot;:false,&quot;composite&quot;:false,&quot;author-only&quot;:false}]},{&quot;citationID&quot;:&quot;MENDELEY_CITATION_ef237b22-674b-4880-b4f1-247018e29a9f&quot;,&quot;properties&quot;:{&quot;noteIndex&quot;:0},&quot;isEdited&quot;:false,&quot;manualOverride&quot;:{&quot;isManuallyOverridden&quot;:false,&quot;citeprocText&quot;:&quot;[1]&quot;,&quot;manualOverrideText&quot;:&quot;&quot;},&quot;citationTag&quot;:&quot;MENDELEY_CITATION_v3_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&quot;,&quot;citationItems&quot;:[{&quot;id&quot;:&quot;8b459ffd-756d-3939-9e41-8c07ad9f20f2&quot;,&quot;itemData&quot;:{&quot;type&quot;:&quot;article&quot;,&quot;id&quot;:&quot;8b459ffd-756d-3939-9e41-8c07ad9f20f2&quot;,&quot;title&quot;:&quot;29148:2018 — Requirements engineering&quot;,&quot;author&quot;:[{&quot;family&quot;:&quot;ISO/IEC/IEEE&quot;,&quot;given&quot;:&quot;&quot;,&quot;parse-names&quot;:false,&quot;dropping-particle&quot;:&quot;&quot;,&quot;non-dropping-particle&quot;:&quot;&quot;}],&quot;DOI&quot;:&quot;10.1109/IEEESTD.2018.8559686&quot;,&quot;ISBN&quot;:&quot;978-1-5044-5302-8&quot;,&quot;issued&quot;:{&quot;date-parts&quot;:[[2018]]},&quot;publisher-place&quot;:&quot;Piscataway, NJ, USA&quot;,&quot;publisher&quot;:&quot;IEEE&quot;,&quot;container-title-short&quot;:&quot;&quot;},&quot;isTemporary&quot;:false,&quot;suppress-author&quot;:false,&quot;composite&quot;:false,&quot;author-only&quot;:false}]},{&quot;citationID&quot;:&quot;MENDELEY_CITATION_c7de4e5e-b700-40fb-bb3f-dbe97a7f1a5d&quot;,&quot;properties&quot;:{&quot;noteIndex&quot;:0},&quot;isEdited&quot;:false,&quot;manualOverride&quot;:{&quot;isManuallyOverridden&quot;:false,&quot;citeprocText&quot;:&quot;[6]&quot;,&quot;manualOverrideText&quot;:&quot;&quot;},&quot;citationTag&quot;:&quot;MENDELEY_CITATION_v3_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&quot;,&quot;citationItems&quot;:[{&quot;id&quot;:&quot;9003cc2d-8e1b-3761-9c43-cf67f96021b9&quot;,&quot;itemData&quot;:{&quot;type&quot;:&quot;article&quot;,&quot;id&quot;:&quot;9003cc2d-8e1b-3761-9c43-cf67f96021b9&quot;,&quot;title&quot;:&quot;25010:2023 Systems and software Quality Requirements and Evaluation (SQuaRE) — Product quality model&quot;,&quot;author&quot;:[{&quot;family&quot;:&quot;ISO/IEC&quot;,&quot;given&quot;:&quot;&quot;,&quot;parse-names&quot;:false,&quot;dropping-particle&quot;:&quot;&quot;,&quot;non-dropping-particle&quot;:&quot;&quot;}],&quot;issued&quot;:{&quot;date-parts&quot;:[[2023]]},&quot;issue&quot;:&quot;ISO/IEC 25010:2023&quot;,&quot;container-title-short&quot;:&quot;&quot;},&quot;isTemporary&quot;:false,&quot;suppress-author&quot;:false,&quot;composite&quot;:false,&quot;author-only&quot;:false}]},{&quot;citationID&quot;:&quot;MENDELEY_CITATION_404b60ad-688e-422d-a7de-a93171e0338d&quot;,&quot;properties&quot;:{&quot;noteIndex&quot;:0},&quot;isEdited&quot;:false,&quot;manualOverride&quot;:{&quot;isManuallyOverridden&quot;:false,&quot;citeprocText&quot;:&quot;[9]&quot;,&quot;manualOverrideText&quot;:&quot;&quot;},&quot;citationTag&quot;:&quot;MENDELEY_CITATION_v3_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&quot;,&quot;citationItems&quot;:[{&quot;id&quot;:&quot;66151fa6-eac6-3909-b0c3-058dd6c6e5c7&quot;,&quot;itemData&quot;:{&quot;type&quot;:&quot;article&quot;,&quot;id&quot;:&quot;66151fa6-eac6-3909-b0c3-058dd6c6e5c7&quot;,&quot;title&quot;:&quot;CPRE Foundation Level Syllabus v3.1&quot;,&quot;author&quot;:[{&quot;family&quot;:&quot;IREB&quot;,&quot;given&quot;:&quot;&quot;,&quot;parse-names&quot;:false,&quot;dropping-particle&quot;:&quot;&quot;,&quot;non-dropping-particle&quot;:&quot;&quot;}],&quot;URL&quot;:&quot;https://www.ireb.org&quot;,&quot;issued&quot;:{&quot;date-parts&quot;:[[2022]]},&quot;container-title-short&quot;:&quot;&quot;},&quot;isTemporary&quot;:false,&quot;suppress-author&quot;:false,&quot;composite&quot;:false,&quot;author-only&quot;:false}]},{&quot;citationID&quot;:&quot;MENDELEY_CITATION_a1b31c94-c58f-4694-9071-e6665d2d0963&quot;,&quot;properties&quot;:{&quot;noteIndex&quot;:0},&quot;isEdited&quot;:false,&quot;manualOverride&quot;:{&quot;isManuallyOverridden&quot;:false,&quot;citeprocText&quot;:&quot;[6]&quot;,&quot;manualOverrideText&quot;:&quot;&quot;},&quot;citationTag&quot;:&quot;MENDELEY_CITATION_v3_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&quot;,&quot;citationItems&quot;:[{&quot;id&quot;:&quot;9003cc2d-8e1b-3761-9c43-cf67f96021b9&quot;,&quot;itemData&quot;:{&quot;type&quot;:&quot;article&quot;,&quot;id&quot;:&quot;9003cc2d-8e1b-3761-9c43-cf67f96021b9&quot;,&quot;title&quot;:&quot;25010:2023 Systems and software Quality Requirements and Evaluation (SQuaRE) — Product quality model&quot;,&quot;author&quot;:[{&quot;family&quot;:&quot;ISO/IEC&quot;,&quot;given&quot;:&quot;&quot;,&quot;parse-names&quot;:false,&quot;dropping-particle&quot;:&quot;&quot;,&quot;non-dropping-particle&quot;:&quot;&quot;}],&quot;issued&quot;:{&quot;date-parts&quot;:[[2023]]},&quot;issue&quot;:&quot;ISO/IEC 25010:2023&quot;,&quot;container-title-short&quot;:&quot;&quot;},&quot;isTemporary&quot;:false,&quot;suppress-author&quot;:false,&quot;composite&quot;:false,&quot;author-only&quot;:false}]},{&quot;citationID&quot;:&quot;MENDELEY_CITATION_ee44cd7b-0f27-4905-b755-50dd2d8f3a9b&quot;,&quot;properties&quot;:{&quot;noteIndex&quot;:0},&quot;isEdited&quot;:false,&quot;manualOverride&quot;:{&quot;isManuallyOverridden&quot;:false,&quot;citeprocText&quot;:&quot;[11]&quot;,&quot;manualOverrideText&quot;:&quot;&quot;},&quot;citationTag&quot;:&quot;MENDELEY_CITATION_v3_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&quot;,&quot;citationItems&quot;:[{&quot;id&quot;:&quot;53bf9615-9f05-3888-82f8-ecd3ad0cd90a&quot;,&quot;itemData&quot;:{&quot;type&quot;:&quot;book&quot;,&quot;id&quot;:&quot;53bf9615-9f05-3888-82f8-ecd3ad0cd90a&quot;,&quot;title&quot;:&quot;Requirements Engineering&quot;,&quot;author&quot;:[{&quot;family&quot;:&quot;Hull&quot;,&quot;given&quot;:&quot;Elizabeth&quot;,&quot;parse-names&quot;:false,&quot;dropping-particle&quot;:&quot;&quot;,&quot;non-dropping-particle&quot;:&quot;&quot;},{&quot;family&quot;:&quot;Jackson&quot;,&quot;given&quot;:&quot;Ken&quot;,&quot;parse-names&quot;:false,&quot;dropping-particle&quot;:&quot;&quot;,&quot;non-dropping-particle&quot;:&quot;&quot;},{&quot;family&quot;:&quot;Dick&quot;,&quot;given&quot;:&quot;Jeremy&quot;,&quot;parse-names&quot;:false,&quot;dropping-particle&quot;:&quot;&quot;,&quot;non-dropping-particle&quot;:&quot;&quot;}],&quot;DOI&quot;:&quot;10.1007/978-1-84996-405-0&quot;,&quot;ISBN&quot;:&quot;978-1-84996-404-3&quot;,&quot;issued&quot;:{&quot;date-parts&quot;:[[2011]]},&quot;publisher-place&quot;:&quot;London&quot;,&quot;publisher&quot;:&quot;Springer London&quot;,&quot;container-title-short&quot;:&quot;&quot;},&quot;isTemporary&quot;:false,&quot;suppress-author&quot;:false,&quot;composite&quot;:false,&quot;author-only&quot;:false}]},{&quot;citationID&quot;:&quot;MENDELEY_CITATION_c3f3f90d-abba-4418-84f1-8cc105abedb2&quot;,&quot;properties&quot;:{&quot;noteIndex&quot;:0},&quot;isEdited&quot;:false,&quot;manualOverride&quot;:{&quot;isManuallyOverridden&quot;:false,&quot;citeprocText&quot;:&quot;[1]&quot;,&quot;manualOverrideText&quot;:&quot;&quot;},&quot;citationTag&quot;:&quot;MENDELEY_CITATION_v3_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&quot;,&quot;citationItems&quot;:[{&quot;id&quot;:&quot;8b459ffd-756d-3939-9e41-8c07ad9f20f2&quot;,&quot;itemData&quot;:{&quot;type&quot;:&quot;article&quot;,&quot;id&quot;:&quot;8b459ffd-756d-3939-9e41-8c07ad9f20f2&quot;,&quot;title&quot;:&quot;29148:2018 — Requirements engineering&quot;,&quot;author&quot;:[{&quot;family&quot;:&quot;ISO/IEC/IEEE&quot;,&quot;given&quot;:&quot;&quot;,&quot;parse-names&quot;:false,&quot;dropping-particle&quot;:&quot;&quot;,&quot;non-dropping-particle&quot;:&quot;&quot;}],&quot;DOI&quot;:&quot;10.1109/IEEESTD.2018.8559686&quot;,&quot;ISBN&quot;:&quot;978-1-5044-5302-8&quot;,&quot;issued&quot;:{&quot;date-parts&quot;:[[2018]]},&quot;publisher-place&quot;:&quot;Piscataway, NJ, USA&quot;,&quot;publisher&quot;:&quot;IEEE&quot;,&quot;container-title-short&quot;:&quot;&quot;},&quot;isTemporary&quot;:false,&quot;suppress-author&quot;:false,&quot;composite&quot;:false,&quot;author-only&quot;:false}]}]"/>
     <we:property name="MENDELEY_CITATIONS_STYLE" value="{&quot;id&quot;:&quot;https://www.zotero.org/styles/ieee&quot;,&quot;title&quot;:&quot;IEEE Reference Guide version 11.29.2023&quot;,&quot;format&quot;:&quot;numeric&quot;,&quot;defaultLocale&quot;:null,&quot;isLocaleCodeValid&quot;:true}"/>
   </we:properties>
   <we:bindings/>

</xml_diff>